<commit_message>
docs(marketing-ops): note /attribution UI (Attribution + Sequences tabs)
Co-Authored-By: Claude Opus 4.8 (1M context) <noreply@anthropic.com>
</commit_message>
<xml_diff>
--- a/PRODUCTS/01-marketing-ops-hub.docx
+++ b/PRODUCTS/01-marketing-ops-hub.docx
@@ -12114,6 +12114,143 @@
                 <w:rFonts w:cs="Consolas"/>
               </w:rPr>
               <w:t>supabase/functions/gsheet-webhook</w:t>
+            </w:r>
+          </w:p>
+        </w:tc>
+      </w:tr>
+      <w:tr>
+        <w:tc>
+          <w:tcPr>
+            <w:tcW w:type="dxa" w:w="4320"/>
+          </w:tcPr>
+          <w:p>
+            <w:pPr>
+              <w:bidi w:val="1"/>
+              <w:jc w:val="right"/>
+            </w:pPr>
+            <w:r>
+              <w:rPr>
+                <w:rFonts w:ascii="Arial" w:hAnsi="Arial"/>
+                <w:b/>
+                <w:sz w:val="20"/>
+                <w:rtl w:val="1"/>
+                <w:rFonts w:cs="Arial"/>
+              </w:rPr>
+              <w:t>UI שיווק (`/attribution`) 🆕</w:t>
+            </w:r>
+            <w:r>
+              <w:rPr>
+                <w:rFonts w:ascii="Arial" w:hAnsi="Arial"/>
+                <w:b w:val="0"/>
+                <w:sz w:val="20"/>
+                <w:rtl w:val="1"/>
+                <w:rFonts w:cs="Arial"/>
+              </w:rPr>
+              <w:t xml:space="preserve"> — 2 טאבים: </w:t>
+            </w:r>
+            <w:r>
+              <w:rPr>
+                <w:rFonts w:ascii="Arial" w:hAnsi="Arial"/>
+                <w:b/>
+                <w:sz w:val="20"/>
+                <w:rtl w:val="1"/>
+                <w:rFonts w:cs="Arial"/>
+              </w:rPr>
+              <w:t>Attribution</w:t>
+            </w:r>
+            <w:r>
+              <w:rPr>
+                <w:rFonts w:ascii="Arial" w:hAnsi="Arial"/>
+                <w:b w:val="0"/>
+                <w:sz w:val="20"/>
+                <w:rtl w:val="1"/>
+                <w:rFonts w:cs="Arial"/>
+              </w:rPr>
+              <w:t xml:space="preserve"> (ROI per-קמפיין: ביקורים→המרות→הכנסה, ערים מובילות) + </w:t>
+            </w:r>
+            <w:r>
+              <w:rPr>
+                <w:rFonts w:ascii="Arial" w:hAnsi="Arial"/>
+                <w:b/>
+                <w:sz w:val="20"/>
+                <w:rtl w:val="1"/>
+                <w:rFonts w:cs="Arial"/>
+              </w:rPr>
+              <w:t>רצפי-מייל</w:t>
+            </w:r>
+            <w:r>
+              <w:rPr>
+                <w:rFonts w:ascii="Arial" w:hAnsi="Arial"/>
+                <w:b w:val="0"/>
+                <w:sz w:val="20"/>
+                <w:rtl w:val="1"/>
+                <w:rFonts w:cs="Arial"/>
+              </w:rPr>
+              <w:t xml:space="preserve"> (יצירת רצף, רישום איש-קשר, השהיה/הפעלה, לוג מיילים נפתח/נלחץ). לינק "שיווק" ב-Nav</w:t>
+            </w:r>
+          </w:p>
+        </w:tc>
+        <w:tc>
+          <w:tcPr>
+            <w:tcW w:type="dxa" w:w="4320"/>
+          </w:tcPr>
+          <w:p>
+            <w:pPr>
+              <w:bidi w:val="1"/>
+              <w:jc w:val="right"/>
+            </w:pPr>
+            <w:r>
+              <w:rPr>
+                <w:rFonts w:ascii="Consolas" w:hAnsi="Consolas"/>
+                <w:b w:val="0"/>
+                <w:color w:val="B02A37"/>
+                <w:sz w:val="20"/>
+                <w:rtl w:val="1"/>
+                <w:rFonts w:cs="Consolas"/>
+              </w:rPr>
+              <w:t>app/[locale]/attribution</w:t>
+            </w:r>
+            <w:r>
+              <w:rPr>
+                <w:rFonts w:ascii="Arial" w:hAnsi="Arial"/>
+                <w:b w:val="0"/>
+                <w:sz w:val="20"/>
+                <w:rtl w:val="1"/>
+                <w:rFonts w:cs="Arial"/>
+              </w:rPr>
+              <w:t xml:space="preserve">, </w:t>
+            </w:r>
+            <w:r>
+              <w:rPr>
+                <w:rFonts w:ascii="Consolas" w:hAnsi="Consolas"/>
+                <w:b w:val="0"/>
+                <w:color w:val="B02A37"/>
+                <w:sz w:val="20"/>
+                <w:rtl w:val="1"/>
+                <w:rFonts w:cs="Consolas"/>
+              </w:rPr>
+              <w:t>components/MarketingManager.tsx</w:t>
+            </w:r>
+            <w:r>
+              <w:rPr>
+                <w:rFonts w:ascii="Arial" w:hAnsi="Arial"/>
+                <w:b w:val="0"/>
+                <w:sz w:val="20"/>
+                <w:rtl w:val="1"/>
+                <w:rFonts w:cs="Arial"/>
+              </w:rPr>
+              <w:t xml:space="preserve">, </w:t>
+            </w:r>
+            <w:r>
+              <w:rPr>
+                <w:rFonts w:ascii="Consolas" w:hAnsi="Consolas"/>
+                <w:b w:val="0"/>
+                <w:color w:val="B02A37"/>
+                <w:sz w:val="20"/>
+                <w:rtl w:val="1"/>
+                <w:rFonts w:cs="Consolas"/>
+              </w:rPr>
+              <w:t>app/actions-marketing.ts</w:t>
             </w:r>
           </w:p>
         </w:tc>

</xml_diff>

<commit_message>
docs: Marketing Skills Pack (64 skills, MIT) across products 1/3/6
Vendored to helix-ops/skills-marketing; mapped to Marketing Ops (1), SDR (3, §3.5),
Agent OS registry + cmo orchestrator (6, §1.5).

Co-Authored-By: Claude Opus 4.8 (1M context) <noreply@anthropic.com>
</commit_message>
<xml_diff>
--- a/PRODUCTS/01-marketing-ops-hub.docx
+++ b/PRODUCTS/01-marketing-ops-hub.docx
@@ -12251,6 +12251,176 @@
                 <w:rFonts w:cs="Consolas"/>
               </w:rPr>
               <w:t>app/actions-marketing.ts</w:t>
+            </w:r>
+          </w:p>
+        </w:tc>
+      </w:tr>
+      <w:tr>
+        <w:tc>
+          <w:tcPr>
+            <w:tcW w:type="dxa" w:w="4320"/>
+          </w:tcPr>
+          <w:p>
+            <w:pPr>
+              <w:bidi w:val="1"/>
+              <w:jc w:val="right"/>
+            </w:pPr>
+            <w:r>
+              <w:rPr>
+                <w:rFonts w:ascii="Arial" w:hAnsi="Arial"/>
+                <w:b/>
+                <w:sz w:val="20"/>
+                <w:rtl w:val="1"/>
+                <w:rFonts w:cs="Arial"/>
+              </w:rPr>
+              <w:t>📦 Marketing Skills Pack (64 skills) 🆕</w:t>
+            </w:r>
+            <w:r>
+              <w:rPr>
+                <w:rFonts w:ascii="Arial" w:hAnsi="Arial"/>
+                <w:b w:val="0"/>
+                <w:sz w:val="20"/>
+                <w:rtl w:val="1"/>
+                <w:rFonts w:cs="Arial"/>
+              </w:rPr>
+              <w:t xml:space="preserve"> — ספריית skills agent-native (פורמט </w:t>
+            </w:r>
+            <w:r>
+              <w:rPr>
+                <w:rFonts w:ascii="Consolas" w:hAnsi="Consolas"/>
+                <w:b w:val="0"/>
+                <w:color w:val="B02A37"/>
+                <w:sz w:val="20"/>
+                <w:rtl w:val="1"/>
+                <w:rFonts w:cs="Consolas"/>
+              </w:rPr>
+              <w:t>SKILL.md</w:t>
+            </w:r>
+            <w:r>
+              <w:rPr>
+                <w:rFonts w:ascii="Arial" w:hAnsi="Arial"/>
+                <w:b w:val="0"/>
+                <w:sz w:val="20"/>
+                <w:rtl w:val="1"/>
+                <w:rFonts w:cs="Arial"/>
+              </w:rPr>
+              <w:t xml:space="preserve"> של Claude, עם </w:t>
+            </w:r>
+            <w:r>
+              <w:rPr>
+                <w:rFonts w:ascii="Consolas" w:hAnsi="Consolas"/>
+                <w:b w:val="0"/>
+                <w:color w:val="B02A37"/>
+                <w:sz w:val="20"/>
+                <w:rtl w:val="1"/>
+                <w:rFonts w:cs="Consolas"/>
+              </w:rPr>
+              <w:t>reads/writes/depends-on/triggers/env_vars</w:t>
+            </w:r>
+            <w:r>
+              <w:rPr>
+                <w:rFonts w:ascii="Arial" w:hAnsi="Arial"/>
+                <w:b w:val="0"/>
+                <w:sz w:val="20"/>
+                <w:rtl w:val="1"/>
+                <w:rFonts w:cs="Arial"/>
+              </w:rPr>
+              <w:t xml:space="preserve">) ב-4 שכבות: Foundation·Strategy·Execution·Distribution. נטענת ע"י ה-registry של Agent OS (מוצר 6), פלט עובר </w:t>
+            </w:r>
+            <w:r>
+              <w:rPr>
+                <w:rFonts w:ascii="Consolas" w:hAnsi="Consolas"/>
+                <w:b w:val="0"/>
+                <w:color w:val="B02A37"/>
+                <w:sz w:val="20"/>
+                <w:rtl w:val="1"/>
+                <w:rFonts w:cs="Consolas"/>
+              </w:rPr>
+              <w:t>lib/hebrew.ts</w:t>
+            </w:r>
+            <w:r>
+              <w:rPr>
+                <w:rFonts w:ascii="Arial" w:hAnsi="Arial"/>
+                <w:b w:val="0"/>
+                <w:sz w:val="20"/>
+                <w:rtl w:val="1"/>
+                <w:rFonts w:cs="Arial"/>
+              </w:rPr>
+              <w:t xml:space="preserve"> לעברית + proofread</w:t>
+            </w:r>
+          </w:p>
+        </w:tc>
+        <w:tc>
+          <w:tcPr>
+            <w:tcW w:type="dxa" w:w="4320"/>
+          </w:tcPr>
+          <w:p>
+            <w:pPr>
+              <w:bidi w:val="1"/>
+              <w:jc w:val="right"/>
+            </w:pPr>
+            <w:r>
+              <w:rPr>
+                <w:rFonts w:ascii="Consolas" w:hAnsi="Consolas"/>
+                <w:b w:val="0"/>
+                <w:color w:val="B02A37"/>
+                <w:sz w:val="20"/>
+                <w:rtl w:val="1"/>
+                <w:rFonts w:cs="Consolas"/>
+              </w:rPr>
+              <w:t>skills-marketing/</w:t>
+            </w:r>
+            <w:r>
+              <w:rPr>
+                <w:rFonts w:ascii="Arial" w:hAnsi="Arial"/>
+                <w:b w:val="0"/>
+                <w:sz w:val="20"/>
+                <w:rtl w:val="1"/>
+                <w:rFonts w:cs="Arial"/>
+              </w:rPr>
+              <w:t xml:space="preserve"> (64 חבילות + </w:t>
+            </w:r>
+            <w:r>
+              <w:rPr>
+                <w:rFonts w:ascii="Consolas" w:hAnsi="Consolas"/>
+                <w:b w:val="0"/>
+                <w:color w:val="B02A37"/>
+                <w:sz w:val="20"/>
+                <w:rtl w:val="1"/>
+                <w:rFonts w:cs="Consolas"/>
+              </w:rPr>
+              <w:t>skills-manifest.json</w:t>
+            </w:r>
+            <w:r>
+              <w:rPr>
+                <w:rFonts w:ascii="Arial" w:hAnsi="Arial"/>
+                <w:b w:val="0"/>
+                <w:sz w:val="20"/>
+                <w:rtl w:val="1"/>
+                <w:rFonts w:cs="Arial"/>
+              </w:rPr>
+              <w:t xml:space="preserve"> + </w:t>
+            </w:r>
+            <w:r>
+              <w:rPr>
+                <w:rFonts w:ascii="Consolas" w:hAnsi="Consolas"/>
+                <w:b w:val="0"/>
+                <w:color w:val="B02A37"/>
+                <w:sz w:val="20"/>
+                <w:rtl w:val="1"/>
+                <w:rFonts w:cs="Consolas"/>
+              </w:rPr>
+              <w:t>NOTICE.md</w:t>
+            </w:r>
+            <w:r>
+              <w:rPr>
+                <w:rFonts w:ascii="Arial" w:hAnsi="Arial"/>
+                <w:b w:val="0"/>
+                <w:sz w:val="20"/>
+                <w:rtl w:val="1"/>
+                <w:rFonts w:cs="Arial"/>
+              </w:rPr>
+              <w:t>)</w:t>
             </w:r>
           </w:p>
         </w:tc>

</xml_diff>

<commit_message>
docs(marketing-ops): A/B variants (6×6) + campaign builder + bot access
Co-Authored-By: Claude Opus 4.8 (1M context) <noreply@anthropic.com>
</commit_message>
<xml_diff>
--- a/PRODUCTS/01-marketing-ops-hub.docx
+++ b/PRODUCTS/01-marketing-ops-hub.docx
@@ -34,7 +34,29 @@
           <w:rtl w:val="1"/>
           <w:rFonts w:cs="Arial"/>
         </w:rPr>
-        <w:t>כלי ניהול תוכן שיווקי מקצה-לקצה למחלקות שיווק. Hebrew-first. נמכר white-label דרך סוכנות.</w:t>
+        <w:t xml:space="preserve">כלי ניהול תוכן שיווקי מקצה-לקצה למחלקות שיווק. Hebrew-first. </w:t>
+      </w:r>
+      <w:r>
+        <w:rPr>
+          <w:rFonts w:ascii="Arial" w:hAnsi="Arial"/>
+          <w:b/>
+          <w:i/>
+          <w:sz w:val="22"/>
+          <w:rtl w:val="1"/>
+          <w:rFonts w:cs="Arial"/>
+        </w:rPr>
+        <w:t>מודל דואלי:</w:t>
+      </w:r>
+      <w:r>
+        <w:rPr>
+          <w:rFonts w:ascii="Arial" w:hAnsi="Arial"/>
+          <w:b w:val="0"/>
+          <w:i/>
+          <w:sz w:val="22"/>
+          <w:rtl w:val="1"/>
+          <w:rFonts w:cs="Arial"/>
+        </w:rPr>
+        <w:t xml:space="preserve"> מכירה ישירה תחת מותג HELIX (ערוץ ראשי) + הפצה white-label דרך שותף/סוכנות (ערוץ אופציונלי).</w:t>
       </w:r>
     </w:p>
     <w:p>
@@ -12273,6 +12295,440 @@
                 <w:rtl w:val="1"/>
                 <w:rFonts w:cs="Arial"/>
               </w:rPr>
+              <w:t>🅰️🅱️ A/B Variants (עד 36 per-ערוץ) 🆕</w:t>
+            </w:r>
+            <w:r>
+              <w:rPr>
+                <w:rFonts w:ascii="Arial" w:hAnsi="Arial"/>
+                <w:b w:val="0"/>
+                <w:sz w:val="20"/>
+                <w:rtl w:val="1"/>
+                <w:rFonts w:cs="Arial"/>
+              </w:rPr>
+              <w:t xml:space="preserve"> — לכל פרסום </w:t>
+            </w:r>
+            <w:r>
+              <w:rPr>
+                <w:rFonts w:ascii="Arial" w:hAnsi="Arial"/>
+                <w:b/>
+                <w:sz w:val="20"/>
+                <w:rtl w:val="1"/>
+                <w:rFonts w:cs="Arial"/>
+              </w:rPr>
+              <w:t>6 סגנונות-שכנוע × 6 וריאציות</w:t>
+            </w:r>
+            <w:r>
+              <w:rPr>
+                <w:rFonts w:ascii="Arial" w:hAnsi="Arial"/>
+                <w:b w:val="0"/>
+                <w:sz w:val="20"/>
+                <w:rtl w:val="1"/>
+                <w:rFonts w:cs="Arial"/>
+              </w:rPr>
+              <w:t xml:space="preserve"> (תועלת/כאב/הוכחה/דחיפות/סיפור/סקרנות), כל וריאציה humanize + ציון-אנושיות. יעיל: JSON-batched (2 קריאות per-סגנון). בחירת-מנצח + שדות ביצוע ל-A/B</w:t>
+            </w:r>
+          </w:p>
+        </w:tc>
+        <w:tc>
+          <w:tcPr>
+            <w:tcW w:type="dxa" w:w="4320"/>
+          </w:tcPr>
+          <w:p>
+            <w:pPr>
+              <w:bidi w:val="1"/>
+              <w:jc w:val="right"/>
+            </w:pPr>
+            <w:r>
+              <w:rPr>
+                <w:rFonts w:ascii="Consolas" w:hAnsi="Consolas"/>
+                <w:b w:val="0"/>
+                <w:color w:val="B02A37"/>
+                <w:sz w:val="20"/>
+                <w:rtl w:val="1"/>
+                <w:rFonts w:cs="Consolas"/>
+              </w:rPr>
+              <w:t>lib/content-agent.ts</w:t>
+            </w:r>
+            <w:r>
+              <w:rPr>
+                <w:rFonts w:ascii="Arial" w:hAnsi="Arial"/>
+                <w:b w:val="0"/>
+                <w:sz w:val="20"/>
+                <w:rtl w:val="1"/>
+                <w:rFonts w:cs="Arial"/>
+              </w:rPr>
+              <w:t xml:space="preserve"> (</w:t>
+            </w:r>
+            <w:r>
+              <w:rPr>
+                <w:rFonts w:ascii="Consolas" w:hAnsi="Consolas"/>
+                <w:b w:val="0"/>
+                <w:color w:val="B02A37"/>
+                <w:sz w:val="20"/>
+                <w:rtl w:val="1"/>
+                <w:rFonts w:cs="Consolas"/>
+              </w:rPr>
+              <w:t>generateChannelVariants</w:t>
+            </w:r>
+            <w:r>
+              <w:rPr>
+                <w:rFonts w:ascii="Arial" w:hAnsi="Arial"/>
+                <w:b w:val="0"/>
+                <w:sz w:val="20"/>
+                <w:rtl w:val="1"/>
+                <w:rFonts w:cs="Arial"/>
+              </w:rPr>
+              <w:t xml:space="preserve">), </w:t>
+            </w:r>
+            <w:r>
+              <w:rPr>
+                <w:rFonts w:ascii="Consolas" w:hAnsi="Consolas"/>
+                <w:b w:val="0"/>
+                <w:color w:val="B02A37"/>
+                <w:sz w:val="20"/>
+                <w:rtl w:val="1"/>
+                <w:rFonts w:cs="Consolas"/>
+              </w:rPr>
+              <w:t>content_variants</w:t>
+            </w:r>
+            <w:r>
+              <w:rPr>
+                <w:rFonts w:ascii="Arial" w:hAnsi="Arial"/>
+                <w:b w:val="0"/>
+                <w:sz w:val="20"/>
+                <w:rtl w:val="1"/>
+                <w:rFonts w:cs="Arial"/>
+              </w:rPr>
+              <w:t xml:space="preserve"> (migration-v15)</w:t>
+            </w:r>
+          </w:p>
+        </w:tc>
+      </w:tr>
+      <w:tr>
+        <w:tc>
+          <w:tcPr>
+            <w:tcW w:type="dxa" w:w="4320"/>
+          </w:tcPr>
+          <w:p>
+            <w:pPr>
+              <w:bidi w:val="1"/>
+              <w:jc w:val="right"/>
+            </w:pPr>
+            <w:r>
+              <w:rPr>
+                <w:rFonts w:ascii="Arial" w:hAnsi="Arial"/>
+                <w:b/>
+                <w:sz w:val="20"/>
+                <w:rtl w:val="1"/>
+                <w:rFonts w:cs="Arial"/>
+              </w:rPr>
+              <w:t>📣 Campaign Builder חוצה-ערוצים 🆕</w:t>
+            </w:r>
+            <w:r>
+              <w:rPr>
+                <w:rFonts w:ascii="Arial" w:hAnsi="Arial"/>
+                <w:b w:val="0"/>
+                <w:sz w:val="20"/>
+                <w:rtl w:val="1"/>
+                <w:rFonts w:cs="Arial"/>
+              </w:rPr>
+              <w:t xml:space="preserve"> — בריף אחד + </w:t>
+            </w:r>
+            <w:r>
+              <w:rPr>
+                <w:rFonts w:ascii="Arial" w:hAnsi="Arial"/>
+                <w:b/>
+                <w:sz w:val="20"/>
+                <w:rtl w:val="1"/>
+                <w:rFonts w:cs="Arial"/>
+              </w:rPr>
+              <w:t>אפיון-לקוח + תקציב</w:t>
+            </w:r>
+            <w:r>
+              <w:rPr>
+                <w:rFonts w:ascii="Arial" w:hAnsi="Arial"/>
+                <w:b w:val="0"/>
+                <w:sz w:val="20"/>
+                <w:rtl w:val="1"/>
+                <w:rFonts w:cs="Arial"/>
+              </w:rPr>
+              <w:t xml:space="preserve"> → קמפיין מלא: פייסבוק/אינסטגרם/לינקדאין (וריאציות A/B) · Google Ads (RSA: 15 כותרות+4 תיאורים+keywords) · SEO (תוכנית מילים+outline). תקציב מחולק per-ערוץ</w:t>
+            </w:r>
+          </w:p>
+        </w:tc>
+        <w:tc>
+          <w:tcPr>
+            <w:tcW w:type="dxa" w:w="4320"/>
+          </w:tcPr>
+          <w:p>
+            <w:pPr>
+              <w:bidi w:val="1"/>
+              <w:jc w:val="right"/>
+            </w:pPr>
+            <w:r>
+              <w:rPr>
+                <w:rFonts w:ascii="Consolas" w:hAnsi="Consolas"/>
+                <w:b w:val="0"/>
+                <w:color w:val="B02A37"/>
+                <w:sz w:val="20"/>
+                <w:rtl w:val="1"/>
+                <w:rFonts w:cs="Consolas"/>
+              </w:rPr>
+              <w:t>lib/campaign-agent.ts</w:t>
+            </w:r>
+            <w:r>
+              <w:rPr>
+                <w:rFonts w:ascii="Arial" w:hAnsi="Arial"/>
+                <w:b w:val="0"/>
+                <w:sz w:val="20"/>
+                <w:rtl w:val="1"/>
+                <w:rFonts w:cs="Arial"/>
+              </w:rPr>
+              <w:t xml:space="preserve">, </w:t>
+            </w:r>
+            <w:r>
+              <w:rPr>
+                <w:rFonts w:ascii="Consolas" w:hAnsi="Consolas"/>
+                <w:b w:val="0"/>
+                <w:color w:val="B02A37"/>
+                <w:sz w:val="20"/>
+                <w:rtl w:val="1"/>
+                <w:rFonts w:cs="Consolas"/>
+              </w:rPr>
+              <w:t>lib/campaign-run.ts</w:t>
+            </w:r>
+            <w:r>
+              <w:rPr>
+                <w:rFonts w:ascii="Arial" w:hAnsi="Arial"/>
+                <w:b w:val="0"/>
+                <w:sz w:val="20"/>
+                <w:rtl w:val="1"/>
+                <w:rFonts w:cs="Arial"/>
+              </w:rPr>
+              <w:t xml:space="preserve">, </w:t>
+            </w:r>
+            <w:r>
+              <w:rPr>
+                <w:rFonts w:ascii="Consolas" w:hAnsi="Consolas"/>
+                <w:b w:val="0"/>
+                <w:color w:val="B02A37"/>
+                <w:sz w:val="20"/>
+                <w:rtl w:val="1"/>
+                <w:rFonts w:cs="Consolas"/>
+              </w:rPr>
+              <w:t>app/actions-campaigns.ts</w:t>
+            </w:r>
+            <w:r>
+              <w:rPr>
+                <w:rFonts w:ascii="Arial" w:hAnsi="Arial"/>
+                <w:b w:val="0"/>
+                <w:sz w:val="20"/>
+                <w:rtl w:val="1"/>
+                <w:rFonts w:cs="Arial"/>
+              </w:rPr>
+              <w:t xml:space="preserve">, </w:t>
+            </w:r>
+            <w:r>
+              <w:rPr>
+                <w:rFonts w:ascii="Consolas" w:hAnsi="Consolas"/>
+                <w:b w:val="0"/>
+                <w:color w:val="B02A37"/>
+                <w:sz w:val="20"/>
+                <w:rtl w:val="1"/>
+                <w:rFonts w:cs="Consolas"/>
+              </w:rPr>
+              <w:t>app/[locale]/campaigns</w:t>
+            </w:r>
+            <w:r>
+              <w:rPr>
+                <w:rFonts w:ascii="Arial" w:hAnsi="Arial"/>
+                <w:b w:val="0"/>
+                <w:sz w:val="20"/>
+                <w:rtl w:val="1"/>
+                <w:rFonts w:cs="Arial"/>
+              </w:rPr>
+              <w:t xml:space="preserve"> (+detail), migration-v15</w:t>
+            </w:r>
+          </w:p>
+        </w:tc>
+      </w:tr>
+      <w:tr>
+        <w:tc>
+          <w:tcPr>
+            <w:tcW w:type="dxa" w:w="4320"/>
+          </w:tcPr>
+          <w:p>
+            <w:pPr>
+              <w:bidi w:val="1"/>
+              <w:jc w:val="right"/>
+            </w:pPr>
+            <w:r>
+              <w:rPr>
+                <w:rFonts w:ascii="Arial" w:hAnsi="Arial"/>
+                <w:b/>
+                <w:sz w:val="20"/>
+                <w:rtl w:val="1"/>
+                <w:rFonts w:cs="Arial"/>
+              </w:rPr>
+              <w:t>🤖 נגישות בוט מלאה 🆕</w:t>
+            </w:r>
+            <w:r>
+              <w:rPr>
+                <w:rFonts w:ascii="Arial" w:hAnsi="Arial"/>
+                <w:b w:val="0"/>
+                <w:sz w:val="20"/>
+                <w:rtl w:val="1"/>
+                <w:rFonts w:cs="Arial"/>
+              </w:rPr>
+              <w:t xml:space="preserve"> — webhook מאוחד </w:t>
+            </w:r>
+            <w:r>
+              <w:rPr>
+                <w:rFonts w:ascii="Consolas" w:hAnsi="Consolas"/>
+                <w:b w:val="0"/>
+                <w:color w:val="B02A37"/>
+                <w:sz w:val="20"/>
+                <w:rtl w:val="1"/>
+                <w:rFonts w:cs="Consolas"/>
+              </w:rPr>
+              <w:t>/api/bot</w:t>
+            </w:r>
+            <w:r>
+              <w:rPr>
+                <w:rFonts w:ascii="Arial" w:hAnsi="Arial"/>
+                <w:b w:val="0"/>
+                <w:sz w:val="20"/>
+                <w:rtl w:val="1"/>
+                <w:rFonts w:cs="Arial"/>
+              </w:rPr>
+              <w:t xml:space="preserve"> + router: הודעה טבעית בטלגרם/וואטסאפ/מייל → חילוץ persona+תקציב+ערוצים → </w:t>
+            </w:r>
+            <w:r>
+              <w:rPr>
+                <w:rFonts w:ascii="Arial" w:hAnsi="Arial"/>
+                <w:b/>
+                <w:sz w:val="20"/>
+                <w:rtl w:val="1"/>
+                <w:rFonts w:cs="Arial"/>
+              </w:rPr>
+              <w:t>אותו</w:t>
+            </w:r>
+            <w:r>
+              <w:rPr>
+                <w:rFonts w:ascii="Arial" w:hAnsi="Arial"/>
+                <w:b w:val="0"/>
+                <w:sz w:val="20"/>
+                <w:rtl w:val="1"/>
+                <w:rFonts w:cs="Arial"/>
+              </w:rPr>
+              <w:t xml:space="preserve"> builder של ה-UI. </w:t>
+            </w:r>
+            <w:r>
+              <w:rPr>
+                <w:rFonts w:ascii="Consolas" w:hAnsi="Consolas"/>
+                <w:b w:val="0"/>
+                <w:color w:val="B02A37"/>
+                <w:sz w:val="20"/>
+                <w:rtl w:val="1"/>
+                <w:rFonts w:cs="Consolas"/>
+              </w:rPr>
+              <w:t>bot_links</w:t>
+            </w:r>
+            <w:r>
+              <w:rPr>
+                <w:rFonts w:ascii="Arial" w:hAnsi="Arial"/>
+                <w:b w:val="0"/>
+                <w:sz w:val="20"/>
+                <w:rtl w:val="1"/>
+                <w:rFonts w:cs="Arial"/>
+              </w:rPr>
+              <w:t xml:space="preserve"> ממפה צ׳אט→workspace. כל פונקציה נגישה מהבוט</w:t>
+            </w:r>
+          </w:p>
+        </w:tc>
+        <w:tc>
+          <w:tcPr>
+            <w:tcW w:type="dxa" w:w="4320"/>
+          </w:tcPr>
+          <w:p>
+            <w:pPr>
+              <w:bidi w:val="1"/>
+              <w:jc w:val="right"/>
+            </w:pPr>
+            <w:r>
+              <w:rPr>
+                <w:rFonts w:ascii="Consolas" w:hAnsi="Consolas"/>
+                <w:b w:val="0"/>
+                <w:color w:val="B02A37"/>
+                <w:sz w:val="20"/>
+                <w:rtl w:val="1"/>
+                <w:rFonts w:cs="Consolas"/>
+              </w:rPr>
+              <w:t>app/api/bot</w:t>
+            </w:r>
+            <w:r>
+              <w:rPr>
+                <w:rFonts w:ascii="Arial" w:hAnsi="Arial"/>
+                <w:b w:val="0"/>
+                <w:sz w:val="20"/>
+                <w:rtl w:val="1"/>
+                <w:rFonts w:cs="Arial"/>
+              </w:rPr>
+              <w:t xml:space="preserve">, </w:t>
+            </w:r>
+            <w:r>
+              <w:rPr>
+                <w:rFonts w:ascii="Consolas" w:hAnsi="Consolas"/>
+                <w:b w:val="0"/>
+                <w:color w:val="B02A37"/>
+                <w:sz w:val="20"/>
+                <w:rtl w:val="1"/>
+                <w:rFonts w:cs="Consolas"/>
+              </w:rPr>
+              <w:t>lib/bot/{router,campaign-bot}.ts</w:t>
+            </w:r>
+            <w:r>
+              <w:rPr>
+                <w:rFonts w:ascii="Arial" w:hAnsi="Arial"/>
+                <w:b w:val="0"/>
+                <w:sz w:val="20"/>
+                <w:rtl w:val="1"/>
+                <w:rFonts w:cs="Arial"/>
+              </w:rPr>
+              <w:t xml:space="preserve">, </w:t>
+            </w:r>
+            <w:r>
+              <w:rPr>
+                <w:rFonts w:ascii="Consolas" w:hAnsi="Consolas"/>
+                <w:b w:val="0"/>
+                <w:color w:val="B02A37"/>
+                <w:sz w:val="20"/>
+                <w:rtl w:val="1"/>
+                <w:rFonts w:cs="Consolas"/>
+              </w:rPr>
+              <w:t>bot_links</w:t>
+            </w:r>
+          </w:p>
+        </w:tc>
+      </w:tr>
+      <w:tr>
+        <w:tc>
+          <w:tcPr>
+            <w:tcW w:type="dxa" w:w="4320"/>
+          </w:tcPr>
+          <w:p>
+            <w:pPr>
+              <w:bidi w:val="1"/>
+              <w:jc w:val="right"/>
+            </w:pPr>
+            <w:r>
+              <w:rPr>
+                <w:rFonts w:ascii="Arial" w:hAnsi="Arial"/>
+                <w:b/>
+                <w:sz w:val="20"/>
+                <w:rtl w:val="1"/>
+                <w:rFonts w:cs="Arial"/>
+              </w:rPr>
               <w:t>📦 Marketing Skills Pack (64 skills) 🆕</w:t>
             </w:r>
             <w:r>
@@ -13878,17 +14334,57 @@
           <w:rtl w:val="1"/>
           <w:rFonts w:cs="Arial"/>
         </w:rPr>
-        <w:t>GTM:</w:t>
-      </w:r>
-      <w:r>
-        <w:rPr>
-          <w:rFonts w:ascii="Arial" w:hAnsi="Arial"/>
-          <w:b w:val="0"/>
-          <w:sz w:val="22"/>
-          <w:rtl w:val="1"/>
-          <w:rFonts w:cs="Arial"/>
-        </w:rPr>
-        <w:t xml:space="preserve"> wholesale לסוכנות (~₪150) → הסוכנות מוכרת כ-line-item בריטיינר (~₪400) או ככלי-שימור.</w:t>
+        <w:t>GTM דואלי:</w:t>
+      </w:r>
+      <w:r>
+        <w:rPr>
+          <w:rFonts w:ascii="Arial" w:hAnsi="Arial"/>
+          <w:b w:val="0"/>
+          <w:sz w:val="22"/>
+          <w:rtl w:val="1"/>
+          <w:rFonts w:cs="Arial"/>
+        </w:rPr>
+        <w:t xml:space="preserve"> (1) </w:t>
+      </w:r>
+      <w:r>
+        <w:rPr>
+          <w:rFonts w:ascii="Arial" w:hAnsi="Arial"/>
+          <w:b/>
+          <w:sz w:val="22"/>
+          <w:rtl w:val="1"/>
+          <w:rFonts w:cs="Arial"/>
+        </w:rPr>
+        <w:t>ישיר</w:t>
+      </w:r>
+      <w:r>
+        <w:rPr>
+          <w:rFonts w:ascii="Arial" w:hAnsi="Arial"/>
+          <w:b w:val="0"/>
+          <w:sz w:val="22"/>
+          <w:rtl w:val="1"/>
+          <w:rFonts w:cs="Arial"/>
+        </w:rPr>
+        <w:t xml:space="preserve"> — מכירה ללקוח תחת מותג HELIX (~₪250-450/workspace), הערוץ הראשי; (2) </w:t>
+      </w:r>
+      <w:r>
+        <w:rPr>
+          <w:rFonts w:ascii="Arial" w:hAnsi="Arial"/>
+          <w:b/>
+          <w:sz w:val="22"/>
+          <w:rtl w:val="1"/>
+          <w:rFonts w:cs="Arial"/>
+        </w:rPr>
+        <w:t>הפצה/שת"פ (אופציונלי)</w:t>
+      </w:r>
+      <w:r>
+        <w:rPr>
+          <w:rFonts w:ascii="Arial" w:hAnsi="Arial"/>
+          <w:b w:val="0"/>
+          <w:sz w:val="22"/>
+          <w:rtl w:val="1"/>
+          <w:rFonts w:cs="Arial"/>
+        </w:rPr>
+        <w:t xml:space="preserve"> — wholesale לשותף/סוכנות (~₪150) → מוכר כ-line-item בריטיינר (~₪400) או ככלי-שימור.</w:t>
       </w:r>
     </w:p>
     <w:p>

</xml_diff>

<commit_message>
docs(marketing-ops): incremental build + winner publish + auto-winner
</commit_message>
<xml_diff>
--- a/PRODUCTS/01-marketing-ops-hub.docx
+++ b/PRODUCTS/01-marketing-ops-hub.docx
@@ -12707,6 +12707,325 @@
                 <w:rFonts w:cs="Consolas"/>
               </w:rPr>
               <w:t>bot_links</w:t>
+            </w:r>
+          </w:p>
+        </w:tc>
+      </w:tr>
+      <w:tr>
+        <w:tc>
+          <w:tcPr>
+            <w:tcW w:type="dxa" w:w="4320"/>
+          </w:tcPr>
+          <w:p>
+            <w:pPr>
+              <w:bidi w:val="1"/>
+              <w:jc w:val="right"/>
+            </w:pPr>
+            <w:r>
+              <w:rPr>
+                <w:rFonts w:ascii="Arial" w:hAnsi="Arial"/>
+                <w:b/>
+                <w:sz w:val="20"/>
+                <w:rtl w:val="1"/>
+                <w:rFonts w:cs="Arial"/>
+              </w:rPr>
+              <w:t>⏳ בנייה אינקרמנטלית (ערוץ-אחד-בכל-פעם) 🆕</w:t>
+            </w:r>
+            <w:r>
+              <w:rPr>
+                <w:rFonts w:ascii="Arial" w:hAnsi="Arial"/>
+                <w:b w:val="0"/>
+                <w:sz w:val="20"/>
+                <w:rtl w:val="1"/>
+                <w:rFonts w:cs="Arial"/>
+              </w:rPr>
+              <w:t xml:space="preserve"> — createCampaign יוצר shell מיידית (asset ממתין per-ערוץ), ואז </w:t>
+            </w:r>
+            <w:r>
+              <w:rPr>
+                <w:rFonts w:ascii="Consolas" w:hAnsi="Consolas"/>
+                <w:b w:val="0"/>
+                <w:color w:val="B02A37"/>
+                <w:sz w:val="20"/>
+                <w:rtl w:val="1"/>
+                <w:rFonts w:cs="Consolas"/>
+              </w:rPr>
+              <w:t>buildNextAsset</w:t>
+            </w:r>
+            <w:r>
+              <w:rPr>
+                <w:rFonts w:ascii="Arial" w:hAnsi="Arial"/>
+                <w:b w:val="0"/>
+                <w:sz w:val="20"/>
+                <w:rtl w:val="1"/>
+                <w:rFonts w:cs="Arial"/>
+              </w:rPr>
+              <w:t xml:space="preserve"> בונה </w:t>
+            </w:r>
+            <w:r>
+              <w:rPr>
+                <w:rFonts w:ascii="Arial" w:hAnsi="Arial"/>
+                <w:b/>
+                <w:sz w:val="20"/>
+                <w:rtl w:val="1"/>
+                <w:rFonts w:cs="Arial"/>
+              </w:rPr>
+              <w:t>ערוץ אחד בכל קריאה</w:t>
+            </w:r>
+            <w:r>
+              <w:rPr>
+                <w:rFonts w:ascii="Arial" w:hAnsi="Arial"/>
+                <w:b w:val="0"/>
+                <w:sz w:val="20"/>
+                <w:rtl w:val="1"/>
+                <w:rFonts w:cs="Arial"/>
+              </w:rPr>
+              <w:t xml:space="preserve"> — התוכן מופיע בהדרגה במסך-הפירוט, לא 108 גרסאות בבת-אחת</w:t>
+            </w:r>
+          </w:p>
+        </w:tc>
+        <w:tc>
+          <w:tcPr>
+            <w:tcW w:type="dxa" w:w="4320"/>
+          </w:tcPr>
+          <w:p>
+            <w:pPr>
+              <w:bidi w:val="1"/>
+              <w:jc w:val="right"/>
+            </w:pPr>
+            <w:r>
+              <w:rPr>
+                <w:rFonts w:ascii="Consolas" w:hAnsi="Consolas"/>
+                <w:b w:val="0"/>
+                <w:color w:val="B02A37"/>
+                <w:sz w:val="20"/>
+                <w:rtl w:val="1"/>
+                <w:rFonts w:cs="Consolas"/>
+              </w:rPr>
+              <w:t>lib/campaign-run.ts</w:t>
+            </w:r>
+            <w:r>
+              <w:rPr>
+                <w:rFonts w:ascii="Arial" w:hAnsi="Arial"/>
+                <w:b w:val="0"/>
+                <w:sz w:val="20"/>
+                <w:rtl w:val="1"/>
+                <w:rFonts w:cs="Arial"/>
+              </w:rPr>
+              <w:t xml:space="preserve"> (</w:t>
+            </w:r>
+            <w:r>
+              <w:rPr>
+                <w:rFonts w:ascii="Consolas" w:hAnsi="Consolas"/>
+                <w:b w:val="0"/>
+                <w:color w:val="B02A37"/>
+                <w:sz w:val="20"/>
+                <w:rtl w:val="1"/>
+                <w:rFonts w:cs="Consolas"/>
+              </w:rPr>
+              <w:t>createCampaignShell</w:t>
+            </w:r>
+            <w:r>
+              <w:rPr>
+                <w:rFonts w:ascii="Arial" w:hAnsi="Arial"/>
+                <w:b w:val="0"/>
+                <w:sz w:val="20"/>
+                <w:rtl w:val="1"/>
+                <w:rFonts w:cs="Arial"/>
+              </w:rPr>
+              <w:t>/</w:t>
+            </w:r>
+            <w:r>
+              <w:rPr>
+                <w:rFonts w:ascii="Consolas" w:hAnsi="Consolas"/>
+                <w:b w:val="0"/>
+                <w:color w:val="B02A37"/>
+                <w:sz w:val="20"/>
+                <w:rtl w:val="1"/>
+                <w:rFonts w:cs="Consolas"/>
+              </w:rPr>
+              <w:t>buildOneAsset</w:t>
+            </w:r>
+            <w:r>
+              <w:rPr>
+                <w:rFonts w:ascii="Arial" w:hAnsi="Arial"/>
+                <w:b w:val="0"/>
+                <w:sz w:val="20"/>
+                <w:rtl w:val="1"/>
+                <w:rFonts w:cs="Arial"/>
+              </w:rPr>
+              <w:t xml:space="preserve">), </w:t>
+            </w:r>
+            <w:r>
+              <w:rPr>
+                <w:rFonts w:ascii="Consolas" w:hAnsi="Consolas"/>
+                <w:b w:val="0"/>
+                <w:color w:val="B02A37"/>
+                <w:sz w:val="20"/>
+                <w:rtl w:val="1"/>
+                <w:rFonts w:cs="Consolas"/>
+              </w:rPr>
+              <w:t>campaign_assets.status</w:t>
+            </w:r>
+          </w:p>
+        </w:tc>
+      </w:tr>
+      <w:tr>
+        <w:tc>
+          <w:tcPr>
+            <w:tcW w:type="dxa" w:w="4320"/>
+          </w:tcPr>
+          <w:p>
+            <w:pPr>
+              <w:bidi w:val="1"/>
+              <w:jc w:val="right"/>
+            </w:pPr>
+            <w:r>
+              <w:rPr>
+                <w:rFonts w:ascii="Arial" w:hAnsi="Arial"/>
+                <w:b/>
+                <w:sz w:val="20"/>
+                <w:rtl w:val="1"/>
+                <w:rFonts w:cs="Arial"/>
+              </w:rPr>
+              <w:t>📤 חיווט מנצח→הפצה + בחירת-מנצח אוטומטית 🆕</w:t>
+            </w:r>
+            <w:r>
+              <w:rPr>
+                <w:rFonts w:ascii="Arial" w:hAnsi="Arial"/>
+                <w:b w:val="0"/>
+                <w:sz w:val="20"/>
+                <w:rtl w:val="1"/>
+                <w:rFonts w:cs="Arial"/>
+              </w:rPr>
+              <w:t xml:space="preserve"> — </w:t>
+            </w:r>
+            <w:r>
+              <w:rPr>
+                <w:rFonts w:ascii="Consolas" w:hAnsi="Consolas"/>
+                <w:b w:val="0"/>
+                <w:color w:val="B02A37"/>
+                <w:sz w:val="20"/>
+                <w:rtl w:val="1"/>
+                <w:rFonts w:cs="Consolas"/>
+              </w:rPr>
+              <w:t>publishVariant</w:t>
+            </w:r>
+            <w:r>
+              <w:rPr>
+                <w:rFonts w:ascii="Arial" w:hAnsi="Arial"/>
+                <w:b w:val="0"/>
+                <w:sz w:val="20"/>
+                <w:rtl w:val="1"/>
+                <w:rFonts w:cs="Arial"/>
+              </w:rPr>
+              <w:t xml:space="preserve"> שולח את הווריאציה המנצחת לערוץ דרך מנוע ההפצה (</w:t>
+            </w:r>
+            <w:r>
+              <w:rPr>
+                <w:rFonts w:ascii="Consolas" w:hAnsi="Consolas"/>
+                <w:b w:val="0"/>
+                <w:color w:val="B02A37"/>
+                <w:sz w:val="20"/>
+                <w:rtl w:val="1"/>
+                <w:rFonts w:cs="Consolas"/>
+              </w:rPr>
+              <w:t>sendToChannel</w:t>
+            </w:r>
+            <w:r>
+              <w:rPr>
+                <w:rFonts w:ascii="Arial" w:hAnsi="Arial"/>
+                <w:b w:val="0"/>
+                <w:sz w:val="20"/>
+                <w:rtl w:val="1"/>
+                <w:rFonts w:cs="Arial"/>
+              </w:rPr>
+              <w:t xml:space="preserve">) + לוג </w:t>
+            </w:r>
+            <w:r>
+              <w:rPr>
+                <w:rFonts w:ascii="Consolas" w:hAnsi="Consolas"/>
+                <w:b w:val="0"/>
+                <w:color w:val="B02A37"/>
+                <w:sz w:val="20"/>
+                <w:rtl w:val="1"/>
+                <w:rFonts w:cs="Consolas"/>
+              </w:rPr>
+              <w:t>publications</w:t>
+            </w:r>
+            <w:r>
+              <w:rPr>
+                <w:rFonts w:ascii="Arial" w:hAnsi="Arial"/>
+                <w:b w:val="0"/>
+                <w:sz w:val="20"/>
+                <w:rtl w:val="1"/>
+                <w:rFonts w:cs="Arial"/>
+              </w:rPr>
+              <w:t xml:space="preserve">. </w:t>
+            </w:r>
+            <w:r>
+              <w:rPr>
+                <w:rFonts w:ascii="Consolas" w:hAnsi="Consolas"/>
+                <w:b w:val="0"/>
+                <w:color w:val="B02A37"/>
+                <w:sz w:val="20"/>
+                <w:rtl w:val="1"/>
+                <w:rFonts w:cs="Consolas"/>
+              </w:rPr>
+              <w:t>autoPickWinner</w:t>
+            </w:r>
+            <w:r>
+              <w:rPr>
+                <w:rFonts w:ascii="Arial" w:hAnsi="Arial"/>
+                <w:b w:val="0"/>
+                <w:sz w:val="20"/>
+                <w:rtl w:val="1"/>
+                <w:rFonts w:cs="Arial"/>
+              </w:rPr>
+              <w:t xml:space="preserve"> בוחר מנצח לפי ביצועים (conversions&gt;clicks&gt;impressions), ובהיעדר דאטה — לפי ציון-אנושיות</w:t>
+            </w:r>
+          </w:p>
+        </w:tc>
+        <w:tc>
+          <w:tcPr>
+            <w:tcW w:type="dxa" w:w="4320"/>
+          </w:tcPr>
+          <w:p>
+            <w:pPr>
+              <w:bidi w:val="1"/>
+              <w:jc w:val="right"/>
+            </w:pPr>
+            <w:r>
+              <w:rPr>
+                <w:rFonts w:ascii="Consolas" w:hAnsi="Consolas"/>
+                <w:b w:val="0"/>
+                <w:color w:val="B02A37"/>
+                <w:sz w:val="20"/>
+                <w:rtl w:val="1"/>
+                <w:rFonts w:cs="Consolas"/>
+              </w:rPr>
+              <w:t>app/actions-campaigns.ts</w:t>
+            </w:r>
+            <w:r>
+              <w:rPr>
+                <w:rFonts w:ascii="Arial" w:hAnsi="Arial"/>
+                <w:b w:val="0"/>
+                <w:sz w:val="20"/>
+                <w:rtl w:val="1"/>
+                <w:rFonts w:cs="Arial"/>
+              </w:rPr>
+              <w:t xml:space="preserve">, </w:t>
+            </w:r>
+            <w:r>
+              <w:rPr>
+                <w:rFonts w:ascii="Consolas" w:hAnsi="Consolas"/>
+                <w:b w:val="0"/>
+                <w:color w:val="B02A37"/>
+                <w:sz w:val="20"/>
+                <w:rtl w:val="1"/>
+                <w:rFonts w:cs="Consolas"/>
+              </w:rPr>
+              <w:t>components/CampaignDetail.tsx</w:t>
             </w:r>
           </w:p>
         </w:tc>

</xml_diff>

<commit_message>
docs(marketing-ops): multi-variant publishing (organic/paid/video)
</commit_message>
<xml_diff>
--- a/PRODUCTS/01-marketing-ops-hub.docx
+++ b/PRODUCTS/01-marketing-ops-hub.docx
@@ -12888,7 +12888,7 @@
                 <w:rtl w:val="1"/>
                 <w:rFonts w:cs="Arial"/>
               </w:rPr>
-              <w:t>📤 חיווט מנצח→הפצה + בחירת-מנצח אוטומטית 🆕</w:t>
+              <w:t>📤 פרסום מרובה-גרסאות (אורגני/ממומן/סרטון) 🆕</w:t>
             </w:r>
             <w:r>
               <w:rPr>
@@ -12909,17 +12909,57 @@
                 <w:rtl w:val="1"/>
                 <w:rFonts w:cs="Consolas"/>
               </w:rPr>
-              <w:t>publishVariant</w:t>
-            </w:r>
-            <w:r>
-              <w:rPr>
-                <w:rFonts w:ascii="Arial" w:hAnsi="Arial"/>
-                <w:b w:val="0"/>
-                <w:sz w:val="20"/>
-                <w:rtl w:val="1"/>
-                <w:rFonts w:cs="Arial"/>
-              </w:rPr>
-              <w:t xml:space="preserve"> שולח את הווריאציה המנצחת לערוץ דרך מנוע ההפצה (</w:t>
+              <w:t>publishVariants</w:t>
+            </w:r>
+            <w:r>
+              <w:rPr>
+                <w:rFonts w:ascii="Arial" w:hAnsi="Arial"/>
+                <w:b w:val="0"/>
+                <w:sz w:val="20"/>
+                <w:rtl w:val="1"/>
+                <w:rFonts w:cs="Arial"/>
+              </w:rPr>
+              <w:t xml:space="preserve"> מפרסם </w:t>
+            </w:r>
+            <w:r>
+              <w:rPr>
+                <w:rFonts w:ascii="Arial" w:hAnsi="Arial"/>
+                <w:b/>
+                <w:sz w:val="20"/>
+                <w:rtl w:val="1"/>
+                <w:rFonts w:cs="Arial"/>
+              </w:rPr>
+              <w:t>כמה גרסאות בבת-אחת</w:t>
+            </w:r>
+            <w:r>
+              <w:rPr>
+                <w:rFonts w:ascii="Arial" w:hAnsi="Arial"/>
+                <w:b w:val="0"/>
+                <w:sz w:val="20"/>
+                <w:rtl w:val="1"/>
+                <w:rFonts w:cs="Arial"/>
+              </w:rPr>
+              <w:t xml:space="preserve"> (לא רק מנצח) בכל פלטפורמה: </w:t>
+            </w:r>
+            <w:r>
+              <w:rPr>
+                <w:rFonts w:ascii="Arial" w:hAnsi="Arial"/>
+                <w:b/>
+                <w:sz w:val="20"/>
+                <w:rtl w:val="1"/>
+                <w:rFonts w:cs="Arial"/>
+              </w:rPr>
+              <w:t>תוכן אורגני</w:t>
+            </w:r>
+            <w:r>
+              <w:rPr>
+                <w:rFonts w:ascii="Arial" w:hAnsi="Arial"/>
+                <w:b w:val="0"/>
+                <w:sz w:val="20"/>
+                <w:rtl w:val="1"/>
+                <w:rFonts w:cs="Arial"/>
+              </w:rPr>
+              <w:t xml:space="preserve"> (</w:t>
             </w:r>
             <w:r>
               <w:rPr>
@@ -12940,7 +12980,27 @@
                 <w:rtl w:val="1"/>
                 <w:rFonts w:cs="Arial"/>
               </w:rPr>
-              <w:t xml:space="preserve">) + לוג </w:t>
+              <w:t xml:space="preserve">) · </w:t>
+            </w:r>
+            <w:r>
+              <w:rPr>
+                <w:rFonts w:ascii="Arial" w:hAnsi="Arial"/>
+                <w:b/>
+                <w:sz w:val="20"/>
+                <w:rtl w:val="1"/>
+                <w:rFonts w:cs="Arial"/>
+              </w:rPr>
+              <w:t>ממומן</w:t>
+            </w:r>
+            <w:r>
+              <w:rPr>
+                <w:rFonts w:ascii="Arial" w:hAnsi="Arial"/>
+                <w:b w:val="0"/>
+                <w:sz w:val="20"/>
+                <w:rtl w:val="1"/>
+                <w:rFonts w:cs="Arial"/>
+              </w:rPr>
+              <w:t xml:space="preserve"> (</w:t>
             </w:r>
             <w:r>
               <w:rPr>
@@ -12951,6 +13011,68 @@
                 <w:rtl w:val="1"/>
                 <w:rFonts w:cs="Consolas"/>
               </w:rPr>
+              <w:t>lib/distribution/paid.ts</w:t>
+            </w:r>
+            <w:r>
+              <w:rPr>
+                <w:rFonts w:ascii="Arial" w:hAnsi="Arial"/>
+                <w:b w:val="0"/>
+                <w:sz w:val="20"/>
+                <w:rtl w:val="1"/>
+                <w:rFonts w:cs="Arial"/>
+              </w:rPr>
+              <w:t xml:space="preserve"> — Meta ad-creative, env-driven) · </w:t>
+            </w:r>
+            <w:r>
+              <w:rPr>
+                <w:rFonts w:ascii="Arial" w:hAnsi="Arial"/>
+                <w:b/>
+                <w:sz w:val="20"/>
+                <w:rtl w:val="1"/>
+                <w:rFonts w:cs="Arial"/>
+              </w:rPr>
+              <w:t>סרטון</w:t>
+            </w:r>
+            <w:r>
+              <w:rPr>
+                <w:rFonts w:ascii="Arial" w:hAnsi="Arial"/>
+                <w:b w:val="0"/>
+                <w:sz w:val="20"/>
+                <w:rtl w:val="1"/>
+                <w:rFonts w:cs="Arial"/>
+              </w:rPr>
+              <w:t xml:space="preserve"> (</w:t>
+            </w:r>
+            <w:r>
+              <w:rPr>
+                <w:rFonts w:ascii="Consolas" w:hAnsi="Consolas"/>
+                <w:b w:val="0"/>
+                <w:color w:val="B02A37"/>
+                <w:sz w:val="20"/>
+                <w:rtl w:val="1"/>
+                <w:rFonts w:cs="Consolas"/>
+              </w:rPr>
+              <w:t>video_url</w:t>
+            </w:r>
+            <w:r>
+              <w:rPr>
+                <w:rFonts w:ascii="Arial" w:hAnsi="Arial"/>
+                <w:b w:val="0"/>
+                <w:sz w:val="20"/>
+                <w:rtl w:val="1"/>
+                <w:rFonts w:cs="Arial"/>
+              </w:rPr>
+              <w:t xml:space="preserve"> לאדפטרי TikTok/YouTube). בחירה מרובה ב-UI + מצב + קישור-מדיה. לוג </w:t>
+            </w:r>
+            <w:r>
+              <w:rPr>
+                <w:rFonts w:ascii="Consolas" w:hAnsi="Consolas"/>
+                <w:b w:val="0"/>
+                <w:color w:val="B02A37"/>
+                <w:sz w:val="20"/>
+                <w:rtl w:val="1"/>
+                <w:rFonts w:cs="Consolas"/>
+              </w:rPr>
               <w:t>publications</w:t>
             </w:r>
             <w:r>
@@ -12961,7 +13083,7 @@
                 <w:rtl w:val="1"/>
                 <w:rFonts w:cs="Arial"/>
               </w:rPr>
-              <w:t xml:space="preserve">. </w:t>
+              <w:t xml:space="preserve"> עם </w:t>
             </w:r>
             <w:r>
               <w:rPr>
@@ -12972,17 +13094,49 @@
                 <w:rtl w:val="1"/>
                 <w:rFonts w:cs="Consolas"/>
               </w:rPr>
-              <w:t>autoPickWinner</w:t>
-            </w:r>
-            <w:r>
-              <w:rPr>
-                <w:rFonts w:ascii="Arial" w:hAnsi="Arial"/>
-                <w:b w:val="0"/>
-                <w:sz w:val="20"/>
-                <w:rtl w:val="1"/>
-                <w:rFonts w:cs="Arial"/>
-              </w:rPr>
-              <w:t xml:space="preserve"> בוחר מנצח לפי ביצועים (conversions&gt;clicks&gt;impressions), ובהיעדר דאטה — לפי ציון-אנושיות</w:t>
+              <w:t>mode</w:t>
+            </w:r>
+            <w:r>
+              <w:rPr>
+                <w:rFonts w:ascii="Arial" w:hAnsi="Arial"/>
+                <w:b w:val="0"/>
+                <w:sz w:val="20"/>
+                <w:rtl w:val="1"/>
+                <w:rFonts w:cs="Arial"/>
+              </w:rPr>
+              <w:t>/</w:t>
+            </w:r>
+            <w:r>
+              <w:rPr>
+                <w:rFonts w:ascii="Consolas" w:hAnsi="Consolas"/>
+                <w:b w:val="0"/>
+                <w:color w:val="B02A37"/>
+                <w:sz w:val="20"/>
+                <w:rtl w:val="1"/>
+                <w:rFonts w:cs="Consolas"/>
+              </w:rPr>
+              <w:t>media_url</w:t>
+            </w:r>
+            <w:r>
+              <w:rPr>
+                <w:rFonts w:ascii="Arial" w:hAnsi="Arial"/>
+                <w:b w:val="0"/>
+                <w:sz w:val="20"/>
+                <w:rtl w:val="1"/>
+                <w:rFonts w:cs="Arial"/>
+              </w:rPr>
+              <w:t>/</w:t>
+            </w:r>
+            <w:r>
+              <w:rPr>
+                <w:rFonts w:ascii="Consolas" w:hAnsi="Consolas"/>
+                <w:b w:val="0"/>
+                <w:color w:val="B02A37"/>
+                <w:sz w:val="20"/>
+                <w:rtl w:val="1"/>
+                <w:rFonts w:cs="Consolas"/>
+              </w:rPr>
+              <w:t>variant_id</w:t>
             </w:r>
           </w:p>
         </w:tc>
@@ -13025,7 +13179,104 @@
                 <w:rtl w:val="1"/>
                 <w:rFonts w:cs="Consolas"/>
               </w:rPr>
+              <w:t>lib/distribution/paid.ts</w:t>
+            </w:r>
+            <w:r>
+              <w:rPr>
+                <w:rFonts w:ascii="Arial" w:hAnsi="Arial"/>
+                <w:b w:val="0"/>
+                <w:sz w:val="20"/>
+                <w:rtl w:val="1"/>
+                <w:rFonts w:cs="Arial"/>
+              </w:rPr>
+              <w:t xml:space="preserve">, </w:t>
+            </w:r>
+            <w:r>
+              <w:rPr>
+                <w:rFonts w:ascii="Consolas" w:hAnsi="Consolas"/>
+                <w:b w:val="0"/>
+                <w:color w:val="B02A37"/>
+                <w:sz w:val="20"/>
+                <w:rtl w:val="1"/>
+                <w:rFonts w:cs="Consolas"/>
+              </w:rPr>
               <w:t>components/CampaignDetail.tsx</w:t>
+            </w:r>
+          </w:p>
+        </w:tc>
+      </w:tr>
+      <w:tr>
+        <w:tc>
+          <w:tcPr>
+            <w:tcW w:type="dxa" w:w="4320"/>
+          </w:tcPr>
+          <w:p>
+            <w:pPr>
+              <w:bidi w:val="1"/>
+              <w:jc w:val="right"/>
+            </w:pPr>
+            <w:r>
+              <w:rPr>
+                <w:rFonts w:ascii="Arial" w:hAnsi="Arial"/>
+                <w:b/>
+                <w:sz w:val="20"/>
+                <w:rtl w:val="1"/>
+                <w:rFonts w:cs="Arial"/>
+              </w:rPr>
+              <w:t>🏆 בחירת-מנצח אוטומטית 🆕</w:t>
+            </w:r>
+            <w:r>
+              <w:rPr>
+                <w:rFonts w:ascii="Arial" w:hAnsi="Arial"/>
+                <w:b w:val="0"/>
+                <w:sz w:val="20"/>
+                <w:rtl w:val="1"/>
+                <w:rFonts w:cs="Arial"/>
+              </w:rPr>
+              <w:t xml:space="preserve"> — </w:t>
+            </w:r>
+            <w:r>
+              <w:rPr>
+                <w:rFonts w:ascii="Consolas" w:hAnsi="Consolas"/>
+                <w:b w:val="0"/>
+                <w:color w:val="B02A37"/>
+                <w:sz w:val="20"/>
+                <w:rtl w:val="1"/>
+                <w:rFonts w:cs="Consolas"/>
+              </w:rPr>
+              <w:t>autoPickWinner</w:t>
+            </w:r>
+            <w:r>
+              <w:rPr>
+                <w:rFonts w:ascii="Arial" w:hAnsi="Arial"/>
+                <w:b w:val="0"/>
+                <w:sz w:val="20"/>
+                <w:rtl w:val="1"/>
+                <w:rFonts w:cs="Arial"/>
+              </w:rPr>
+              <w:t xml:space="preserve"> לפי ביצועים (conversions&gt;clicks&gt;impressions), ובהיעדר דאטה — לפי ציון-אנושיות</w:t>
+            </w:r>
+          </w:p>
+        </w:tc>
+        <w:tc>
+          <w:tcPr>
+            <w:tcW w:type="dxa" w:w="4320"/>
+          </w:tcPr>
+          <w:p>
+            <w:pPr>
+              <w:bidi w:val="1"/>
+              <w:jc w:val="right"/>
+            </w:pPr>
+            <w:r>
+              <w:rPr>
+                <w:rFonts w:ascii="Consolas" w:hAnsi="Consolas"/>
+                <w:b w:val="0"/>
+                <w:color w:val="B02A37"/>
+                <w:sz w:val="20"/>
+                <w:rtl w:val="1"/>
+                <w:rFonts w:cs="Consolas"/>
+              </w:rPr>
+              <w:t>app/actions-campaigns.ts</w:t>
             </w:r>
           </w:p>
         </w:tc>

</xml_diff>

<commit_message>
docs(marketing-ops): per-variant video + real per-variant platform metrics
</commit_message>
<xml_diff>
--- a/PRODUCTS/01-marketing-ops-hub.docx
+++ b/PRODUCTS/01-marketing-ops-hub.docx
@@ -13223,6 +13223,304 @@
                 <w:rtl w:val="1"/>
                 <w:rFonts w:cs="Arial"/>
               </w:rPr>
+              <w:t>🎬 סרטון per-גרסה (Video Studio) 🆕</w:t>
+            </w:r>
+            <w:r>
+              <w:rPr>
+                <w:rFonts w:ascii="Arial" w:hAnsi="Arial"/>
+                <w:b w:val="0"/>
+                <w:sz w:val="20"/>
+                <w:rtl w:val="1"/>
+                <w:rFonts w:cs="Arial"/>
+              </w:rPr>
+              <w:t xml:space="preserve"> — לכל גרסה </w:t>
+            </w:r>
+            <w:r>
+              <w:rPr>
+                <w:rFonts w:ascii="Consolas" w:hAnsi="Consolas"/>
+                <w:b w:val="0"/>
+                <w:color w:val="B02A37"/>
+                <w:sz w:val="20"/>
+                <w:rtl w:val="1"/>
+                <w:rFonts w:cs="Consolas"/>
+              </w:rPr>
+              <w:t>video_url</w:t>
+            </w:r>
+            <w:r>
+              <w:rPr>
+                <w:rFonts w:ascii="Arial" w:hAnsi="Arial"/>
+                <w:b w:val="0"/>
+                <w:sz w:val="20"/>
+                <w:rtl w:val="1"/>
+                <w:rFonts w:cs="Arial"/>
+              </w:rPr>
+              <w:t xml:space="preserve"> משלה (הפקה ב-Video Studio → צירוף). פרסום-וידאו משתמש בסרטון-הגרסה (fallback לקישור-אצווה) → אדפטרי TikTok/YouTube</w:t>
+            </w:r>
+          </w:p>
+        </w:tc>
+        <w:tc>
+          <w:tcPr>
+            <w:tcW w:type="dxa" w:w="4320"/>
+          </w:tcPr>
+          <w:p>
+            <w:pPr>
+              <w:bidi w:val="1"/>
+              <w:jc w:val="right"/>
+            </w:pPr>
+            <w:r>
+              <w:rPr>
+                <w:rFonts w:ascii="Consolas" w:hAnsi="Consolas"/>
+                <w:b w:val="0"/>
+                <w:color w:val="B02A37"/>
+                <w:sz w:val="20"/>
+                <w:rtl w:val="1"/>
+                <w:rFonts w:cs="Consolas"/>
+              </w:rPr>
+              <w:t>content_variants.video_url</w:t>
+            </w:r>
+            <w:r>
+              <w:rPr>
+                <w:rFonts w:ascii="Arial" w:hAnsi="Arial"/>
+                <w:b w:val="0"/>
+                <w:sz w:val="20"/>
+                <w:rtl w:val="1"/>
+                <w:rFonts w:cs="Arial"/>
+              </w:rPr>
+              <w:t xml:space="preserve">, </w:t>
+            </w:r>
+            <w:r>
+              <w:rPr>
+                <w:rFonts w:ascii="Consolas" w:hAnsi="Consolas"/>
+                <w:b w:val="0"/>
+                <w:color w:val="B02A37"/>
+                <w:sz w:val="20"/>
+                <w:rtl w:val="1"/>
+                <w:rFonts w:cs="Consolas"/>
+              </w:rPr>
+              <w:t>setVariantVideo</w:t>
+            </w:r>
+            <w:r>
+              <w:rPr>
+                <w:rFonts w:ascii="Arial" w:hAnsi="Arial"/>
+                <w:b w:val="0"/>
+                <w:sz w:val="20"/>
+                <w:rtl w:val="1"/>
+                <w:rFonts w:cs="Arial"/>
+              </w:rPr>
+              <w:t xml:space="preserve">, </w:t>
+            </w:r>
+            <w:r>
+              <w:rPr>
+                <w:rFonts w:ascii="Consolas" w:hAnsi="Consolas"/>
+                <w:b w:val="0"/>
+                <w:color w:val="B02A37"/>
+                <w:sz w:val="20"/>
+                <w:rtl w:val="1"/>
+                <w:rFonts w:cs="Consolas"/>
+              </w:rPr>
+              <w:t>VideoAttach</w:t>
+            </w:r>
+          </w:p>
+        </w:tc>
+      </w:tr>
+      <w:tr>
+        <w:tc>
+          <w:tcPr>
+            <w:tcW w:type="dxa" w:w="4320"/>
+          </w:tcPr>
+          <w:p>
+            <w:pPr>
+              <w:bidi w:val="1"/>
+              <w:jc w:val="right"/>
+            </w:pPr>
+            <w:r>
+              <w:rPr>
+                <w:rFonts w:ascii="Arial" w:hAnsi="Arial"/>
+                <w:b/>
+                <w:sz w:val="20"/>
+                <w:rtl w:val="1"/>
+                <w:rFonts w:cs="Arial"/>
+              </w:rPr>
+              <w:t>📈 נתונים אמיתיים per-גרסה 🆕</w:t>
+            </w:r>
+            <w:r>
+              <w:rPr>
+                <w:rFonts w:ascii="Arial" w:hAnsi="Arial"/>
+                <w:b w:val="0"/>
+                <w:sz w:val="20"/>
+                <w:rtl w:val="1"/>
+                <w:rFonts w:cs="Arial"/>
+              </w:rPr>
+              <w:t xml:space="preserve"> — משיכת </w:t>
+            </w:r>
+            <w:r>
+              <w:rPr>
+                <w:rFonts w:ascii="Arial" w:hAnsi="Arial"/>
+                <w:b/>
+                <w:sz w:val="20"/>
+                <w:rtl w:val="1"/>
+                <w:rFonts w:cs="Arial"/>
+              </w:rPr>
+              <w:t>צפיות/קליקים/חשיפות</w:t>
+            </w:r>
+            <w:r>
+              <w:rPr>
+                <w:rFonts w:ascii="Arial" w:hAnsi="Arial"/>
+                <w:b w:val="0"/>
+                <w:sz w:val="20"/>
+                <w:rtl w:val="1"/>
+                <w:rFonts w:cs="Arial"/>
+              </w:rPr>
+              <w:t xml:space="preserve"> מכל פלטפורמה per-גרסה לפי </w:t>
+            </w:r>
+            <w:r>
+              <w:rPr>
+                <w:rFonts w:ascii="Consolas" w:hAnsi="Consolas"/>
+                <w:b w:val="0"/>
+                <w:color w:val="B02A37"/>
+                <w:sz w:val="20"/>
+                <w:rtl w:val="1"/>
+                <w:rFonts w:cs="Consolas"/>
+              </w:rPr>
+              <w:t>external_id</w:t>
+            </w:r>
+            <w:r>
+              <w:rPr>
+                <w:rFonts w:ascii="Arial" w:hAnsi="Arial"/>
+                <w:b w:val="0"/>
+                <w:sz w:val="20"/>
+                <w:rtl w:val="1"/>
+                <w:rFonts w:cs="Arial"/>
+              </w:rPr>
+              <w:t xml:space="preserve"> שנשמר בפרסום (Meta Graph insights · TikTok video-query · YouTube stats). </w:t>
+            </w:r>
+            <w:r>
+              <w:rPr>
+                <w:rFonts w:ascii="Consolas" w:hAnsi="Consolas"/>
+                <w:b w:val="0"/>
+                <w:color w:val="B02A37"/>
+                <w:sz w:val="20"/>
+                <w:rtl w:val="1"/>
+                <w:rFonts w:cs="Consolas"/>
+              </w:rPr>
+              <w:t>syncCampaignMetrics</w:t>
+            </w:r>
+            <w:r>
+              <w:rPr>
+                <w:rFonts w:ascii="Arial" w:hAnsi="Arial"/>
+                <w:b w:val="0"/>
+                <w:sz w:val="20"/>
+                <w:rtl w:val="1"/>
+                <w:rFonts w:cs="Arial"/>
+              </w:rPr>
+              <w:t xml:space="preserve"> (כפתור "רענן") + cron </w:t>
+            </w:r>
+            <w:r>
+              <w:rPr>
+                <w:rFonts w:ascii="Consolas" w:hAnsi="Consolas"/>
+                <w:b w:val="0"/>
+                <w:color w:val="B02A37"/>
+                <w:sz w:val="20"/>
+                <w:rtl w:val="1"/>
+                <w:rFonts w:cs="Consolas"/>
+              </w:rPr>
+              <w:t>/api/cron/variant-metrics</w:t>
+            </w:r>
+            <w:r>
+              <w:rPr>
+                <w:rFonts w:ascii="Arial" w:hAnsi="Arial"/>
+                <w:b w:val="0"/>
+                <w:sz w:val="20"/>
+                <w:rtl w:val="1"/>
+                <w:rFonts w:cs="Arial"/>
+              </w:rPr>
+              <w:t xml:space="preserve"> (כל 6ש'). מוצג chips per-גרסה, ומזין את בחירת-המנצח</w:t>
+            </w:r>
+          </w:p>
+        </w:tc>
+        <w:tc>
+          <w:tcPr>
+            <w:tcW w:type="dxa" w:w="4320"/>
+          </w:tcPr>
+          <w:p>
+            <w:pPr>
+              <w:bidi w:val="1"/>
+              <w:jc w:val="right"/>
+            </w:pPr>
+            <w:r>
+              <w:rPr>
+                <w:rFonts w:ascii="Consolas" w:hAnsi="Consolas"/>
+                <w:b w:val="0"/>
+                <w:color w:val="B02A37"/>
+                <w:sz w:val="20"/>
+                <w:rtl w:val="1"/>
+                <w:rFonts w:cs="Consolas"/>
+              </w:rPr>
+              <w:t>lib/insights/*</w:t>
+            </w:r>
+            <w:r>
+              <w:rPr>
+                <w:rFonts w:ascii="Arial" w:hAnsi="Arial"/>
+                <w:b w:val="0"/>
+                <w:sz w:val="20"/>
+                <w:rtl w:val="1"/>
+                <w:rFonts w:cs="Arial"/>
+              </w:rPr>
+              <w:t xml:space="preserve">, </w:t>
+            </w:r>
+            <w:r>
+              <w:rPr>
+                <w:rFonts w:ascii="Consolas" w:hAnsi="Consolas"/>
+                <w:b w:val="0"/>
+                <w:color w:val="B02A37"/>
+                <w:sz w:val="20"/>
+                <w:rtl w:val="1"/>
+                <w:rFonts w:cs="Consolas"/>
+              </w:rPr>
+              <w:t>app/actions-campaigns.ts</w:t>
+            </w:r>
+            <w:r>
+              <w:rPr>
+                <w:rFonts w:ascii="Arial" w:hAnsi="Arial"/>
+                <w:b w:val="0"/>
+                <w:sz w:val="20"/>
+                <w:rtl w:val="1"/>
+                <w:rFonts w:cs="Arial"/>
+              </w:rPr>
+              <w:t xml:space="preserve">, </w:t>
+            </w:r>
+            <w:r>
+              <w:rPr>
+                <w:rFonts w:ascii="Consolas" w:hAnsi="Consolas"/>
+                <w:b w:val="0"/>
+                <w:color w:val="B02A37"/>
+                <w:sz w:val="20"/>
+                <w:rtl w:val="1"/>
+                <w:rFonts w:cs="Consolas"/>
+              </w:rPr>
+              <w:t>app/api/cron/variant-metrics</w:t>
+            </w:r>
+          </w:p>
+        </w:tc>
+      </w:tr>
+      <w:tr>
+        <w:tc>
+          <w:tcPr>
+            <w:tcW w:type="dxa" w:w="4320"/>
+          </w:tcPr>
+          <w:p>
+            <w:pPr>
+              <w:bidi w:val="1"/>
+              <w:jc w:val="right"/>
+            </w:pPr>
+            <w:r>
+              <w:rPr>
+                <w:rFonts w:ascii="Arial" w:hAnsi="Arial"/>
+                <w:b/>
+                <w:sz w:val="20"/>
+                <w:rtl w:val="1"/>
+                <w:rFonts w:cs="Arial"/>
+              </w:rPr>
               <w:t>🏆 בחירת-מנצח אוטומטית 🆕</w:t>
             </w:r>
             <w:r>
@@ -13254,7 +13552,27 @@
                 <w:rtl w:val="1"/>
                 <w:rFonts w:cs="Arial"/>
               </w:rPr>
-              <w:t xml:space="preserve"> לפי ביצועים (conversions&gt;clicks&gt;impressions), ובהיעדר דאטה — לפי ציון-אנושיות</w:t>
+              <w:t xml:space="preserve"> לפי ביצועים </w:t>
+            </w:r>
+            <w:r>
+              <w:rPr>
+                <w:rFonts w:ascii="Arial" w:hAnsi="Arial"/>
+                <w:b/>
+                <w:sz w:val="20"/>
+                <w:rtl w:val="1"/>
+                <w:rFonts w:cs="Arial"/>
+              </w:rPr>
+              <w:t>אמיתיים</w:t>
+            </w:r>
+            <w:r>
+              <w:rPr>
+                <w:rFonts w:ascii="Arial" w:hAnsi="Arial"/>
+                <w:b w:val="0"/>
+                <w:sz w:val="20"/>
+                <w:rtl w:val="1"/>
+                <w:rFonts w:cs="Arial"/>
+              </w:rPr>
+              <w:t xml:space="preserve"> (conversions&gt;clicks&gt;views&gt;impressions), ובהיעדר דאטה — לפי ציון-אנושיות</w:t>
             </w:r>
           </w:p>
         </w:tc>

</xml_diff>

<commit_message>
docs: campaign engine §2.8 + Campaigns UX audit + dashboards connection
</commit_message>
<xml_diff>
--- a/PRODUCTS/01-marketing-ops-hub.docx
+++ b/PRODUCTS/01-marketing-ops-hub.docx
@@ -14753,7 +14753,1007 @@
           </w:p>
         </w:tc>
       </w:tr>
+      <w:tr>
+        <w:tc>
+          <w:tcPr>
+            <w:tcW w:type="dxa" w:w="2880"/>
+          </w:tcPr>
+          <w:p>
+            <w:pPr>
+              <w:bidi w:val="1"/>
+              <w:jc w:val="right"/>
+            </w:pPr>
+            <w:r>
+              <w:rPr>
+                <w:rFonts w:ascii="Arial" w:hAnsi="Arial"/>
+                <w:b/>
+                <w:sz w:val="20"/>
+                <w:rtl w:val="1"/>
+                <w:rFonts w:cs="Arial"/>
+              </w:rPr>
+              <w:t>קמפיינים — creds חיצוניים</w:t>
+            </w:r>
+          </w:p>
+        </w:tc>
+        <w:tc>
+          <w:tcPr>
+            <w:tcW w:type="dxa" w:w="2880"/>
+          </w:tcPr>
+          <w:p>
+            <w:pPr>
+              <w:bidi w:val="1"/>
+              <w:jc w:val="right"/>
+            </w:pPr>
+            <w:r>
+              <w:rPr>
+                <w:rFonts w:ascii="Arial" w:hAnsi="Arial"/>
+                <w:b w:val="0"/>
+                <w:sz w:val="20"/>
+                <w:rtl w:val="1"/>
+                <w:rFonts w:cs="Arial"/>
+              </w:rPr>
+              <w:t>קוד מוכן</w:t>
+            </w:r>
+          </w:p>
+        </w:tc>
+        <w:tc>
+          <w:tcPr>
+            <w:tcW w:type="dxa" w:w="2880"/>
+          </w:tcPr>
+          <w:p>
+            <w:pPr>
+              <w:bidi w:val="1"/>
+              <w:jc w:val="right"/>
+            </w:pPr>
+            <w:r>
+              <w:rPr>
+                <w:rFonts w:ascii="Arial" w:hAnsi="Arial"/>
+                <w:b w:val="0"/>
+                <w:sz w:val="20"/>
+                <w:rtl w:val="1"/>
+                <w:rFonts w:cs="Arial"/>
+              </w:rPr>
+              <w:t>Meta Ads (</w:t>
+            </w:r>
+            <w:r>
+              <w:rPr>
+                <w:rFonts w:ascii="Consolas" w:hAnsi="Consolas"/>
+                <w:b w:val="0"/>
+                <w:color w:val="B02A37"/>
+                <w:sz w:val="20"/>
+                <w:rtl w:val="1"/>
+                <w:rFonts w:cs="Consolas"/>
+              </w:rPr>
+              <w:t>FB_ADS_TOKEN</w:t>
+            </w:r>
+            <w:r>
+              <w:rPr>
+                <w:rFonts w:ascii="Arial" w:hAnsi="Arial"/>
+                <w:b w:val="0"/>
+                <w:sz w:val="20"/>
+                <w:rtl w:val="1"/>
+                <w:rFonts w:cs="Arial"/>
+              </w:rPr>
+              <w:t>/</w:t>
+            </w:r>
+            <w:r>
+              <w:rPr>
+                <w:rFonts w:ascii="Consolas" w:hAnsi="Consolas"/>
+                <w:b w:val="0"/>
+                <w:color w:val="B02A37"/>
+                <w:sz w:val="20"/>
+                <w:rtl w:val="1"/>
+                <w:rFonts w:cs="Consolas"/>
+              </w:rPr>
+              <w:t>FB_AD_ACCOUNT_ID</w:t>
+            </w:r>
+            <w:r>
+              <w:rPr>
+                <w:rFonts w:ascii="Arial" w:hAnsi="Arial"/>
+                <w:b w:val="0"/>
+                <w:sz w:val="20"/>
+                <w:rtl w:val="1"/>
+                <w:rFonts w:cs="Arial"/>
+              </w:rPr>
+              <w:t>/</w:t>
+            </w:r>
+            <w:r>
+              <w:rPr>
+                <w:rFonts w:ascii="Consolas" w:hAnsi="Consolas"/>
+                <w:b w:val="0"/>
+                <w:color w:val="B02A37"/>
+                <w:sz w:val="20"/>
+                <w:rtl w:val="1"/>
+                <w:rFonts w:cs="Consolas"/>
+              </w:rPr>
+              <w:t>FB_PAGE_ID</w:t>
+            </w:r>
+            <w:r>
+              <w:rPr>
+                <w:rFonts w:ascii="Arial" w:hAnsi="Arial"/>
+                <w:b w:val="0"/>
+                <w:sz w:val="20"/>
+                <w:rtl w:val="1"/>
+                <w:rFonts w:cs="Arial"/>
+              </w:rPr>
+              <w:t xml:space="preserve">, הרשאות </w:t>
+            </w:r>
+            <w:r>
+              <w:rPr>
+                <w:rFonts w:ascii="Consolas" w:hAnsi="Consolas"/>
+                <w:b w:val="0"/>
+                <w:color w:val="B02A37"/>
+                <w:sz w:val="20"/>
+                <w:rtl w:val="1"/>
+                <w:rFonts w:cs="Consolas"/>
+              </w:rPr>
+              <w:t>ads_read</w:t>
+            </w:r>
+            <w:r>
+              <w:rPr>
+                <w:rFonts w:ascii="Arial" w:hAnsi="Arial"/>
+                <w:b w:val="0"/>
+                <w:sz w:val="20"/>
+                <w:rtl w:val="1"/>
+                <w:rFonts w:cs="Arial"/>
+              </w:rPr>
+              <w:t>/</w:t>
+            </w:r>
+            <w:r>
+              <w:rPr>
+                <w:rFonts w:ascii="Consolas" w:hAnsi="Consolas"/>
+                <w:b w:val="0"/>
+                <w:color w:val="B02A37"/>
+                <w:sz w:val="20"/>
+                <w:rtl w:val="1"/>
+                <w:rFonts w:cs="Consolas"/>
+              </w:rPr>
+              <w:t>read_insights</w:t>
+            </w:r>
+            <w:r>
+              <w:rPr>
+                <w:rFonts w:ascii="Arial" w:hAnsi="Arial"/>
+                <w:b w:val="0"/>
+                <w:sz w:val="20"/>
+                <w:rtl w:val="1"/>
+                <w:rFonts w:cs="Arial"/>
+              </w:rPr>
+              <w:t xml:space="preserve">) לממומן+insights · TikTok/YouTube </w:t>
+            </w:r>
+            <w:r>
+              <w:rPr>
+                <w:rFonts w:ascii="Consolas" w:hAnsi="Consolas"/>
+                <w:b w:val="0"/>
+                <w:color w:val="B02A37"/>
+                <w:sz w:val="20"/>
+                <w:rtl w:val="1"/>
+                <w:rFonts w:cs="Consolas"/>
+              </w:rPr>
+              <w:t>access_token</w:t>
+            </w:r>
+            <w:r>
+              <w:rPr>
+                <w:rFonts w:ascii="Arial" w:hAnsi="Arial"/>
+                <w:b w:val="0"/>
+                <w:sz w:val="20"/>
+                <w:rtl w:val="1"/>
+                <w:rFonts w:cs="Arial"/>
+              </w:rPr>
+              <w:t xml:space="preserve"> לצפיות · הרצת </w:t>
+            </w:r>
+            <w:r>
+              <w:rPr>
+                <w:rFonts w:ascii="Consolas" w:hAnsi="Consolas"/>
+                <w:b w:val="0"/>
+                <w:color w:val="B02A37"/>
+                <w:sz w:val="20"/>
+                <w:rtl w:val="1"/>
+                <w:rFonts w:cs="Consolas"/>
+              </w:rPr>
+              <w:t>migration-v15.sql</w:t>
+            </w:r>
+            <w:r>
+              <w:rPr>
+                <w:rFonts w:ascii="Arial" w:hAnsi="Arial"/>
+                <w:b w:val="0"/>
+                <w:sz w:val="20"/>
+                <w:rtl w:val="1"/>
+                <w:rFonts w:cs="Arial"/>
+              </w:rPr>
+              <w:t xml:space="preserve"> · </w:t>
+            </w:r>
+            <w:r>
+              <w:rPr>
+                <w:rFonts w:ascii="Consolas" w:hAnsi="Consolas"/>
+                <w:b w:val="0"/>
+                <w:color w:val="B02A37"/>
+                <w:sz w:val="20"/>
+                <w:rtl w:val="1"/>
+                <w:rFonts w:cs="Consolas"/>
+              </w:rPr>
+              <w:t>EXPORT_SECRET</w:t>
+            </w:r>
+            <w:r>
+              <w:rPr>
+                <w:rFonts w:ascii="Arial" w:hAnsi="Arial"/>
+                <w:b w:val="0"/>
+                <w:sz w:val="20"/>
+                <w:rtl w:val="1"/>
+                <w:rFonts w:cs="Arial"/>
+              </w:rPr>
+              <w:t xml:space="preserve"> לחיבור-דשבורדים</w:t>
+            </w:r>
+          </w:p>
+        </w:tc>
+      </w:tr>
+      <w:tr>
+        <w:tc>
+          <w:tcPr>
+            <w:tcW w:type="dxa" w:w="2880"/>
+          </w:tcPr>
+          <w:p>
+            <w:pPr>
+              <w:bidi w:val="1"/>
+              <w:jc w:val="right"/>
+            </w:pPr>
+            <w:r>
+              <w:rPr>
+                <w:rFonts w:ascii="Arial" w:hAnsi="Arial"/>
+                <w:b/>
+                <w:sz w:val="20"/>
+                <w:rtl w:val="1"/>
+                <w:rFonts w:cs="Arial"/>
+              </w:rPr>
+              <w:t>קמפיינים — UX ממותג</w:t>
+            </w:r>
+          </w:p>
+        </w:tc>
+        <w:tc>
+          <w:tcPr>
+            <w:tcW w:type="dxa" w:w="2880"/>
+          </w:tcPr>
+          <w:p>
+            <w:pPr>
+              <w:bidi w:val="1"/>
+              <w:jc w:val="right"/>
+            </w:pPr>
+            <w:r>
+              <w:rPr>
+                <w:rFonts w:ascii="Arial" w:hAnsi="Arial"/>
+                <w:b w:val="0"/>
+                <w:sz w:val="20"/>
+                <w:rtl w:val="1"/>
+                <w:rFonts w:cs="Arial"/>
+              </w:rPr>
+              <w:t>פונקציונלי</w:t>
+            </w:r>
+          </w:p>
+        </w:tc>
+        <w:tc>
+          <w:tcPr>
+            <w:tcW w:type="dxa" w:w="2880"/>
+          </w:tcPr>
+          <w:p>
+            <w:pPr>
+              <w:bidi w:val="1"/>
+              <w:jc w:val="right"/>
+            </w:pPr>
+            <w:r>
+              <w:rPr>
+                <w:rFonts w:ascii="Arial" w:hAnsi="Arial"/>
+                <w:b w:val="0"/>
+                <w:sz w:val="20"/>
+                <w:rtl w:val="1"/>
+                <w:rFonts w:cs="Arial"/>
+              </w:rPr>
+              <w:t xml:space="preserve">toasts/קונפטי/ConfirmDialog + aria-labels + מובייל (ראה </w:t>
+            </w:r>
+            <w:r>
+              <w:rPr>
+                <w:rFonts w:ascii="Consolas" w:hAnsi="Consolas"/>
+                <w:b w:val="0"/>
+                <w:color w:val="B02A37"/>
+                <w:sz w:val="20"/>
+                <w:rtl w:val="1"/>
+                <w:rFonts w:cs="Consolas"/>
+              </w:rPr>
+              <w:t>HELIX-OPS-UX</w:t>
+            </w:r>
+            <w:r>
+              <w:rPr>
+                <w:rFonts w:ascii="Arial" w:hAnsi="Arial"/>
+                <w:b w:val="0"/>
+                <w:sz w:val="20"/>
+                <w:rtl w:val="1"/>
+                <w:rFonts w:cs="Arial"/>
+              </w:rPr>
+              <w:t xml:space="preserve"> §מודול-קמפיינים)</w:t>
+            </w:r>
+          </w:p>
+        </w:tc>
+      </w:tr>
+      <w:tr>
+        <w:tc>
+          <w:tcPr>
+            <w:tcW w:type="dxa" w:w="2880"/>
+          </w:tcPr>
+          <w:p>
+            <w:pPr>
+              <w:bidi w:val="1"/>
+              <w:jc w:val="right"/>
+            </w:pPr>
+            <w:r>
+              <w:rPr>
+                <w:rFonts w:ascii="Arial" w:hAnsi="Arial"/>
+                <w:b/>
+                <w:sz w:val="20"/>
+                <w:rtl w:val="1"/>
+                <w:rFonts w:cs="Arial"/>
+              </w:rPr>
+              <w:t>קמפיינים — יצירת-קמפיין ממומן מלאה</w:t>
+            </w:r>
+          </w:p>
+        </w:tc>
+        <w:tc>
+          <w:tcPr>
+            <w:tcW w:type="dxa" w:w="2880"/>
+          </w:tcPr>
+          <w:p>
+            <w:pPr>
+              <w:bidi w:val="1"/>
+              <w:jc w:val="right"/>
+            </w:pPr>
+            <w:r>
+              <w:rPr>
+                <w:rFonts w:ascii="Arial" w:hAnsi="Arial"/>
+                <w:b w:val="0"/>
+                <w:sz w:val="20"/>
+                <w:rtl w:val="1"/>
+                <w:rFonts w:cs="Arial"/>
+              </w:rPr>
+              <w:t>creative נוצר</w:t>
+            </w:r>
+          </w:p>
+        </w:tc>
+        <w:tc>
+          <w:tcPr>
+            <w:tcW w:type="dxa" w:w="2880"/>
+          </w:tcPr>
+          <w:p>
+            <w:pPr>
+              <w:bidi w:val="1"/>
+              <w:jc w:val="right"/>
+            </w:pPr>
+            <w:r>
+              <w:rPr>
+                <w:rFonts w:ascii="Arial" w:hAnsi="Arial"/>
+                <w:b w:val="0"/>
+                <w:sz w:val="20"/>
+                <w:rtl w:val="1"/>
+                <w:rFonts w:cs="Arial"/>
+              </w:rPr>
+              <w:t>יצירת campaign/adset עם תקציב ב-Meta (מעבר ל-ad-creative)</w:t>
+            </w:r>
+          </w:p>
+        </w:tc>
+      </w:tr>
     </w:tbl>
+    <w:p>
+      <w:pPr>
+        <w:pStyle w:val="Heading2"/>
+        <w:bidi w:val="1"/>
+        <w:jc w:val="right"/>
+      </w:pPr>
+      <w:r>
+        <w:rPr>
+          <w:rFonts w:ascii="Arial" w:hAnsi="Arial"/>
+          <w:b w:val="0"/>
+          <w:sz w:val="28"/>
+          <w:rtl w:val="1"/>
+          <w:rFonts w:cs="Arial"/>
+        </w:rPr>
+        <w:t>2.8 מנוע הקמפיינים + A/B Testing 🅰️🅱️📣 (2026-07)</w:t>
+      </w:r>
+    </w:p>
+    <w:p>
+      <w:pPr>
+        <w:bidi w:val="1"/>
+        <w:jc w:val="right"/>
+      </w:pPr>
+      <w:r>
+        <w:rPr>
+          <w:rFonts w:ascii="Arial" w:hAnsi="Arial"/>
+          <w:b w:val="0"/>
+          <w:sz w:val="22"/>
+          <w:rtl w:val="1"/>
+          <w:rFonts w:cs="Arial"/>
+        </w:rPr>
+        <w:t xml:space="preserve">מנוע שלם שהופך בריף אחד לקמפיין רב-ערוצי עם A/B מלא — </w:t>
+      </w:r>
+      <w:r>
+        <w:rPr>
+          <w:rFonts w:ascii="Arial" w:hAnsi="Arial"/>
+          <w:b/>
+          <w:sz w:val="22"/>
+          <w:rtl w:val="1"/>
+          <w:rFonts w:cs="Arial"/>
+        </w:rPr>
+        <w:t>נבנה end-to-end</w:t>
+      </w:r>
+      <w:r>
+        <w:rPr>
+          <w:rFonts w:ascii="Arial" w:hAnsi="Arial"/>
+          <w:b w:val="0"/>
+          <w:sz w:val="22"/>
+          <w:rtl w:val="1"/>
+          <w:rFonts w:cs="Arial"/>
+        </w:rPr>
+        <w:t xml:space="preserve"> (typecheck נקי):</w:t>
+      </w:r>
+    </w:p>
+    <w:p>
+      <w:pPr>
+        <w:pStyle w:val="ListBullet"/>
+        <w:bidi w:val="1"/>
+        <w:jc w:val="right"/>
+      </w:pPr>
+      <w:r>
+        <w:rPr>
+          <w:rFonts w:ascii="Arial" w:hAnsi="Arial"/>
+          <w:b/>
+          <w:sz w:val="22"/>
+          <w:rtl w:val="1"/>
+          <w:rFonts w:cs="Arial"/>
+        </w:rPr>
+        <w:t>A/B בקנה-מידה:</w:t>
+      </w:r>
+      <w:r>
+        <w:rPr>
+          <w:rFonts w:ascii="Arial" w:hAnsi="Arial"/>
+          <w:b w:val="0"/>
+          <w:sz w:val="22"/>
+          <w:rtl w:val="1"/>
+          <w:rFonts w:cs="Arial"/>
+        </w:rPr>
+        <w:t xml:space="preserve"> לכל פרסום </w:t>
+      </w:r>
+      <w:r>
+        <w:rPr>
+          <w:rFonts w:ascii="Arial" w:hAnsi="Arial"/>
+          <w:b/>
+          <w:sz w:val="22"/>
+          <w:rtl w:val="1"/>
+          <w:rFonts w:cs="Arial"/>
+        </w:rPr>
+        <w:t>6 סגנונות-שכנוע × 6 וריאציות = עד 36 גרסאות per-ערוץ</w:t>
+      </w:r>
+      <w:r>
+        <w:rPr>
+          <w:rFonts w:ascii="Arial" w:hAnsi="Arial"/>
+          <w:b w:val="0"/>
+          <w:sz w:val="22"/>
+          <w:rtl w:val="1"/>
+          <w:rFonts w:cs="Arial"/>
+        </w:rPr>
+        <w:t xml:space="preserve"> (JSON-batched — יעיל בעלויות).</w:t>
+      </w:r>
+    </w:p>
+    <w:p>
+      <w:pPr>
+        <w:pStyle w:val="ListBullet"/>
+        <w:bidi w:val="1"/>
+        <w:jc w:val="right"/>
+      </w:pPr>
+      <w:r>
+        <w:rPr>
+          <w:rFonts w:ascii="Arial" w:hAnsi="Arial"/>
+          <w:b/>
+          <w:sz w:val="22"/>
+          <w:rtl w:val="1"/>
+          <w:rFonts w:cs="Arial"/>
+        </w:rPr>
+        <w:t>Campaign Builder:</w:t>
+      </w:r>
+      <w:r>
+        <w:rPr>
+          <w:rFonts w:ascii="Arial" w:hAnsi="Arial"/>
+          <w:b w:val="0"/>
+          <w:sz w:val="22"/>
+          <w:rtl w:val="1"/>
+          <w:rFonts w:cs="Arial"/>
+        </w:rPr>
+        <w:t xml:space="preserve"> בריף + </w:t>
+      </w:r>
+      <w:r>
+        <w:rPr>
+          <w:rFonts w:ascii="Arial" w:hAnsi="Arial"/>
+          <w:b/>
+          <w:sz w:val="22"/>
+          <w:rtl w:val="1"/>
+          <w:rFonts w:cs="Arial"/>
+        </w:rPr>
+        <w:t>אפיון-לקוח + תקציב</w:t>
+      </w:r>
+      <w:r>
+        <w:rPr>
+          <w:rFonts w:ascii="Arial" w:hAnsi="Arial"/>
+          <w:b w:val="0"/>
+          <w:sz w:val="22"/>
+          <w:rtl w:val="1"/>
+          <w:rFonts w:cs="Arial"/>
+        </w:rPr>
+        <w:t xml:space="preserve"> → פייסבוק/אינסטגרם/לינקדאין (וריאציות) · Google Ads (RSA) · SEO (תוכנית). תקציב מחולק per-ערוץ.</w:t>
+      </w:r>
+    </w:p>
+    <w:p>
+      <w:pPr>
+        <w:pStyle w:val="ListBullet"/>
+        <w:bidi w:val="1"/>
+        <w:jc w:val="right"/>
+      </w:pPr>
+      <w:r>
+        <w:rPr>
+          <w:rFonts w:ascii="Arial" w:hAnsi="Arial"/>
+          <w:b/>
+          <w:sz w:val="22"/>
+          <w:rtl w:val="1"/>
+          <w:rFonts w:cs="Arial"/>
+        </w:rPr>
+        <w:t>בנייה אינקרמנטלית:</w:t>
+      </w:r>
+      <w:r>
+        <w:rPr>
+          <w:rFonts w:ascii="Arial" w:hAnsi="Arial"/>
+          <w:b w:val="0"/>
+          <w:sz w:val="22"/>
+          <w:rtl w:val="1"/>
+          <w:rFonts w:cs="Arial"/>
+        </w:rPr>
+        <w:t xml:space="preserve"> ערוץ-אחד-בכל-פעם (התוכן מופיע בהדרגה, לא 108 בבת-אחת).</w:t>
+      </w:r>
+    </w:p>
+    <w:p>
+      <w:pPr>
+        <w:pStyle w:val="ListBullet"/>
+        <w:bidi w:val="1"/>
+        <w:jc w:val="right"/>
+      </w:pPr>
+      <w:r>
+        <w:rPr>
+          <w:rFonts w:ascii="Arial" w:hAnsi="Arial"/>
+          <w:b/>
+          <w:sz w:val="22"/>
+          <w:rtl w:val="1"/>
+          <w:rFonts w:cs="Arial"/>
+        </w:rPr>
+        <w:t>פרסום מרובה-גרסאות:</w:t>
+      </w:r>
+      <w:r>
+        <w:rPr>
+          <w:rFonts w:ascii="Arial" w:hAnsi="Arial"/>
+          <w:b w:val="0"/>
+          <w:sz w:val="22"/>
+          <w:rtl w:val="1"/>
+          <w:rFonts w:cs="Arial"/>
+        </w:rPr>
+        <w:t xml:space="preserve"> כמה גרסאות בו-זמנית, ב-</w:t>
+      </w:r>
+      <w:r>
+        <w:rPr>
+          <w:rFonts w:ascii="Arial" w:hAnsi="Arial"/>
+          <w:b/>
+          <w:sz w:val="22"/>
+          <w:rtl w:val="1"/>
+          <w:rFonts w:cs="Arial"/>
+        </w:rPr>
+        <w:t>3 מצבים — אורגני · ממומן (Meta ad-creative) · סרטון</w:t>
+      </w:r>
+      <w:r>
+        <w:rPr>
+          <w:rFonts w:ascii="Arial" w:hAnsi="Arial"/>
+          <w:b w:val="0"/>
+          <w:sz w:val="22"/>
+          <w:rtl w:val="1"/>
+          <w:rFonts w:cs="Arial"/>
+        </w:rPr>
+        <w:t xml:space="preserve"> (Video Studio per-גרסה), בכל פלטפורמה.</w:t>
+      </w:r>
+    </w:p>
+    <w:p>
+      <w:pPr>
+        <w:pStyle w:val="ListBullet"/>
+        <w:bidi w:val="1"/>
+        <w:jc w:val="right"/>
+      </w:pPr>
+      <w:r>
+        <w:rPr>
+          <w:rFonts w:ascii="Arial" w:hAnsi="Arial"/>
+          <w:b/>
+          <w:sz w:val="22"/>
+          <w:rtl w:val="1"/>
+          <w:rFonts w:cs="Arial"/>
+        </w:rPr>
+        <w:t>נתונים אמיתיים per-גרסה:</w:t>
+      </w:r>
+      <w:r>
+        <w:rPr>
+          <w:rFonts w:ascii="Arial" w:hAnsi="Arial"/>
+          <w:b w:val="0"/>
+          <w:sz w:val="22"/>
+          <w:rtl w:val="1"/>
+          <w:rFonts w:cs="Arial"/>
+        </w:rPr>
+        <w:t xml:space="preserve"> צפיות/קליקים/חשיפות מ-Meta/TikTok/YouTube → chips + cron 6ש'.</w:t>
+      </w:r>
+    </w:p>
+    <w:p>
+      <w:pPr>
+        <w:pStyle w:val="ListBullet"/>
+        <w:bidi w:val="1"/>
+        <w:jc w:val="right"/>
+      </w:pPr>
+      <w:r>
+        <w:rPr>
+          <w:rFonts w:ascii="Arial" w:hAnsi="Arial"/>
+          <w:b/>
+          <w:sz w:val="22"/>
+          <w:rtl w:val="1"/>
+          <w:rFonts w:cs="Arial"/>
+        </w:rPr>
+        <w:t>בחירת-מנצח אוטומטית:</w:t>
+      </w:r>
+      <w:r>
+        <w:rPr>
+          <w:rFonts w:ascii="Arial" w:hAnsi="Arial"/>
+          <w:b w:val="0"/>
+          <w:sz w:val="22"/>
+          <w:rtl w:val="1"/>
+          <w:rFonts w:cs="Arial"/>
+        </w:rPr>
+        <w:t xml:space="preserve"> לפי ביצועים אמיתיים (fallback ציון-אנושיות).</w:t>
+      </w:r>
+    </w:p>
+    <w:p>
+      <w:pPr>
+        <w:pStyle w:val="ListBullet"/>
+        <w:bidi w:val="1"/>
+        <w:jc w:val="right"/>
+      </w:pPr>
+      <w:r>
+        <w:rPr>
+          <w:rFonts w:ascii="Arial" w:hAnsi="Arial"/>
+          <w:b/>
+          <w:sz w:val="22"/>
+          <w:rtl w:val="1"/>
+          <w:rFonts w:cs="Arial"/>
+        </w:rPr>
+        <w:t>נגישות בוט מלאה:</w:t>
+      </w:r>
+      <w:r>
+        <w:rPr>
+          <w:rFonts w:ascii="Arial" w:hAnsi="Arial"/>
+          <w:b w:val="0"/>
+          <w:sz w:val="22"/>
+          <w:rtl w:val="1"/>
+          <w:rFonts w:cs="Arial"/>
+        </w:rPr>
+        <w:t xml:space="preserve"> webhook </w:t>
+      </w:r>
+      <w:r>
+        <w:rPr>
+          <w:rFonts w:ascii="Consolas" w:hAnsi="Consolas"/>
+          <w:b w:val="0"/>
+          <w:color w:val="B02A37"/>
+          <w:sz w:val="22"/>
+          <w:rtl w:val="1"/>
+          <w:rFonts w:cs="Consolas"/>
+        </w:rPr>
+        <w:t>/api/bot</w:t>
+      </w:r>
+      <w:r>
+        <w:rPr>
+          <w:rFonts w:ascii="Arial" w:hAnsi="Arial"/>
+          <w:b w:val="0"/>
+          <w:sz w:val="22"/>
+          <w:rtl w:val="1"/>
+          <w:rFonts w:cs="Arial"/>
+        </w:rPr>
+        <w:t xml:space="preserve"> — כל הפונקציות (כולל בניית קמפיין) דרך טלגרם/וואטסאפ/מייל בשפה טבעית.</w:t>
+      </w:r>
+    </w:p>
+    <w:p>
+      <w:pPr>
+        <w:pStyle w:val="ListBullet"/>
+        <w:bidi w:val="1"/>
+        <w:jc w:val="right"/>
+      </w:pPr>
+      <w:r>
+        <w:rPr>
+          <w:rFonts w:ascii="Arial" w:hAnsi="Arial"/>
+          <w:b/>
+          <w:sz w:val="22"/>
+          <w:rtl w:val="1"/>
+          <w:rFonts w:cs="Arial"/>
+        </w:rPr>
+        <w:t>חיבור ל-HELIX DASHBOARDS:</w:t>
+      </w:r>
+      <w:r>
+        <w:rPr>
+          <w:rFonts w:ascii="Arial" w:hAnsi="Arial"/>
+          <w:b w:val="0"/>
+          <w:sz w:val="22"/>
+          <w:rtl w:val="1"/>
+          <w:rFonts w:cs="Arial"/>
+        </w:rPr>
+        <w:t xml:space="preserve"> endpoint </w:t>
+      </w:r>
+      <w:r>
+        <w:rPr>
+          <w:rFonts w:ascii="Consolas" w:hAnsi="Consolas"/>
+          <w:b w:val="0"/>
+          <w:color w:val="B02A37"/>
+          <w:sz w:val="22"/>
+          <w:rtl w:val="1"/>
+          <w:rFonts w:cs="Consolas"/>
+        </w:rPr>
+        <w:t>/api/export/campaign-metrics</w:t>
+      </w:r>
+      <w:r>
+        <w:rPr>
+          <w:rFonts w:ascii="Arial" w:hAnsi="Arial"/>
+          <w:b w:val="0"/>
+          <w:sz w:val="22"/>
+          <w:rtl w:val="1"/>
+          <w:rFonts w:cs="Arial"/>
+        </w:rPr>
+        <w:t xml:space="preserve"> → connector </w:t>
+      </w:r>
+      <w:r>
+        <w:rPr>
+          <w:rFonts w:ascii="Consolas" w:hAnsi="Consolas"/>
+          <w:b w:val="0"/>
+          <w:color w:val="B02A37"/>
+          <w:sz w:val="22"/>
+          <w:rtl w:val="1"/>
+          <w:rFonts w:cs="Consolas"/>
+        </w:rPr>
+        <w:t>helix_ops</w:t>
+      </w:r>
+      <w:r>
+        <w:rPr>
+          <w:rFonts w:ascii="Arial" w:hAnsi="Arial"/>
+          <w:b w:val="0"/>
+          <w:sz w:val="22"/>
+          <w:rtl w:val="1"/>
+          <w:rFonts w:cs="Arial"/>
+        </w:rPr>
+        <w:t xml:space="preserve"> בדשבורדים → template </w:t>
+      </w:r>
+      <w:r>
+        <w:rPr>
+          <w:rFonts w:ascii="Arial" w:hAnsi="Arial"/>
+          <w:b/>
+          <w:sz w:val="22"/>
+          <w:rtl w:val="1"/>
+          <w:rFonts w:cs="Arial"/>
+        </w:rPr>
+        <w:t>"קמפיינים A/B"</w:t>
+      </w:r>
+      <w:r>
+        <w:rPr>
+          <w:rFonts w:ascii="Arial" w:hAnsi="Arial"/>
+          <w:b w:val="0"/>
+          <w:sz w:val="22"/>
+          <w:rtl w:val="1"/>
+          <w:rFonts w:cs="Arial"/>
+        </w:rPr>
+        <w:t xml:space="preserve"> (חשיפות/צפיות/קליקים/גרסאות per-ערוץ). </w:t>
+      </w:r>
+      <w:r>
+        <w:rPr>
+          <w:rFonts w:ascii="Arial" w:hAnsi="Arial"/>
+          <w:b/>
+          <w:sz w:val="22"/>
+          <w:rtl w:val="1"/>
+          <w:rFonts w:cs="Arial"/>
+        </w:rPr>
+        <w:t>A/B נראה בדשבורד ההנהלה.</w:t>
+      </w:r>
+    </w:p>
+    <w:p>
+      <w:pPr>
+        <w:bidi w:val="1"/>
+        <w:jc w:val="right"/>
+      </w:pPr>
+      <w:r>
+        <w:rPr>
+          <w:rFonts w:ascii="Arial" w:hAnsi="Arial"/>
+          <w:b/>
+          <w:sz w:val="22"/>
+          <w:rtl w:val="1"/>
+          <w:rFonts w:cs="Arial"/>
+        </w:rPr>
+        <w:t>קוד:</w:t>
+      </w:r>
+      <w:r>
+        <w:rPr>
+          <w:rFonts w:ascii="Arial" w:hAnsi="Arial"/>
+          <w:b w:val="0"/>
+          <w:sz w:val="22"/>
+          <w:rtl w:val="1"/>
+          <w:rFonts w:cs="Arial"/>
+        </w:rPr>
+        <w:t xml:space="preserve"> </w:t>
+      </w:r>
+      <w:r>
+        <w:rPr>
+          <w:rFonts w:ascii="Consolas" w:hAnsi="Consolas"/>
+          <w:b w:val="0"/>
+          <w:color w:val="B02A37"/>
+          <w:sz w:val="22"/>
+          <w:rtl w:val="1"/>
+          <w:rFonts w:cs="Consolas"/>
+        </w:rPr>
+        <w:t>lib/{content-agent,campaign-agent,campaign-run}.ts</w:t>
+      </w:r>
+      <w:r>
+        <w:rPr>
+          <w:rFonts w:ascii="Arial" w:hAnsi="Arial"/>
+          <w:b w:val="0"/>
+          <w:sz w:val="22"/>
+          <w:rtl w:val="1"/>
+          <w:rFonts w:cs="Arial"/>
+        </w:rPr>
+        <w:t xml:space="preserve">, </w:t>
+      </w:r>
+      <w:r>
+        <w:rPr>
+          <w:rFonts w:ascii="Consolas" w:hAnsi="Consolas"/>
+          <w:b w:val="0"/>
+          <w:color w:val="B02A37"/>
+          <w:sz w:val="22"/>
+          <w:rtl w:val="1"/>
+          <w:rFonts w:cs="Consolas"/>
+        </w:rPr>
+        <w:t>lib/bot/*</w:t>
+      </w:r>
+      <w:r>
+        <w:rPr>
+          <w:rFonts w:ascii="Arial" w:hAnsi="Arial"/>
+          <w:b w:val="0"/>
+          <w:sz w:val="22"/>
+          <w:rtl w:val="1"/>
+          <w:rFonts w:cs="Arial"/>
+        </w:rPr>
+        <w:t xml:space="preserve">, </w:t>
+      </w:r>
+      <w:r>
+        <w:rPr>
+          <w:rFonts w:ascii="Consolas" w:hAnsi="Consolas"/>
+          <w:b w:val="0"/>
+          <w:color w:val="B02A37"/>
+          <w:sz w:val="22"/>
+          <w:rtl w:val="1"/>
+          <w:rFonts w:cs="Consolas"/>
+        </w:rPr>
+        <w:t>lib/insights/*</w:t>
+      </w:r>
+      <w:r>
+        <w:rPr>
+          <w:rFonts w:ascii="Arial" w:hAnsi="Arial"/>
+          <w:b w:val="0"/>
+          <w:sz w:val="22"/>
+          <w:rtl w:val="1"/>
+          <w:rFonts w:cs="Arial"/>
+        </w:rPr>
+        <w:t xml:space="preserve">, </w:t>
+      </w:r>
+      <w:r>
+        <w:rPr>
+          <w:rFonts w:ascii="Consolas" w:hAnsi="Consolas"/>
+          <w:b w:val="0"/>
+          <w:color w:val="B02A37"/>
+          <w:sz w:val="22"/>
+          <w:rtl w:val="1"/>
+          <w:rFonts w:cs="Consolas"/>
+        </w:rPr>
+        <w:t>lib/distribution/paid.ts</w:t>
+      </w:r>
+      <w:r>
+        <w:rPr>
+          <w:rFonts w:ascii="Arial" w:hAnsi="Arial"/>
+          <w:b w:val="0"/>
+          <w:sz w:val="22"/>
+          <w:rtl w:val="1"/>
+          <w:rFonts w:cs="Arial"/>
+        </w:rPr>
+        <w:t xml:space="preserve">, </w:t>
+      </w:r>
+      <w:r>
+        <w:rPr>
+          <w:rFonts w:ascii="Consolas" w:hAnsi="Consolas"/>
+          <w:b w:val="0"/>
+          <w:color w:val="B02A37"/>
+          <w:sz w:val="22"/>
+          <w:rtl w:val="1"/>
+          <w:rFonts w:cs="Consolas"/>
+        </w:rPr>
+        <w:t>app/actions-campaigns.ts</w:t>
+      </w:r>
+      <w:r>
+        <w:rPr>
+          <w:rFonts w:ascii="Arial" w:hAnsi="Arial"/>
+          <w:b w:val="0"/>
+          <w:sz w:val="22"/>
+          <w:rtl w:val="1"/>
+          <w:rFonts w:cs="Arial"/>
+        </w:rPr>
+        <w:t xml:space="preserve">, </w:t>
+      </w:r>
+      <w:r>
+        <w:rPr>
+          <w:rFonts w:ascii="Consolas" w:hAnsi="Consolas"/>
+          <w:b w:val="0"/>
+          <w:color w:val="B02A37"/>
+          <w:sz w:val="22"/>
+          <w:rtl w:val="1"/>
+          <w:rFonts w:cs="Consolas"/>
+        </w:rPr>
+        <w:t>app/[locale]/campaigns</w:t>
+      </w:r>
+      <w:r>
+        <w:rPr>
+          <w:rFonts w:ascii="Arial" w:hAnsi="Arial"/>
+          <w:b w:val="0"/>
+          <w:sz w:val="22"/>
+          <w:rtl w:val="1"/>
+          <w:rFonts w:cs="Arial"/>
+        </w:rPr>
+        <w:t xml:space="preserve"> (+detail), </w:t>
+      </w:r>
+      <w:r>
+        <w:rPr>
+          <w:rFonts w:ascii="Consolas" w:hAnsi="Consolas"/>
+          <w:b w:val="0"/>
+          <w:color w:val="B02A37"/>
+          <w:sz w:val="22"/>
+          <w:rtl w:val="1"/>
+          <w:rFonts w:cs="Consolas"/>
+        </w:rPr>
+        <w:t>app/api/{bot,export/campaign-metrics,cron/variant-metrics}</w:t>
+      </w:r>
+      <w:r>
+        <w:rPr>
+          <w:rFonts w:ascii="Arial" w:hAnsi="Arial"/>
+          <w:b w:val="0"/>
+          <w:sz w:val="22"/>
+          <w:rtl w:val="1"/>
+          <w:rFonts w:cs="Arial"/>
+        </w:rPr>
+        <w:t xml:space="preserve">, </w:t>
+      </w:r>
+      <w:r>
+        <w:rPr>
+          <w:rFonts w:ascii="Consolas" w:hAnsi="Consolas"/>
+          <w:b w:val="0"/>
+          <w:color w:val="B02A37"/>
+          <w:sz w:val="22"/>
+          <w:rtl w:val="1"/>
+          <w:rFonts w:cs="Consolas"/>
+        </w:rPr>
+        <w:t>supabase/migration-v15-campaigns.sql</w:t>
+      </w:r>
+      <w:r>
+        <w:rPr>
+          <w:rFonts w:ascii="Arial" w:hAnsi="Arial"/>
+          <w:b w:val="0"/>
+          <w:sz w:val="22"/>
+          <w:rtl w:val="1"/>
+          <w:rFonts w:cs="Arial"/>
+        </w:rPr>
+        <w:t>.</w:t>
+      </w:r>
+    </w:p>
     <w:p>
       <w:pPr>
         <w:pStyle w:val="Heading2"/>

</xml_diff>

<commit_message>
docs(marketing-ops): full Meta paid campaign automation
</commit_message>
<xml_diff>
--- a/PRODUCTS/01-marketing-ops-hub.docx
+++ b/PRODUCTS/01-marketing-ops-hub.docx
@@ -15346,7 +15346,7 @@
           <w:rtl w:val="1"/>
           <w:rFonts w:cs="Arial"/>
         </w:rPr>
-        <w:t>3 מצבים — אורגני · ממומן (Meta ad-creative) · סרטון</w:t>
+        <w:t>3 מצבים — אורגני · ממומן · סרטון</w:t>
       </w:r>
       <w:r>
         <w:rPr>
@@ -15357,6 +15357,94 @@
           <w:rFonts w:cs="Arial"/>
         </w:rPr>
         <w:t xml:space="preserve"> (Video Studio per-גרסה), בכל פלטפורמה.</w:t>
+      </w:r>
+    </w:p>
+    <w:p>
+      <w:pPr>
+        <w:pStyle w:val="ListBullet"/>
+        <w:bidi w:val="1"/>
+        <w:jc w:val="right"/>
+      </w:pPr>
+      <w:r>
+        <w:rPr>
+          <w:rFonts w:ascii="Arial" w:hAnsi="Arial"/>
+          <w:b/>
+          <w:sz w:val="22"/>
+          <w:rtl w:val="1"/>
+          <w:rFonts w:cs="Arial"/>
+        </w:rPr>
+        <w:t>אוטומציית-ממומן מלאה ב-Meta 🆕:</w:t>
+      </w:r>
+      <w:r>
+        <w:rPr>
+          <w:rFonts w:ascii="Arial" w:hAnsi="Arial"/>
+          <w:b w:val="0"/>
+          <w:sz w:val="22"/>
+          <w:rtl w:val="1"/>
+          <w:rFonts w:cs="Arial"/>
+        </w:rPr>
+        <w:t xml:space="preserve"> </w:t>
+      </w:r>
+      <w:r>
+        <w:rPr>
+          <w:rFonts w:ascii="Consolas" w:hAnsi="Consolas"/>
+          <w:b w:val="0"/>
+          <w:color w:val="B02A37"/>
+          <w:sz w:val="22"/>
+          <w:rtl w:val="1"/>
+          <w:rFonts w:cs="Consolas"/>
+        </w:rPr>
+        <w:t>createMetaCampaign</w:t>
+      </w:r>
+      <w:r>
+        <w:rPr>
+          <w:rFonts w:ascii="Arial" w:hAnsi="Arial"/>
+          <w:b w:val="0"/>
+          <w:sz w:val="22"/>
+          <w:rtl w:val="1"/>
+          <w:rFonts w:cs="Arial"/>
+        </w:rPr>
+        <w:t xml:space="preserve"> בונה את כל ההיררכיה — </w:t>
+      </w:r>
+      <w:r>
+        <w:rPr>
+          <w:rFonts w:ascii="Arial" w:hAnsi="Arial"/>
+          <w:b/>
+          <w:sz w:val="22"/>
+          <w:rtl w:val="1"/>
+          <w:rFonts w:cs="Arial"/>
+        </w:rPr>
+        <w:t>Campaign → Ad Set (תקציב יומי + targeting + optimization) → Ad per-גרסה (A/B)</w:t>
+      </w:r>
+      <w:r>
+        <w:rPr>
+          <w:rFonts w:ascii="Arial" w:hAnsi="Arial"/>
+          <w:b w:val="0"/>
+          <w:sz w:val="22"/>
+          <w:rtl w:val="1"/>
+          <w:rFonts w:cs="Arial"/>
+        </w:rPr>
+        <w:t xml:space="preserve">. נוצר </w:t>
+      </w:r>
+      <w:r>
+        <w:rPr>
+          <w:rFonts w:ascii="Arial" w:hAnsi="Arial"/>
+          <w:b/>
+          <w:sz w:val="22"/>
+          <w:rtl w:val="1"/>
+          <w:rFonts w:cs="Arial"/>
+        </w:rPr>
+        <w:t>PAUSED</w:t>
+      </w:r>
+      <w:r>
+        <w:rPr>
+          <w:rFonts w:ascii="Arial" w:hAnsi="Arial"/>
+          <w:b w:val="0"/>
+          <w:sz w:val="22"/>
+          <w:rtl w:val="1"/>
+          <w:rFonts w:cs="Arial"/>
+        </w:rPr>
+        <w:t xml:space="preserve"> (בטיחות — HELIX לא מוציא כסף לבד; המשתמש מפעיל ב-Ads Manager). כפתור "🚀 השק קמפיין ממומן" + שדות תקציב/objective. סוגר את הפער מול PowerAds.</w:t>
       </w:r>
     </w:p>
     <w:p>

</xml_diff>

<commit_message>
docs(marketing-ops): audience segmentation + autonomous budget loop
</commit_message>
<xml_diff>
--- a/PRODUCTS/01-marketing-ops-hub.docx
+++ b/PRODUCTS/01-marketing-ops-hub.docx
@@ -15444,7 +15444,143 @@
           <w:rtl w:val="1"/>
           <w:rFonts w:cs="Arial"/>
         </w:rPr>
-        <w:t xml:space="preserve"> (בטיחות — HELIX לא מוציא כסף לבד; המשתמש מפעיל ב-Ads Manager). כפתור "🚀 השק קמפיין ממומן" + שדות תקציב/objective. סוגר את הפער מול PowerAds.</w:t>
+        <w:t xml:space="preserve"> (בטיחות — HELIX לא מוציא כסף לבד; המשתמש מפעיל ב-Ads Manager). כפתור "🚀 השק קמפיין ממומן" + שדות תקציב/objective.</w:t>
+      </w:r>
+    </w:p>
+    <w:p>
+      <w:pPr>
+        <w:pStyle w:val="ListBullet"/>
+        <w:bidi w:val="1"/>
+        <w:jc w:val="right"/>
+      </w:pPr>
+      <w:r>
+        <w:rPr>
+          <w:rFonts w:ascii="Arial" w:hAnsi="Arial"/>
+          <w:b/>
+          <w:sz w:val="22"/>
+          <w:rtl w:val="1"/>
+          <w:rFonts w:cs="Arial"/>
+        </w:rPr>
+        <w:t>פילוח-קהלים אוטומטי (#2) 🆕:</w:t>
+      </w:r>
+      <w:r>
+        <w:rPr>
+          <w:rFonts w:ascii="Arial" w:hAnsi="Arial"/>
+          <w:b w:val="0"/>
+          <w:sz w:val="22"/>
+          <w:rtl w:val="1"/>
+          <w:rFonts w:cs="Arial"/>
+        </w:rPr>
+        <w:t xml:space="preserve"> </w:t>
+      </w:r>
+      <w:r>
+        <w:rPr>
+          <w:rFonts w:ascii="Consolas" w:hAnsi="Consolas"/>
+          <w:b w:val="0"/>
+          <w:color w:val="B02A37"/>
+          <w:sz w:val="22"/>
+          <w:rtl w:val="1"/>
+          <w:rFonts w:cs="Consolas"/>
+        </w:rPr>
+        <w:t>suggestAudiences</w:t>
+      </w:r>
+      <w:r>
+        <w:rPr>
+          <w:rFonts w:ascii="Arial" w:hAnsi="Arial"/>
+          <w:b w:val="0"/>
+          <w:sz w:val="22"/>
+          <w:rtl w:val="1"/>
+          <w:rFonts w:cs="Arial"/>
+        </w:rPr>
+        <w:t xml:space="preserve"> (AI) מציע קהלי-יעד שונים (targeting geo/גיל + זווית-מסר), וההשקה יוצרת </w:t>
+      </w:r>
+      <w:r>
+        <w:rPr>
+          <w:rFonts w:ascii="Arial" w:hAnsi="Arial"/>
+          <w:b/>
+          <w:sz w:val="22"/>
+          <w:rtl w:val="1"/>
+          <w:rFonts w:cs="Arial"/>
+        </w:rPr>
+        <w:t>Ad Set נפרד per-קהל</w:t>
+      </w:r>
+      <w:r>
+        <w:rPr>
+          <w:rFonts w:ascii="Arial" w:hAnsi="Arial"/>
+          <w:b w:val="0"/>
+          <w:sz w:val="22"/>
+          <w:rtl w:val="1"/>
+          <w:rFonts w:cs="Arial"/>
+        </w:rPr>
+        <w:t xml:space="preserve"> (התקציב מתחלק) → "המסר הנכון לכל קהל". כפתור "👥 הצע קהלים".</w:t>
+      </w:r>
+    </w:p>
+    <w:p>
+      <w:pPr>
+        <w:pStyle w:val="ListBullet"/>
+        <w:bidi w:val="1"/>
+        <w:jc w:val="right"/>
+      </w:pPr>
+      <w:r>
+        <w:rPr>
+          <w:rFonts w:ascii="Arial" w:hAnsi="Arial"/>
+          <w:b/>
+          <w:sz w:val="22"/>
+          <w:rtl w:val="1"/>
+          <w:rFonts w:cs="Arial"/>
+        </w:rPr>
+        <w:t>לולאת-תקציב אוטונומית (#4) 🆕:</w:t>
+      </w:r>
+      <w:r>
+        <w:rPr>
+          <w:rFonts w:ascii="Arial" w:hAnsi="Arial"/>
+          <w:b w:val="0"/>
+          <w:sz w:val="22"/>
+          <w:rtl w:val="1"/>
+          <w:rFonts w:cs="Arial"/>
+        </w:rPr>
+        <w:t xml:space="preserve"> cron </w:t>
+      </w:r>
+      <w:r>
+        <w:rPr>
+          <w:rFonts w:ascii="Consolas" w:hAnsi="Consolas"/>
+          <w:b w:val="0"/>
+          <w:color w:val="B02A37"/>
+          <w:sz w:val="22"/>
+          <w:rtl w:val="1"/>
+          <w:rFonts w:cs="Consolas"/>
+        </w:rPr>
+        <w:t>/api/cron/budget-optimizer</w:t>
+      </w:r>
+      <w:r>
+        <w:rPr>
+          <w:rFonts w:ascii="Arial" w:hAnsi="Arial"/>
+          <w:b w:val="0"/>
+          <w:sz w:val="22"/>
+          <w:rtl w:val="1"/>
+          <w:rFonts w:cs="Arial"/>
+        </w:rPr>
+        <w:t xml:space="preserve"> (כל 12ש') — לכל ad-set, כשיש מספיק דאטה, </w:t>
+      </w:r>
+      <w:r>
+        <w:rPr>
+          <w:rFonts w:ascii="Arial" w:hAnsi="Arial"/>
+          <w:b/>
+          <w:sz w:val="22"/>
+          <w:rtl w:val="1"/>
+          <w:rFonts w:cs="Arial"/>
+        </w:rPr>
+        <w:t>משאיר את המנצח (CTR) ומשהה את המפסידים</w:t>
+      </w:r>
+      <w:r>
+        <w:rPr>
+          <w:rFonts w:ascii="Arial" w:hAnsi="Arial"/>
+          <w:b w:val="0"/>
+          <w:sz w:val="22"/>
+          <w:rtl w:val="1"/>
+          <w:rFonts w:cs="Arial"/>
+        </w:rPr>
+        <w:t xml:space="preserve"> → התקציב מתרכז במה שעובד. לא מגדיל הוצאה מעבר לתקציב (בלתי-אפשרי לחרוג). סוגר את כרטיסי PowerAds #2+#4.</w:t>
       </w:r>
     </w:p>
     <w:p>

</xml_diff>

<commit_message>
docs(marketing-ops): landing builder §2.9 + avatars §2.10
</commit_message>
<xml_diff>
--- a/PRODUCTS/01-marketing-ops-hub.docx
+++ b/PRODUCTS/01-marketing-ops-hub.docx
@@ -15782,6 +15782,899 @@
           <w:rFonts w:cs="Arial"/>
         </w:rPr>
         <w:t>A/B נראה בדשבורד ההנהלה.</w:t>
+      </w:r>
+    </w:p>
+    <w:p>
+      <w:pPr>
+        <w:pStyle w:val="Heading2"/>
+        <w:bidi w:val="1"/>
+        <w:jc w:val="right"/>
+      </w:pPr>
+      <w:r>
+        <w:rPr>
+          <w:rFonts w:ascii="Arial" w:hAnsi="Arial"/>
+          <w:b w:val="0"/>
+          <w:sz w:val="28"/>
+          <w:rtl w:val="1"/>
+          <w:rFonts w:cs="Arial"/>
+        </w:rPr>
+        <w:t>2.9 בונה דפי-נחיתה 🖥️ (2026-07)</w:t>
+      </w:r>
+    </w:p>
+    <w:p>
+      <w:pPr>
+        <w:bidi w:val="1"/>
+        <w:jc w:val="right"/>
+      </w:pPr>
+      <w:r>
+        <w:rPr>
+          <w:rFonts w:ascii="Arial" w:hAnsi="Arial"/>
+          <w:b w:val="0"/>
+          <w:sz w:val="22"/>
+          <w:rtl w:val="1"/>
+          <w:rFonts w:cs="Arial"/>
+        </w:rPr>
+        <w:t xml:space="preserve">מנוע דפי-נחיתה מלא — </w:t>
+      </w:r>
+      <w:r>
+        <w:rPr>
+          <w:rFonts w:ascii="Arial" w:hAnsi="Arial"/>
+          <w:b/>
+          <w:sz w:val="22"/>
+          <w:rtl w:val="1"/>
+          <w:rFonts w:cs="Arial"/>
+        </w:rPr>
+        <w:t>נבנה end-to-end</w:t>
+      </w:r>
+      <w:r>
+        <w:rPr>
+          <w:rFonts w:ascii="Arial" w:hAnsi="Arial"/>
+          <w:b w:val="0"/>
+          <w:sz w:val="22"/>
+          <w:rtl w:val="1"/>
+          <w:rFonts w:cs="Arial"/>
+        </w:rPr>
+        <w:t xml:space="preserve"> (typecheck+build נקי):</w:t>
+      </w:r>
+    </w:p>
+    <w:p>
+      <w:pPr>
+        <w:pStyle w:val="ListBullet"/>
+        <w:bidi w:val="1"/>
+        <w:jc w:val="right"/>
+      </w:pPr>
+      <w:r>
+        <w:rPr>
+          <w:rFonts w:ascii="Arial" w:hAnsi="Arial"/>
+          <w:b/>
+          <w:sz w:val="22"/>
+          <w:rtl w:val="1"/>
+          <w:rFonts w:cs="Arial"/>
+        </w:rPr>
+        <w:t>15+ טמפלטים לפי תחום</w:t>
+      </w:r>
+      <w:r>
+        <w:rPr>
+          <w:rFonts w:ascii="Arial" w:hAnsi="Arial"/>
+          <w:b w:val="0"/>
+          <w:sz w:val="22"/>
+          <w:rtl w:val="1"/>
+          <w:rFonts w:cs="Arial"/>
+        </w:rPr>
+        <w:t xml:space="preserve"> (חנות/SaaS/קליניקה/נדל״ן/מסעדה/סוכנות/B2B/סטארטאפ) — ממנף את ה-verticals.</w:t>
+      </w:r>
+    </w:p>
+    <w:p>
+      <w:pPr>
+        <w:pStyle w:val="ListBullet"/>
+        <w:bidi w:val="1"/>
+        <w:jc w:val="right"/>
+      </w:pPr>
+      <w:r>
+        <w:rPr>
+          <w:rFonts w:ascii="Arial" w:hAnsi="Arial"/>
+          <w:b/>
+          <w:sz w:val="22"/>
+          <w:rtl w:val="1"/>
+          <w:rFonts w:cs="Arial"/>
+        </w:rPr>
+        <w:t>כל הבלוקים:</w:t>
+      </w:r>
+      <w:r>
+        <w:rPr>
+          <w:rFonts w:ascii="Arial" w:hAnsi="Arial"/>
+          <w:b w:val="0"/>
+          <w:sz w:val="22"/>
+          <w:rtl w:val="1"/>
+          <w:rFonts w:cs="Arial"/>
+        </w:rPr>
+        <w:t xml:space="preserve"> hero · יתרונות · </w:t>
+      </w:r>
+      <w:r>
+        <w:rPr>
+          <w:rFonts w:ascii="Arial" w:hAnsi="Arial"/>
+          <w:b/>
+          <w:sz w:val="22"/>
+          <w:rtl w:val="1"/>
+          <w:rFonts w:cs="Arial"/>
+        </w:rPr>
+        <w:t>וידאו</w:t>
+      </w:r>
+      <w:r>
+        <w:rPr>
+          <w:rFonts w:ascii="Arial" w:hAnsi="Arial"/>
+          <w:b w:val="0"/>
+          <w:sz w:val="22"/>
+          <w:rtl w:val="1"/>
+          <w:rFonts w:cs="Arial"/>
+        </w:rPr>
+        <w:t xml:space="preserve"> (כולל אווטאר) · עדויות · FAQ · CTA · </w:t>
+      </w:r>
+      <w:r>
+        <w:rPr>
+          <w:rFonts w:ascii="Arial" w:hAnsi="Arial"/>
+          <w:b/>
+          <w:sz w:val="22"/>
+          <w:rtl w:val="1"/>
+          <w:rFonts w:cs="Arial"/>
+        </w:rPr>
+        <w:t>טופס לידים</w:t>
+      </w:r>
+      <w:r>
+        <w:rPr>
+          <w:rFonts w:ascii="Arial" w:hAnsi="Arial"/>
+          <w:b w:val="0"/>
+          <w:sz w:val="22"/>
+          <w:rtl w:val="1"/>
+          <w:rFonts w:cs="Arial"/>
+        </w:rPr>
+        <w:t>.</w:t>
+      </w:r>
+    </w:p>
+    <w:p>
+      <w:pPr>
+        <w:pStyle w:val="ListBullet"/>
+        <w:bidi w:val="1"/>
+        <w:jc w:val="right"/>
+      </w:pPr>
+      <w:r>
+        <w:rPr>
+          <w:rFonts w:ascii="Arial" w:hAnsi="Arial"/>
+          <w:b/>
+          <w:sz w:val="22"/>
+          <w:rtl w:val="1"/>
+          <w:rFonts w:cs="Arial"/>
+        </w:rPr>
+        <w:t>5 סגנונות UX</w:t>
+      </w:r>
+      <w:r>
+        <w:rPr>
+          <w:rFonts w:ascii="Arial" w:hAnsi="Arial"/>
+          <w:b w:val="0"/>
+          <w:sz w:val="22"/>
+          <w:rtl w:val="1"/>
+          <w:rFonts w:cs="Arial"/>
+        </w:rPr>
+        <w:t xml:space="preserve"> (מינימלי/נועז/יוקרתי/כהה/עיתונאי) — theme אחד, מבנה אחד.</w:t>
+      </w:r>
+    </w:p>
+    <w:p>
+      <w:pPr>
+        <w:pStyle w:val="ListBullet"/>
+        <w:bidi w:val="1"/>
+        <w:jc w:val="right"/>
+      </w:pPr>
+      <w:r>
+        <w:rPr>
+          <w:rFonts w:ascii="Arial" w:hAnsi="Arial"/>
+          <w:b/>
+          <w:sz w:val="22"/>
+          <w:rtl w:val="1"/>
+          <w:rFonts w:cs="Arial"/>
+        </w:rPr>
+        <w:t>מילוי-AI</w:t>
+      </w:r>
+      <w:r>
+        <w:rPr>
+          <w:rFonts w:ascii="Arial" w:hAnsi="Arial"/>
+          <w:b w:val="0"/>
+          <w:sz w:val="22"/>
+          <w:rtl w:val="1"/>
+          <w:rFonts w:cs="Arial"/>
+        </w:rPr>
+        <w:t xml:space="preserve"> — הבריף/persona → כל התוכן בעברית אוטומטית.</w:t>
+      </w:r>
+    </w:p>
+    <w:p>
+      <w:pPr>
+        <w:pStyle w:val="ListBullet"/>
+        <w:bidi w:val="1"/>
+        <w:jc w:val="right"/>
+      </w:pPr>
+      <w:r>
+        <w:rPr>
+          <w:rFonts w:ascii="Arial" w:hAnsi="Arial"/>
+          <w:b/>
+          <w:sz w:val="22"/>
+          <w:rtl w:val="1"/>
+          <w:rFonts w:cs="Arial"/>
+        </w:rPr>
+        <w:t>דף ציבורי</w:t>
+      </w:r>
+      <w:r>
+        <w:rPr>
+          <w:rFonts w:ascii="Arial" w:hAnsi="Arial"/>
+          <w:b w:val="0"/>
+          <w:sz w:val="22"/>
+          <w:rtl w:val="1"/>
+          <w:rFonts w:cs="Arial"/>
+        </w:rPr>
+        <w:t xml:space="preserve"> </w:t>
+      </w:r>
+      <w:r>
+        <w:rPr>
+          <w:rFonts w:ascii="Consolas" w:hAnsi="Consolas"/>
+          <w:b w:val="0"/>
+          <w:color w:val="B02A37"/>
+          <w:sz w:val="22"/>
+          <w:rtl w:val="1"/>
+          <w:rFonts w:cs="Consolas"/>
+        </w:rPr>
+        <w:t>/lp/[slug]</w:t>
+      </w:r>
+      <w:r>
+        <w:rPr>
+          <w:rFonts w:ascii="Arial" w:hAnsi="Arial"/>
+          <w:b w:val="0"/>
+          <w:sz w:val="22"/>
+          <w:rtl w:val="1"/>
+          <w:rFonts w:cs="Arial"/>
+        </w:rPr>
+        <w:t xml:space="preserve"> (RTL, מובייל) + </w:t>
+      </w:r>
+      <w:r>
+        <w:rPr>
+          <w:rFonts w:ascii="Arial" w:hAnsi="Arial"/>
+          <w:b/>
+          <w:sz w:val="22"/>
+          <w:rtl w:val="1"/>
+          <w:rFonts w:cs="Arial"/>
+        </w:rPr>
+        <w:t>טופס→attribution</w:t>
+      </w:r>
+      <w:r>
+        <w:rPr>
+          <w:rFonts w:ascii="Arial" w:hAnsi="Arial"/>
+          <w:b w:val="0"/>
+          <w:sz w:val="22"/>
+          <w:rtl w:val="1"/>
+          <w:rFonts w:cs="Arial"/>
+        </w:rPr>
+        <w:t xml:space="preserve"> (</w:t>
+      </w:r>
+      <w:r>
+        <w:rPr>
+          <w:rFonts w:ascii="Consolas" w:hAnsi="Consolas"/>
+          <w:b w:val="0"/>
+          <w:color w:val="B02A37"/>
+          <w:sz w:val="22"/>
+          <w:rtl w:val="1"/>
+          <w:rFonts w:cs="Consolas"/>
+        </w:rPr>
+        <w:t>mkt_visitors</w:t>
+      </w:r>
+      <w:r>
+        <w:rPr>
+          <w:rFonts w:ascii="Arial" w:hAnsi="Arial"/>
+          <w:b w:val="0"/>
+          <w:sz w:val="22"/>
+          <w:rtl w:val="1"/>
+          <w:rFonts w:cs="Arial"/>
+        </w:rPr>
+        <w:t xml:space="preserve">) → </w:t>
+      </w:r>
+      <w:r>
+        <w:rPr>
+          <w:rFonts w:ascii="Arial" w:hAnsi="Arial"/>
+          <w:b/>
+          <w:sz w:val="22"/>
+          <w:rtl w:val="1"/>
+          <w:rFonts w:cs="Arial"/>
+        </w:rPr>
+        <w:t>סוגר לולאת ad→LP→conversion</w:t>
+      </w:r>
+      <w:r>
+        <w:rPr>
+          <w:rFonts w:ascii="Arial" w:hAnsi="Arial"/>
+          <w:b w:val="0"/>
+          <w:sz w:val="22"/>
+          <w:rtl w:val="1"/>
+          <w:rFonts w:cs="Arial"/>
+        </w:rPr>
+        <w:t>.</w:t>
+      </w:r>
+    </w:p>
+    <w:p>
+      <w:pPr>
+        <w:pStyle w:val="ListBullet"/>
+        <w:bidi w:val="1"/>
+        <w:jc w:val="right"/>
+      </w:pPr>
+      <w:r>
+        <w:rPr>
+          <w:rFonts w:ascii="Arial" w:hAnsi="Arial"/>
+          <w:b w:val="0"/>
+          <w:sz w:val="22"/>
+          <w:rtl w:val="1"/>
+          <w:rFonts w:cs="Arial"/>
+        </w:rPr>
+        <w:t>עורך form-based (עריכת בלוקים + סגנון + פרסום + תצוגה).</w:t>
+      </w:r>
+    </w:p>
+    <w:p>
+      <w:pPr>
+        <w:pStyle w:val="ListBullet"/>
+        <w:bidi w:val="1"/>
+        <w:jc w:val="right"/>
+      </w:pPr>
+      <w:r>
+        <w:rPr>
+          <w:rFonts w:ascii="Arial" w:hAnsi="Arial"/>
+          <w:b/>
+          <w:sz w:val="22"/>
+          <w:rtl w:val="1"/>
+          <w:rFonts w:cs="Arial"/>
+        </w:rPr>
+        <w:t>קוד:</w:t>
+      </w:r>
+      <w:r>
+        <w:rPr>
+          <w:rFonts w:ascii="Arial" w:hAnsi="Arial"/>
+          <w:b w:val="0"/>
+          <w:sz w:val="22"/>
+          <w:rtl w:val="1"/>
+          <w:rFonts w:cs="Arial"/>
+        </w:rPr>
+        <w:t xml:space="preserve"> </w:t>
+      </w:r>
+      <w:r>
+        <w:rPr>
+          <w:rFonts w:ascii="Consolas" w:hAnsi="Consolas"/>
+          <w:b w:val="0"/>
+          <w:color w:val="B02A37"/>
+          <w:sz w:val="22"/>
+          <w:rtl w:val="1"/>
+          <w:rFonts w:cs="Consolas"/>
+        </w:rPr>
+        <w:t>lib/landing/*</w:t>
+      </w:r>
+      <w:r>
+        <w:rPr>
+          <w:rFonts w:ascii="Arial" w:hAnsi="Arial"/>
+          <w:b w:val="0"/>
+          <w:sz w:val="22"/>
+          <w:rtl w:val="1"/>
+          <w:rFonts w:cs="Arial"/>
+        </w:rPr>
+        <w:t xml:space="preserve">, </w:t>
+      </w:r>
+      <w:r>
+        <w:rPr>
+          <w:rFonts w:ascii="Consolas" w:hAnsi="Consolas"/>
+          <w:b w:val="0"/>
+          <w:color w:val="B02A37"/>
+          <w:sz w:val="22"/>
+          <w:rtl w:val="1"/>
+          <w:rFonts w:cs="Consolas"/>
+        </w:rPr>
+        <w:t>app/actions-landing.ts</w:t>
+      </w:r>
+      <w:r>
+        <w:rPr>
+          <w:rFonts w:ascii="Arial" w:hAnsi="Arial"/>
+          <w:b w:val="0"/>
+          <w:sz w:val="22"/>
+          <w:rtl w:val="1"/>
+          <w:rFonts w:cs="Arial"/>
+        </w:rPr>
+        <w:t xml:space="preserve">, </w:t>
+      </w:r>
+      <w:r>
+        <w:rPr>
+          <w:rFonts w:ascii="Consolas" w:hAnsi="Consolas"/>
+          <w:b w:val="0"/>
+          <w:color w:val="B02A37"/>
+          <w:sz w:val="22"/>
+          <w:rtl w:val="1"/>
+          <w:rFonts w:cs="Consolas"/>
+        </w:rPr>
+        <w:t>app/lp/[slug]</w:t>
+      </w:r>
+      <w:r>
+        <w:rPr>
+          <w:rFonts w:ascii="Arial" w:hAnsi="Arial"/>
+          <w:b w:val="0"/>
+          <w:sz w:val="22"/>
+          <w:rtl w:val="1"/>
+          <w:rFonts w:cs="Arial"/>
+        </w:rPr>
+        <w:t xml:space="preserve">, </w:t>
+      </w:r>
+      <w:r>
+        <w:rPr>
+          <w:rFonts w:ascii="Consolas" w:hAnsi="Consolas"/>
+          <w:b w:val="0"/>
+          <w:color w:val="B02A37"/>
+          <w:sz w:val="22"/>
+          <w:rtl w:val="1"/>
+          <w:rFonts w:cs="Consolas"/>
+        </w:rPr>
+        <w:t>app/api/lp/[slug]/lead</w:t>
+      </w:r>
+      <w:r>
+        <w:rPr>
+          <w:rFonts w:ascii="Arial" w:hAnsi="Arial"/>
+          <w:b w:val="0"/>
+          <w:sz w:val="22"/>
+          <w:rtl w:val="1"/>
+          <w:rFonts w:cs="Arial"/>
+        </w:rPr>
+        <w:t xml:space="preserve">, </w:t>
+      </w:r>
+      <w:r>
+        <w:rPr>
+          <w:rFonts w:ascii="Consolas" w:hAnsi="Consolas"/>
+          <w:b w:val="0"/>
+          <w:color w:val="B02A37"/>
+          <w:sz w:val="22"/>
+          <w:rtl w:val="1"/>
+          <w:rFonts w:cs="Consolas"/>
+        </w:rPr>
+        <w:t>app/[locale]/landing</w:t>
+      </w:r>
+      <w:r>
+        <w:rPr>
+          <w:rFonts w:ascii="Arial" w:hAnsi="Arial"/>
+          <w:b w:val="0"/>
+          <w:sz w:val="22"/>
+          <w:rtl w:val="1"/>
+          <w:rFonts w:cs="Arial"/>
+        </w:rPr>
+        <w:t xml:space="preserve"> (+editor). </w:t>
+      </w:r>
+      <w:r>
+        <w:rPr>
+          <w:rFonts w:ascii="Arial" w:hAnsi="Arial"/>
+          <w:b/>
+          <w:sz w:val="22"/>
+          <w:rtl w:val="1"/>
+          <w:rFonts w:cs="Arial"/>
+        </w:rPr>
+        <w:t>סוגר כרטיס PowerAds #5.</w:t>
+      </w:r>
+    </w:p>
+    <w:p>
+      <w:pPr>
+        <w:pStyle w:val="Heading2"/>
+        <w:bidi w:val="1"/>
+        <w:jc w:val="right"/>
+      </w:pPr>
+      <w:r>
+        <w:rPr>
+          <w:rFonts w:ascii="Arial" w:hAnsi="Arial"/>
+          <w:b w:val="0"/>
+          <w:sz w:val="28"/>
+          <w:rtl w:val="1"/>
+          <w:rFonts w:cs="Arial"/>
+        </w:rPr>
+        <w:t>2.10 אווטארים / וידאו-AI 🧑🎬 (2026-07)</w:t>
+      </w:r>
+    </w:p>
+    <w:p>
+      <w:pPr>
+        <w:bidi w:val="1"/>
+        <w:jc w:val="right"/>
+      </w:pPr>
+      <w:r>
+        <w:rPr>
+          <w:rFonts w:ascii="Arial" w:hAnsi="Arial"/>
+          <w:b w:val="0"/>
+          <w:sz w:val="22"/>
+          <w:rtl w:val="1"/>
+          <w:rFonts w:cs="Arial"/>
+        </w:rPr>
+        <w:t xml:space="preserve">יצירת סרטוני-אווטאר </w:t>
+      </w:r>
+      <w:r>
+        <w:rPr>
+          <w:rFonts w:ascii="Arial" w:hAnsi="Arial"/>
+          <w:b/>
+          <w:sz w:val="22"/>
+          <w:rtl w:val="1"/>
+          <w:rFonts w:cs="Arial"/>
+        </w:rPr>
+        <w:t>בתוך המערכת</w:t>
+      </w:r>
+      <w:r>
+        <w:rPr>
+          <w:rFonts w:ascii="Arial" w:hAnsi="Arial"/>
+          <w:b w:val="0"/>
+          <w:sz w:val="22"/>
+          <w:rtl w:val="1"/>
+          <w:rFonts w:cs="Arial"/>
+        </w:rPr>
+        <w:t xml:space="preserve"> (לא ייבוא) — הלקוח לוחץ, HELIX קורא ל-API בשרת:</w:t>
+      </w:r>
+    </w:p>
+    <w:p>
+      <w:pPr>
+        <w:pStyle w:val="ListBullet"/>
+        <w:bidi w:val="1"/>
+        <w:jc w:val="right"/>
+      </w:pPr>
+      <w:r>
+        <w:rPr>
+          <w:rFonts w:ascii="Arial" w:hAnsi="Arial"/>
+          <w:b/>
+          <w:sz w:val="22"/>
+          <w:rtl w:val="1"/>
+          <w:rFonts w:cs="Arial"/>
+        </w:rPr>
+        <w:t>ספקים:</w:t>
+      </w:r>
+      <w:r>
+        <w:rPr>
+          <w:rFonts w:ascii="Arial" w:hAnsi="Arial"/>
+          <w:b w:val="0"/>
+          <w:sz w:val="22"/>
+          <w:rtl w:val="1"/>
+          <w:rFonts w:cs="Arial"/>
+        </w:rPr>
+        <w:t xml:space="preserve"> </w:t>
+      </w:r>
+      <w:r>
+        <w:rPr>
+          <w:rFonts w:ascii="Arial" w:hAnsi="Arial"/>
+          <w:b/>
+          <w:sz w:val="22"/>
+          <w:rtl w:val="1"/>
+          <w:rFonts w:cs="Arial"/>
+        </w:rPr>
+        <w:t>HeyGen</w:t>
+      </w:r>
+      <w:r>
+        <w:rPr>
+          <w:rFonts w:ascii="Arial" w:hAnsi="Arial"/>
+          <w:b w:val="0"/>
+          <w:sz w:val="22"/>
+          <w:rtl w:val="1"/>
+          <w:rFonts w:cs="Arial"/>
+        </w:rPr>
+        <w:t xml:space="preserve"> (איכות) · </w:t>
+      </w:r>
+      <w:r>
+        <w:rPr>
+          <w:rFonts w:ascii="Arial" w:hAnsi="Arial"/>
+          <w:b/>
+          <w:sz w:val="22"/>
+          <w:rtl w:val="1"/>
+          <w:rFonts w:cs="Arial"/>
+        </w:rPr>
+        <w:t>D-ID</w:t>
+      </w:r>
+      <w:r>
+        <w:rPr>
+          <w:rFonts w:ascii="Arial" w:hAnsi="Arial"/>
+          <w:b w:val="0"/>
+          <w:sz w:val="22"/>
+          <w:rtl w:val="1"/>
+          <w:rFonts w:cs="Arial"/>
+        </w:rPr>
+        <w:t xml:space="preserve"> (זול, + קול </w:t>
+      </w:r>
+      <w:r>
+        <w:rPr>
+          <w:rFonts w:ascii="Arial" w:hAnsi="Arial"/>
+          <w:b/>
+          <w:sz w:val="22"/>
+          <w:rtl w:val="1"/>
+          <w:rFonts w:cs="Arial"/>
+        </w:rPr>
+        <w:t>ElevenLabs</w:t>
+      </w:r>
+      <w:r>
+        <w:rPr>
+          <w:rFonts w:ascii="Arial" w:hAnsi="Arial"/>
+          <w:b w:val="0"/>
+          <w:sz w:val="22"/>
+          <w:rtl w:val="1"/>
+          <w:rFonts w:cs="Arial"/>
+        </w:rPr>
+        <w:t xml:space="preserve"> לעברית). Runway/Kling ל-b-roll (עתידי).</w:t>
+      </w:r>
+    </w:p>
+    <w:p>
+      <w:pPr>
+        <w:pStyle w:val="ListBullet"/>
+        <w:bidi w:val="1"/>
+        <w:jc w:val="right"/>
+      </w:pPr>
+      <w:r>
+        <w:rPr>
+          <w:rFonts w:ascii="Arial" w:hAnsi="Arial"/>
+          <w:b/>
+          <w:sz w:val="22"/>
+          <w:rtl w:val="1"/>
+          <w:rFonts w:cs="Arial"/>
+        </w:rPr>
+        <w:t>Hybrid BYOK/Managed:</w:t>
+      </w:r>
+      <w:r>
+        <w:rPr>
+          <w:rFonts w:ascii="Arial" w:hAnsi="Arial"/>
+          <w:b w:val="0"/>
+          <w:sz w:val="22"/>
+          <w:rtl w:val="1"/>
+          <w:rFonts w:cs="Arial"/>
+        </w:rPr>
+        <w:t xml:space="preserve"> מפתח הלקוח (BYOK) גובר; אחרת מפתח HELIX (managed) + </w:t>
+      </w:r>
+      <w:r>
+        <w:rPr>
+          <w:rFonts w:ascii="Arial" w:hAnsi="Arial"/>
+          <w:b/>
+          <w:sz w:val="22"/>
+          <w:rtl w:val="1"/>
+          <w:rFonts w:cs="Arial"/>
+        </w:rPr>
+        <w:t>ספירת שימוש לחיוב</w:t>
+      </w:r>
+      <w:r>
+        <w:rPr>
+          <w:rFonts w:ascii="Arial" w:hAnsi="Arial"/>
+          <w:b w:val="0"/>
+          <w:sz w:val="22"/>
+          <w:rtl w:val="1"/>
+          <w:rFonts w:cs="Arial"/>
+        </w:rPr>
+        <w:t xml:space="preserve"> (</w:t>
+      </w:r>
+      <w:r>
+        <w:rPr>
+          <w:rFonts w:ascii="Consolas" w:hAnsi="Consolas"/>
+          <w:b w:val="0"/>
+          <w:color w:val="B02A37"/>
+          <w:sz w:val="22"/>
+          <w:rtl w:val="1"/>
+          <w:rFonts w:cs="Consolas"/>
+        </w:rPr>
+        <w:t>avatar_usage</w:t>
+      </w:r>
+      <w:r>
+        <w:rPr>
+          <w:rFonts w:ascii="Arial" w:hAnsi="Arial"/>
+          <w:b w:val="0"/>
+          <w:sz w:val="22"/>
+          <w:rtl w:val="1"/>
+          <w:rFonts w:cs="Arial"/>
+        </w:rPr>
+        <w:t>).</w:t>
+      </w:r>
+    </w:p>
+    <w:p>
+      <w:pPr>
+        <w:pStyle w:val="ListBullet"/>
+        <w:bidi w:val="1"/>
+        <w:jc w:val="right"/>
+      </w:pPr>
+      <w:r>
+        <w:rPr>
+          <w:rFonts w:ascii="Arial" w:hAnsi="Arial"/>
+          <w:b/>
+          <w:sz w:val="22"/>
+          <w:rtl w:val="1"/>
+          <w:rFonts w:cs="Arial"/>
+        </w:rPr>
+        <w:t>זרימה:</w:t>
+      </w:r>
+      <w:r>
+        <w:rPr>
+          <w:rFonts w:ascii="Arial" w:hAnsi="Arial"/>
+          <w:b w:val="0"/>
+          <w:sz w:val="22"/>
+          <w:rtl w:val="1"/>
+          <w:rFonts w:cs="Arial"/>
+        </w:rPr>
+        <w:t xml:space="preserve"> גרסה→סקריפט→API→job→</w:t>
+      </w:r>
+      <w:r>
+        <w:rPr>
+          <w:rFonts w:ascii="Consolas" w:hAnsi="Consolas"/>
+          <w:b w:val="0"/>
+          <w:color w:val="B02A37"/>
+          <w:sz w:val="22"/>
+          <w:rtl w:val="1"/>
+          <w:rFonts w:cs="Consolas"/>
+        </w:rPr>
+        <w:t>avatar-poll</w:t>
+      </w:r>
+      <w:r>
+        <w:rPr>
+          <w:rFonts w:ascii="Arial" w:hAnsi="Arial"/>
+          <w:b w:val="0"/>
+          <w:sz w:val="22"/>
+          <w:rtl w:val="1"/>
+          <w:rFonts w:cs="Arial"/>
+        </w:rPr>
+        <w:t xml:space="preserve"> (cron 2 דק')→</w:t>
+      </w:r>
+      <w:r>
+        <w:rPr>
+          <w:rFonts w:ascii="Consolas" w:hAnsi="Consolas"/>
+          <w:b w:val="0"/>
+          <w:color w:val="B02A37"/>
+          <w:sz w:val="22"/>
+          <w:rtl w:val="1"/>
+          <w:rFonts w:cs="Consolas"/>
+        </w:rPr>
+        <w:t>content_variants.video_url</w:t>
+      </w:r>
+      <w:r>
+        <w:rPr>
+          <w:rFonts w:ascii="Arial" w:hAnsi="Arial"/>
+          <w:b w:val="0"/>
+          <w:sz w:val="22"/>
+          <w:rtl w:val="1"/>
+          <w:rFonts w:cs="Arial"/>
+        </w:rPr>
+        <w:t xml:space="preserve"> → </w:t>
+      </w:r>
+      <w:r>
+        <w:rPr>
+          <w:rFonts w:ascii="Arial" w:hAnsi="Arial"/>
+          <w:b/>
+          <w:sz w:val="22"/>
+          <w:rtl w:val="1"/>
+          <w:rFonts w:cs="Arial"/>
+        </w:rPr>
+        <w:t>מתחבר לפרסום-וידאו + variant-metrics שכבר קיימים</w:t>
+      </w:r>
+      <w:r>
+        <w:rPr>
+          <w:rFonts w:ascii="Arial" w:hAnsi="Arial"/>
+          <w:b w:val="0"/>
+          <w:sz w:val="22"/>
+          <w:rtl w:val="1"/>
+          <w:rFonts w:cs="Arial"/>
+        </w:rPr>
+        <w:t>.</w:t>
+      </w:r>
+    </w:p>
+    <w:p>
+      <w:pPr>
+        <w:pStyle w:val="ListBullet"/>
+        <w:bidi w:val="1"/>
+        <w:jc w:val="right"/>
+      </w:pPr>
+      <w:r>
+        <w:rPr>
+          <w:rFonts w:ascii="Arial" w:hAnsi="Arial"/>
+          <w:b/>
+          <w:sz w:val="22"/>
+          <w:rtl w:val="1"/>
+          <w:rFonts w:cs="Arial"/>
+        </w:rPr>
+        <w:t>עלות מבוקרת:</w:t>
+      </w:r>
+      <w:r>
+        <w:rPr>
+          <w:rFonts w:ascii="Arial" w:hAnsi="Arial"/>
+          <w:b w:val="0"/>
+          <w:sz w:val="22"/>
+          <w:rtl w:val="1"/>
+          <w:rFonts w:cs="Arial"/>
+        </w:rPr>
+        <w:t xml:space="preserve"> מייצרים רק לגרסאות נבחרות (לא ל-36).</w:t>
+      </w:r>
+    </w:p>
+    <w:p>
+      <w:pPr>
+        <w:pStyle w:val="ListBullet"/>
+        <w:bidi w:val="1"/>
+        <w:jc w:val="right"/>
+      </w:pPr>
+      <w:r>
+        <w:rPr>
+          <w:rFonts w:ascii="Arial" w:hAnsi="Arial"/>
+          <w:b/>
+          <w:sz w:val="22"/>
+          <w:rtl w:val="1"/>
+          <w:rFonts w:cs="Arial"/>
+        </w:rPr>
+        <w:t>קוד:</w:t>
+      </w:r>
+      <w:r>
+        <w:rPr>
+          <w:rFonts w:ascii="Arial" w:hAnsi="Arial"/>
+          <w:b w:val="0"/>
+          <w:sz w:val="22"/>
+          <w:rtl w:val="1"/>
+          <w:rFonts w:cs="Arial"/>
+        </w:rPr>
+        <w:t xml:space="preserve"> </w:t>
+      </w:r>
+      <w:r>
+        <w:rPr>
+          <w:rFonts w:ascii="Consolas" w:hAnsi="Consolas"/>
+          <w:b w:val="0"/>
+          <w:color w:val="B02A37"/>
+          <w:sz w:val="22"/>
+          <w:rtl w:val="1"/>
+          <w:rFonts w:cs="Consolas"/>
+        </w:rPr>
+        <w:t>lib/avatar/{heygen,did,index}.ts</w:t>
+      </w:r>
+      <w:r>
+        <w:rPr>
+          <w:rFonts w:ascii="Arial" w:hAnsi="Arial"/>
+          <w:b w:val="0"/>
+          <w:sz w:val="22"/>
+          <w:rtl w:val="1"/>
+          <w:rFonts w:cs="Arial"/>
+        </w:rPr>
+        <w:t xml:space="preserve">, </w:t>
+      </w:r>
+      <w:r>
+        <w:rPr>
+          <w:rFonts w:ascii="Consolas" w:hAnsi="Consolas"/>
+          <w:b w:val="0"/>
+          <w:color w:val="B02A37"/>
+          <w:sz w:val="22"/>
+          <w:rtl w:val="1"/>
+          <w:rFonts w:cs="Consolas"/>
+        </w:rPr>
+        <w:t>app/actions-avatar.ts</w:t>
+      </w:r>
+      <w:r>
+        <w:rPr>
+          <w:rFonts w:ascii="Arial" w:hAnsi="Arial"/>
+          <w:b w:val="0"/>
+          <w:sz w:val="22"/>
+          <w:rtl w:val="1"/>
+          <w:rFonts w:cs="Arial"/>
+        </w:rPr>
+        <w:t xml:space="preserve">, </w:t>
+      </w:r>
+      <w:r>
+        <w:rPr>
+          <w:rFonts w:ascii="Consolas" w:hAnsi="Consolas"/>
+          <w:b w:val="0"/>
+          <w:color w:val="B02A37"/>
+          <w:sz w:val="22"/>
+          <w:rtl w:val="1"/>
+          <w:rFonts w:cs="Consolas"/>
+        </w:rPr>
+        <w:t>app/api/cron/avatar-poll</w:t>
+      </w:r>
+      <w:r>
+        <w:rPr>
+          <w:rFonts w:ascii="Arial" w:hAnsi="Arial"/>
+          <w:b w:val="0"/>
+          <w:sz w:val="22"/>
+          <w:rtl w:val="1"/>
+          <w:rFonts w:cs="Arial"/>
+        </w:rPr>
+        <w:t xml:space="preserve">, כפתור 🧑 per-גרסה. </w:t>
+      </w:r>
+      <w:r>
+        <w:rPr>
+          <w:rFonts w:ascii="Arial" w:hAnsi="Arial"/>
+          <w:b/>
+          <w:sz w:val="22"/>
+          <w:rtl w:val="1"/>
+          <w:rFonts w:cs="Arial"/>
+        </w:rPr>
+        <w:t>סוגר את פער-הווידאו מול PowerAds.</w:t>
       </w:r>
     </w:p>
     <w:p>

</xml_diff>

<commit_message>
docs(marketing-ops): consolidated status §2.11 + HELIX OPS external-connections xlsx (8 new rows)
Co-Authored-By: Claude Opus 4.8 (1M context) <noreply@anthropic.com>
</commit_message>
<xml_diff>
--- a/PRODUCTS/01-marketing-ops-hub.docx
+++ b/PRODUCTS/01-marketing-ops-hub.docx
@@ -16677,6 +16677,1478 @@
         <w:t>סוגר את פער-הווידאו מול PowerAds.</w:t>
       </w:r>
     </w:p>
+    <w:p>
+      <w:pPr>
+        <w:pStyle w:val="Heading2"/>
+        <w:bidi w:val="1"/>
+        <w:jc w:val="right"/>
+      </w:pPr>
+      <w:r>
+        <w:rPr>
+          <w:rFonts w:ascii="Arial" w:hAnsi="Arial"/>
+          <w:b w:val="0"/>
+          <w:sz w:val="28"/>
+          <w:rtl w:val="1"/>
+          <w:rFonts w:cs="Arial"/>
+        </w:rPr>
+        <w:t>2.11 סטטוס מרוכז — קמפיינים/A-B/Landing/אווטארים (2026-07) 🗂️</w:t>
+      </w:r>
+    </w:p>
+    <w:p>
+      <w:pPr>
+        <w:pStyle w:val="Heading3"/>
+        <w:bidi w:val="1"/>
+        <w:jc w:val="right"/>
+      </w:pPr>
+      <w:r>
+        <w:rPr>
+          <w:rFonts w:ascii="Arial" w:hAnsi="Arial"/>
+          <w:b w:val="0"/>
+          <w:sz w:val="24"/>
+          <w:rtl w:val="1"/>
+          <w:rFonts w:cs="Arial"/>
+        </w:rPr>
+        <w:t>✅ נבנה (typecheck+build נקי, נדחף)</w:t>
+      </w:r>
+    </w:p>
+    <w:p>
+      <w:pPr>
+        <w:bidi w:val="1"/>
+        <w:jc w:val="right"/>
+      </w:pPr>
+      <w:r>
+        <w:rPr>
+          <w:rFonts w:ascii="Arial" w:hAnsi="Arial"/>
+          <w:b w:val="0"/>
+          <w:sz w:val="22"/>
+          <w:rtl w:val="1"/>
+          <w:rFonts w:cs="Arial"/>
+        </w:rPr>
+        <w:t xml:space="preserve">A/B 6×6 (36 גרסאות) · Campaign Builder חוצה-ערוצים · בנייה אינקרמנטלית · פרסום מרובה-גרסאות (אורגני/ממומן/סרטון) · </w:t>
+      </w:r>
+      <w:r>
+        <w:rPr>
+          <w:rFonts w:ascii="Arial" w:hAnsi="Arial"/>
+          <w:b/>
+          <w:sz w:val="22"/>
+          <w:rtl w:val="1"/>
+          <w:rFonts w:cs="Arial"/>
+        </w:rPr>
+        <w:t>אוטומציית-ממומן מלאה ב-Meta</w:t>
+      </w:r>
+      <w:r>
+        <w:rPr>
+          <w:rFonts w:ascii="Arial" w:hAnsi="Arial"/>
+          <w:b w:val="0"/>
+          <w:sz w:val="22"/>
+          <w:rtl w:val="1"/>
+          <w:rFonts w:cs="Arial"/>
+        </w:rPr>
+        <w:t xml:space="preserve"> (Campaign→AdSet→Ads) · </w:t>
+      </w:r>
+      <w:r>
+        <w:rPr>
+          <w:rFonts w:ascii="Arial" w:hAnsi="Arial"/>
+          <w:b/>
+          <w:sz w:val="22"/>
+          <w:rtl w:val="1"/>
+          <w:rFonts w:cs="Arial"/>
+        </w:rPr>
+        <w:t>פילוח-קהלים</w:t>
+      </w:r>
+      <w:r>
+        <w:rPr>
+          <w:rFonts w:ascii="Arial" w:hAnsi="Arial"/>
+          <w:b w:val="0"/>
+          <w:sz w:val="22"/>
+          <w:rtl w:val="1"/>
+          <w:rFonts w:cs="Arial"/>
+        </w:rPr>
+        <w:t xml:space="preserve"> (adset per-קהל) · </w:t>
+      </w:r>
+      <w:r>
+        <w:rPr>
+          <w:rFonts w:ascii="Arial" w:hAnsi="Arial"/>
+          <w:b/>
+          <w:sz w:val="22"/>
+          <w:rtl w:val="1"/>
+          <w:rFonts w:cs="Arial"/>
+        </w:rPr>
+        <w:t>לולאת-תקציב</w:t>
+      </w:r>
+      <w:r>
+        <w:rPr>
+          <w:rFonts w:ascii="Arial" w:hAnsi="Arial"/>
+          <w:b w:val="0"/>
+          <w:sz w:val="22"/>
+          <w:rtl w:val="1"/>
+          <w:rFonts w:cs="Arial"/>
+        </w:rPr>
+        <w:t xml:space="preserve"> (pause-losers) · נתונים-אמיתיים per-גרסה (Meta/TikTok/YouTube insights) · בחירת-מנצח אוטומטית · </w:t>
+      </w:r>
+      <w:r>
+        <w:rPr>
+          <w:rFonts w:ascii="Arial" w:hAnsi="Arial"/>
+          <w:b/>
+          <w:sz w:val="22"/>
+          <w:rtl w:val="1"/>
+          <w:rFonts w:cs="Arial"/>
+        </w:rPr>
+        <w:t>נגישות בוט מלאה</w:t>
+      </w:r>
+      <w:r>
+        <w:rPr>
+          <w:rFonts w:ascii="Arial" w:hAnsi="Arial"/>
+          <w:b w:val="0"/>
+          <w:sz w:val="22"/>
+          <w:rtl w:val="1"/>
+          <w:rFonts w:cs="Arial"/>
+        </w:rPr>
+        <w:t xml:space="preserve"> · </w:t>
+      </w:r>
+      <w:r>
+        <w:rPr>
+          <w:rFonts w:ascii="Arial" w:hAnsi="Arial"/>
+          <w:b/>
+          <w:sz w:val="22"/>
+          <w:rtl w:val="1"/>
+          <w:rFonts w:cs="Arial"/>
+        </w:rPr>
+        <w:t>חיבור לדשבורדים</w:t>
+      </w:r>
+      <w:r>
+        <w:rPr>
+          <w:rFonts w:ascii="Arial" w:hAnsi="Arial"/>
+          <w:b w:val="0"/>
+          <w:sz w:val="22"/>
+          <w:rtl w:val="1"/>
+          <w:rFonts w:cs="Arial"/>
+        </w:rPr>
+        <w:t xml:space="preserve"> · </w:t>
+      </w:r>
+      <w:r>
+        <w:rPr>
+          <w:rFonts w:ascii="Arial" w:hAnsi="Arial"/>
+          <w:b/>
+          <w:sz w:val="22"/>
+          <w:rtl w:val="1"/>
+          <w:rFonts w:cs="Arial"/>
+        </w:rPr>
+        <w:t>בונה-Landing (15 טמפלטים)</w:t>
+      </w:r>
+      <w:r>
+        <w:rPr>
+          <w:rFonts w:ascii="Arial" w:hAnsi="Arial"/>
+          <w:b w:val="0"/>
+          <w:sz w:val="22"/>
+          <w:rtl w:val="1"/>
+          <w:rFonts w:cs="Arial"/>
+        </w:rPr>
+        <w:t xml:space="preserve"> · </w:t>
+      </w:r>
+      <w:r>
+        <w:rPr>
+          <w:rFonts w:ascii="Arial" w:hAnsi="Arial"/>
+          <w:b/>
+          <w:sz w:val="22"/>
+          <w:rtl w:val="1"/>
+          <w:rFonts w:cs="Arial"/>
+        </w:rPr>
+        <w:t>אווטארים HeyGen/D-ID/ElevenLabs (BYOK/managed)</w:t>
+      </w:r>
+      <w:r>
+        <w:rPr>
+          <w:rFonts w:ascii="Arial" w:hAnsi="Arial"/>
+          <w:b w:val="0"/>
+          <w:sz w:val="22"/>
+          <w:rtl w:val="1"/>
+          <w:rFonts w:cs="Arial"/>
+        </w:rPr>
+        <w:t>.</w:t>
+      </w:r>
+    </w:p>
+    <w:p>
+      <w:pPr>
+        <w:pStyle w:val="Heading3"/>
+        <w:bidi w:val="1"/>
+        <w:jc w:val="right"/>
+      </w:pPr>
+      <w:r>
+        <w:rPr>
+          <w:rFonts w:ascii="Arial" w:hAnsi="Arial"/>
+          <w:b w:val="0"/>
+          <w:sz w:val="24"/>
+          <w:rtl w:val="1"/>
+          <w:rFonts w:cs="Arial"/>
+        </w:rPr>
+        <w:t>⬜ מה נשאר להשלים (הרצה + creds + פוליש)</w:t>
+      </w:r>
+    </w:p>
+    <w:tbl>
+      <w:tblPr>
+        <w:tblStyle w:val="LightGrid-Accent1"/>
+        <w:tblW w:type="auto" w:w="0"/>
+        <w:tblLook w:firstColumn="1" w:firstRow="1" w:lastColumn="0" w:lastRow="0" w:noHBand="0" w:noVBand="1" w:val="04A0"/>
+        <w:bidiVisual/>
+      </w:tblPr>
+      <w:tblGrid>
+        <w:gridCol w:w="2160"/>
+        <w:gridCol w:w="2160"/>
+        <w:gridCol w:w="2160"/>
+        <w:gridCol w:w="2160"/>
+      </w:tblGrid>
+      <w:tr>
+        <w:tc>
+          <w:tcPr>
+            <w:tcW w:type="dxa" w:w="2160"/>
+          </w:tcPr>
+          <w:p>
+            <w:pPr>
+              <w:bidi w:val="1"/>
+              <w:jc w:val="right"/>
+            </w:pPr>
+            <w:r>
+              <w:rPr>
+                <w:rFonts w:ascii="Arial" w:hAnsi="Arial"/>
+                <w:b/>
+                <w:sz w:val="20"/>
+                <w:rtl w:val="1"/>
+                <w:rFonts w:cs="Arial"/>
+              </w:rPr>
+              <w:t>#</w:t>
+            </w:r>
+          </w:p>
+        </w:tc>
+        <w:tc>
+          <w:tcPr>
+            <w:tcW w:type="dxa" w:w="2160"/>
+          </w:tcPr>
+          <w:p>
+            <w:pPr>
+              <w:bidi w:val="1"/>
+              <w:jc w:val="right"/>
+            </w:pPr>
+            <w:r>
+              <w:rPr>
+                <w:rFonts w:ascii="Arial" w:hAnsi="Arial"/>
+                <w:b/>
+                <w:sz w:val="20"/>
+                <w:rtl w:val="1"/>
+                <w:rFonts w:cs="Arial"/>
+              </w:rPr>
+              <w:t>מה</w:t>
+            </w:r>
+          </w:p>
+        </w:tc>
+        <w:tc>
+          <w:tcPr>
+            <w:tcW w:type="dxa" w:w="2160"/>
+          </w:tcPr>
+          <w:p>
+            <w:pPr>
+              <w:bidi w:val="1"/>
+              <w:jc w:val="right"/>
+            </w:pPr>
+            <w:r>
+              <w:rPr>
+                <w:rFonts w:ascii="Arial" w:hAnsi="Arial"/>
+                <w:b/>
+                <w:sz w:val="20"/>
+                <w:rtl w:val="1"/>
+                <w:rFonts w:cs="Arial"/>
+              </w:rPr>
+              <w:t>סטטוס</w:t>
+            </w:r>
+          </w:p>
+        </w:tc>
+        <w:tc>
+          <w:tcPr>
+            <w:tcW w:type="dxa" w:w="2160"/>
+          </w:tcPr>
+          <w:p>
+            <w:pPr>
+              <w:bidi w:val="1"/>
+              <w:jc w:val="right"/>
+            </w:pPr>
+            <w:r>
+              <w:rPr>
+                <w:rFonts w:ascii="Arial" w:hAnsi="Arial"/>
+                <w:b/>
+                <w:sz w:val="20"/>
+                <w:rtl w:val="1"/>
+                <w:rFonts w:cs="Arial"/>
+              </w:rPr>
+              <w:t>מה צריך</w:t>
+            </w:r>
+          </w:p>
+        </w:tc>
+      </w:tr>
+      <w:tr>
+        <w:tc>
+          <w:tcPr>
+            <w:tcW w:type="dxa" w:w="2160"/>
+          </w:tcPr>
+          <w:p>
+            <w:pPr>
+              <w:bidi w:val="1"/>
+              <w:jc w:val="right"/>
+            </w:pPr>
+            <w:r>
+              <w:rPr>
+                <w:rFonts w:ascii="Arial" w:hAnsi="Arial"/>
+                <w:b w:val="0"/>
+                <w:sz w:val="20"/>
+                <w:rtl w:val="1"/>
+                <w:rFonts w:cs="Arial"/>
+              </w:rPr>
+              <w:t>1</w:t>
+            </w:r>
+          </w:p>
+        </w:tc>
+        <w:tc>
+          <w:tcPr>
+            <w:tcW w:type="dxa" w:w="2160"/>
+          </w:tcPr>
+          <w:p>
+            <w:pPr>
+              <w:bidi w:val="1"/>
+              <w:jc w:val="right"/>
+            </w:pPr>
+            <w:r>
+              <w:rPr>
+                <w:rFonts w:ascii="Arial" w:hAnsi="Arial"/>
+                <w:b/>
+                <w:sz w:val="20"/>
+                <w:rtl w:val="1"/>
+                <w:rFonts w:cs="Arial"/>
+              </w:rPr>
+              <w:t>הרצת SQL</w:t>
+            </w:r>
+          </w:p>
+        </w:tc>
+        <w:tc>
+          <w:tcPr>
+            <w:tcW w:type="dxa" w:w="2160"/>
+          </w:tcPr>
+          <w:p>
+            <w:pPr>
+              <w:bidi w:val="1"/>
+              <w:jc w:val="right"/>
+            </w:pPr>
+            <w:r>
+              <w:rPr>
+                <w:rFonts w:ascii="Arial" w:hAnsi="Arial"/>
+                <w:b w:val="0"/>
+                <w:sz w:val="20"/>
+                <w:rtl w:val="1"/>
+                <w:rFonts w:cs="Arial"/>
+              </w:rPr>
+              <w:t>קוד מוכן</w:t>
+            </w:r>
+          </w:p>
+        </w:tc>
+        <w:tc>
+          <w:tcPr>
+            <w:tcW w:type="dxa" w:w="2160"/>
+          </w:tcPr>
+          <w:p>
+            <w:pPr>
+              <w:bidi w:val="1"/>
+              <w:jc w:val="right"/>
+            </w:pPr>
+            <w:r>
+              <w:rPr>
+                <w:rFonts w:ascii="Consolas" w:hAnsi="Consolas"/>
+                <w:b w:val="0"/>
+                <w:color w:val="B02A37"/>
+                <w:sz w:val="20"/>
+                <w:rtl w:val="1"/>
+                <w:rFonts w:cs="Consolas"/>
+              </w:rPr>
+              <w:t>migration-v15</w:t>
+            </w:r>
+            <w:r>
+              <w:rPr>
+                <w:rFonts w:ascii="Arial" w:hAnsi="Arial"/>
+                <w:b w:val="0"/>
+                <w:sz w:val="20"/>
+                <w:rtl w:val="1"/>
+                <w:rFonts w:cs="Arial"/>
+              </w:rPr>
+              <w:t xml:space="preserve"> (campaigns/variants/bot_links) + </w:t>
+            </w:r>
+            <w:r>
+              <w:rPr>
+                <w:rFonts w:ascii="Consolas" w:hAnsi="Consolas"/>
+                <w:b w:val="0"/>
+                <w:color w:val="B02A37"/>
+                <w:sz w:val="20"/>
+                <w:rtl w:val="1"/>
+                <w:rFonts w:cs="Consolas"/>
+              </w:rPr>
+              <w:t>migration-v16</w:t>
+            </w:r>
+            <w:r>
+              <w:rPr>
+                <w:rFonts w:ascii="Arial" w:hAnsi="Arial"/>
+                <w:b w:val="0"/>
+                <w:sz w:val="20"/>
+                <w:rtl w:val="1"/>
+                <w:rFonts w:cs="Arial"/>
+              </w:rPr>
+              <w:t xml:space="preserve"> (landing/avatars) ב-Supabase</w:t>
+            </w:r>
+          </w:p>
+        </w:tc>
+      </w:tr>
+      <w:tr>
+        <w:tc>
+          <w:tcPr>
+            <w:tcW w:type="dxa" w:w="2160"/>
+          </w:tcPr>
+          <w:p>
+            <w:pPr>
+              <w:bidi w:val="1"/>
+              <w:jc w:val="right"/>
+            </w:pPr>
+            <w:r>
+              <w:rPr>
+                <w:rFonts w:ascii="Arial" w:hAnsi="Arial"/>
+                <w:b w:val="0"/>
+                <w:sz w:val="20"/>
+                <w:rtl w:val="1"/>
+                <w:rFonts w:cs="Arial"/>
+              </w:rPr>
+              <w:t>2</w:t>
+            </w:r>
+          </w:p>
+        </w:tc>
+        <w:tc>
+          <w:tcPr>
+            <w:tcW w:type="dxa" w:w="2160"/>
+          </w:tcPr>
+          <w:p>
+            <w:pPr>
+              <w:bidi w:val="1"/>
+              <w:jc w:val="right"/>
+            </w:pPr>
+            <w:r>
+              <w:rPr>
+                <w:rFonts w:ascii="Arial" w:hAnsi="Arial"/>
+                <w:b/>
+                <w:sz w:val="20"/>
+                <w:rtl w:val="1"/>
+                <w:rFonts w:cs="Arial"/>
+              </w:rPr>
+              <w:t>Meta Ads creds</w:t>
+            </w:r>
+          </w:p>
+        </w:tc>
+        <w:tc>
+          <w:tcPr>
+            <w:tcW w:type="dxa" w:w="2160"/>
+          </w:tcPr>
+          <w:p>
+            <w:pPr>
+              <w:bidi w:val="1"/>
+              <w:jc w:val="right"/>
+            </w:pPr>
+            <w:r>
+              <w:rPr>
+                <w:rFonts w:ascii="Arial" w:hAnsi="Arial"/>
+                <w:b w:val="0"/>
+                <w:sz w:val="20"/>
+                <w:rtl w:val="1"/>
+                <w:rFonts w:cs="Arial"/>
+              </w:rPr>
+              <w:t>קוד מוכן</w:t>
+            </w:r>
+          </w:p>
+        </w:tc>
+        <w:tc>
+          <w:tcPr>
+            <w:tcW w:type="dxa" w:w="2160"/>
+          </w:tcPr>
+          <w:p>
+            <w:pPr>
+              <w:bidi w:val="1"/>
+              <w:jc w:val="right"/>
+            </w:pPr>
+            <w:r>
+              <w:rPr>
+                <w:rFonts w:ascii="Consolas" w:hAnsi="Consolas"/>
+                <w:b w:val="0"/>
+                <w:color w:val="B02A37"/>
+                <w:sz w:val="20"/>
+                <w:rtl w:val="1"/>
+                <w:rFonts w:cs="Consolas"/>
+              </w:rPr>
+              <w:t>FB_ADS_TOKEN</w:t>
+            </w:r>
+            <w:r>
+              <w:rPr>
+                <w:rFonts w:ascii="Arial" w:hAnsi="Arial"/>
+                <w:b w:val="0"/>
+                <w:sz w:val="20"/>
+                <w:rtl w:val="1"/>
+                <w:rFonts w:cs="Arial"/>
+              </w:rPr>
+              <w:t>/</w:t>
+            </w:r>
+            <w:r>
+              <w:rPr>
+                <w:rFonts w:ascii="Consolas" w:hAnsi="Consolas"/>
+                <w:b w:val="0"/>
+                <w:color w:val="B02A37"/>
+                <w:sz w:val="20"/>
+                <w:rtl w:val="1"/>
+                <w:rFonts w:cs="Consolas"/>
+              </w:rPr>
+              <w:t>FB_AD_ACCOUNT_ID</w:t>
+            </w:r>
+            <w:r>
+              <w:rPr>
+                <w:rFonts w:ascii="Arial" w:hAnsi="Arial"/>
+                <w:b w:val="0"/>
+                <w:sz w:val="20"/>
+                <w:rtl w:val="1"/>
+                <w:rFonts w:cs="Arial"/>
+              </w:rPr>
+              <w:t>/</w:t>
+            </w:r>
+            <w:r>
+              <w:rPr>
+                <w:rFonts w:ascii="Consolas" w:hAnsi="Consolas"/>
+                <w:b w:val="0"/>
+                <w:color w:val="B02A37"/>
+                <w:sz w:val="20"/>
+                <w:rtl w:val="1"/>
+                <w:rFonts w:cs="Consolas"/>
+              </w:rPr>
+              <w:t>FB_PAGE_ID</w:t>
+            </w:r>
+            <w:r>
+              <w:rPr>
+                <w:rFonts w:ascii="Arial" w:hAnsi="Arial"/>
+                <w:b w:val="0"/>
+                <w:sz w:val="20"/>
+                <w:rtl w:val="1"/>
+                <w:rFonts w:cs="Arial"/>
+              </w:rPr>
+              <w:t xml:space="preserve"> + הרשאות </w:t>
+            </w:r>
+            <w:r>
+              <w:rPr>
+                <w:rFonts w:ascii="Consolas" w:hAnsi="Consolas"/>
+                <w:b w:val="0"/>
+                <w:color w:val="B02A37"/>
+                <w:sz w:val="20"/>
+                <w:rtl w:val="1"/>
+                <w:rFonts w:cs="Consolas"/>
+              </w:rPr>
+              <w:t>ads_management</w:t>
+            </w:r>
+            <w:r>
+              <w:rPr>
+                <w:rFonts w:ascii="Arial" w:hAnsi="Arial"/>
+                <w:b w:val="0"/>
+                <w:sz w:val="20"/>
+                <w:rtl w:val="1"/>
+                <w:rFonts w:cs="Arial"/>
+              </w:rPr>
+              <w:t>+</w:t>
+            </w:r>
+            <w:r>
+              <w:rPr>
+                <w:rFonts w:ascii="Consolas" w:hAnsi="Consolas"/>
+                <w:b w:val="0"/>
+                <w:color w:val="B02A37"/>
+                <w:sz w:val="20"/>
+                <w:rtl w:val="1"/>
+                <w:rFonts w:cs="Consolas"/>
+              </w:rPr>
+              <w:t>read_insights</w:t>
+            </w:r>
+            <w:r>
+              <w:rPr>
+                <w:rFonts w:ascii="Arial" w:hAnsi="Arial"/>
+                <w:b w:val="0"/>
+                <w:sz w:val="20"/>
+                <w:rtl w:val="1"/>
+                <w:rFonts w:cs="Arial"/>
+              </w:rPr>
+              <w:t xml:space="preserve"> (App Review)</w:t>
+            </w:r>
+          </w:p>
+        </w:tc>
+      </w:tr>
+      <w:tr>
+        <w:tc>
+          <w:tcPr>
+            <w:tcW w:type="dxa" w:w="2160"/>
+          </w:tcPr>
+          <w:p>
+            <w:pPr>
+              <w:bidi w:val="1"/>
+              <w:jc w:val="right"/>
+            </w:pPr>
+            <w:r>
+              <w:rPr>
+                <w:rFonts w:ascii="Arial" w:hAnsi="Arial"/>
+                <w:b w:val="0"/>
+                <w:sz w:val="20"/>
+                <w:rtl w:val="1"/>
+                <w:rFonts w:cs="Arial"/>
+              </w:rPr>
+              <w:t>3</w:t>
+            </w:r>
+          </w:p>
+        </w:tc>
+        <w:tc>
+          <w:tcPr>
+            <w:tcW w:type="dxa" w:w="2160"/>
+          </w:tcPr>
+          <w:p>
+            <w:pPr>
+              <w:bidi w:val="1"/>
+              <w:jc w:val="right"/>
+            </w:pPr>
+            <w:r>
+              <w:rPr>
+                <w:rFonts w:ascii="Arial" w:hAnsi="Arial"/>
+                <w:b/>
+                <w:sz w:val="20"/>
+                <w:rtl w:val="1"/>
+                <w:rFonts w:cs="Arial"/>
+              </w:rPr>
+              <w:t>מפתחות אווטאר</w:t>
+            </w:r>
+          </w:p>
+        </w:tc>
+        <w:tc>
+          <w:tcPr>
+            <w:tcW w:type="dxa" w:w="2160"/>
+          </w:tcPr>
+          <w:p>
+            <w:pPr>
+              <w:bidi w:val="1"/>
+              <w:jc w:val="right"/>
+            </w:pPr>
+            <w:r>
+              <w:rPr>
+                <w:rFonts w:ascii="Arial" w:hAnsi="Arial"/>
+                <w:b w:val="0"/>
+                <w:sz w:val="20"/>
+                <w:rtl w:val="1"/>
+                <w:rFonts w:cs="Arial"/>
+              </w:rPr>
+              <w:t>קוד מוכן</w:t>
+            </w:r>
+          </w:p>
+        </w:tc>
+        <w:tc>
+          <w:tcPr>
+            <w:tcW w:type="dxa" w:w="2160"/>
+          </w:tcPr>
+          <w:p>
+            <w:pPr>
+              <w:bidi w:val="1"/>
+              <w:jc w:val="right"/>
+            </w:pPr>
+            <w:r>
+              <w:rPr>
+                <w:rFonts w:ascii="Arial" w:hAnsi="Arial"/>
+                <w:b w:val="0"/>
+                <w:sz w:val="20"/>
+                <w:rtl w:val="1"/>
+                <w:rFonts w:cs="Arial"/>
+              </w:rPr>
+              <w:t xml:space="preserve">BYOK (מסך-הגדרות </w:t>
+            </w:r>
+            <w:r>
+              <w:rPr>
+                <w:rFonts w:ascii="Consolas" w:hAnsi="Consolas"/>
+                <w:b w:val="0"/>
+                <w:color w:val="B02A37"/>
+                <w:sz w:val="20"/>
+                <w:rtl w:val="1"/>
+                <w:rFonts w:cs="Consolas"/>
+              </w:rPr>
+              <w:t>channel_connections</w:t>
+            </w:r>
+            <w:r>
+              <w:rPr>
+                <w:rFonts w:ascii="Arial" w:hAnsi="Arial"/>
+                <w:b w:val="0"/>
+                <w:sz w:val="20"/>
+                <w:rtl w:val="1"/>
+                <w:rFonts w:cs="Arial"/>
+              </w:rPr>
+              <w:t xml:space="preserve"> channel='avatar') </w:t>
+            </w:r>
+            <w:r>
+              <w:rPr>
+                <w:rFonts w:ascii="Arial" w:hAnsi="Arial"/>
+                <w:b/>
+                <w:sz w:val="20"/>
+                <w:rtl w:val="1"/>
+                <w:rFonts w:cs="Arial"/>
+              </w:rPr>
+              <w:t>או</w:t>
+            </w:r>
+            <w:r>
+              <w:rPr>
+                <w:rFonts w:ascii="Arial" w:hAnsi="Arial"/>
+                <w:b w:val="0"/>
+                <w:sz w:val="20"/>
+                <w:rtl w:val="1"/>
+                <w:rFonts w:cs="Arial"/>
+              </w:rPr>
+              <w:t xml:space="preserve"> managed (</w:t>
+            </w:r>
+            <w:r>
+              <w:rPr>
+                <w:rFonts w:ascii="Consolas" w:hAnsi="Consolas"/>
+                <w:b w:val="0"/>
+                <w:color w:val="B02A37"/>
+                <w:sz w:val="20"/>
+                <w:rtl w:val="1"/>
+                <w:rFonts w:cs="Consolas"/>
+              </w:rPr>
+              <w:t>HEYGEN_API_KEY</w:t>
+            </w:r>
+            <w:r>
+              <w:rPr>
+                <w:rFonts w:ascii="Arial" w:hAnsi="Arial"/>
+                <w:b w:val="0"/>
+                <w:sz w:val="20"/>
+                <w:rtl w:val="1"/>
+                <w:rFonts w:cs="Arial"/>
+              </w:rPr>
+              <w:t>/</w:t>
+            </w:r>
+            <w:r>
+              <w:rPr>
+                <w:rFonts w:ascii="Consolas" w:hAnsi="Consolas"/>
+                <w:b w:val="0"/>
+                <w:color w:val="B02A37"/>
+                <w:sz w:val="20"/>
+                <w:rtl w:val="1"/>
+                <w:rFonts w:cs="Consolas"/>
+              </w:rPr>
+              <w:t>DID_API_KEY</w:t>
+            </w:r>
+            <w:r>
+              <w:rPr>
+                <w:rFonts w:ascii="Arial" w:hAnsi="Arial"/>
+                <w:b w:val="0"/>
+                <w:sz w:val="20"/>
+                <w:rtl w:val="1"/>
+                <w:rFonts w:cs="Arial"/>
+              </w:rPr>
+              <w:t>/</w:t>
+            </w:r>
+            <w:r>
+              <w:rPr>
+                <w:rFonts w:ascii="Consolas" w:hAnsi="Consolas"/>
+                <w:b w:val="0"/>
+                <w:color w:val="B02A37"/>
+                <w:sz w:val="20"/>
+                <w:rtl w:val="1"/>
+                <w:rFonts w:cs="Consolas"/>
+              </w:rPr>
+              <w:t>ELEVENLABS_API_KEY</w:t>
+            </w:r>
+            <w:r>
+              <w:rPr>
+                <w:rFonts w:ascii="Arial" w:hAnsi="Arial"/>
+                <w:b w:val="0"/>
+                <w:sz w:val="20"/>
+                <w:rtl w:val="1"/>
+                <w:rFonts w:cs="Arial"/>
+              </w:rPr>
+              <w:t xml:space="preserve">) — </w:t>
+            </w:r>
+            <w:r>
+              <w:rPr>
+                <w:rFonts w:ascii="Arial" w:hAnsi="Arial"/>
+                <w:b/>
+                <w:sz w:val="20"/>
+                <w:rtl w:val="1"/>
+                <w:rFonts w:cs="Arial"/>
+              </w:rPr>
+              <w:t>חסר UI להזנת BYOK</w:t>
+            </w:r>
+          </w:p>
+        </w:tc>
+      </w:tr>
+      <w:tr>
+        <w:tc>
+          <w:tcPr>
+            <w:tcW w:type="dxa" w:w="2160"/>
+          </w:tcPr>
+          <w:p>
+            <w:pPr>
+              <w:bidi w:val="1"/>
+              <w:jc w:val="right"/>
+            </w:pPr>
+            <w:r>
+              <w:rPr>
+                <w:rFonts w:ascii="Arial" w:hAnsi="Arial"/>
+                <w:b w:val="0"/>
+                <w:sz w:val="20"/>
+                <w:rtl w:val="1"/>
+                <w:rFonts w:cs="Arial"/>
+              </w:rPr>
+              <w:t>4</w:t>
+            </w:r>
+          </w:p>
+        </w:tc>
+        <w:tc>
+          <w:tcPr>
+            <w:tcW w:type="dxa" w:w="2160"/>
+          </w:tcPr>
+          <w:p>
+            <w:pPr>
+              <w:bidi w:val="1"/>
+              <w:jc w:val="right"/>
+            </w:pPr>
+            <w:r>
+              <w:rPr>
+                <w:rFonts w:ascii="Arial" w:hAnsi="Arial"/>
+                <w:b/>
+                <w:sz w:val="20"/>
+                <w:rtl w:val="1"/>
+                <w:rFonts w:cs="Arial"/>
+              </w:rPr>
+              <w:t>insights TikTok/YouTube</w:t>
+            </w:r>
+          </w:p>
+        </w:tc>
+        <w:tc>
+          <w:tcPr>
+            <w:tcW w:type="dxa" w:w="2160"/>
+          </w:tcPr>
+          <w:p>
+            <w:pPr>
+              <w:bidi w:val="1"/>
+              <w:jc w:val="right"/>
+            </w:pPr>
+            <w:r>
+              <w:rPr>
+                <w:rFonts w:ascii="Arial" w:hAnsi="Arial"/>
+                <w:b w:val="0"/>
+                <w:sz w:val="20"/>
+                <w:rtl w:val="1"/>
+                <w:rFonts w:cs="Arial"/>
+              </w:rPr>
+              <w:t>קוד מוכן</w:t>
+            </w:r>
+          </w:p>
+        </w:tc>
+        <w:tc>
+          <w:tcPr>
+            <w:tcW w:type="dxa" w:w="2160"/>
+          </w:tcPr>
+          <w:p>
+            <w:pPr>
+              <w:bidi w:val="1"/>
+              <w:jc w:val="right"/>
+            </w:pPr>
+            <w:r>
+              <w:rPr>
+                <w:rFonts w:ascii="Consolas" w:hAnsi="Consolas"/>
+                <w:b w:val="0"/>
+                <w:color w:val="B02A37"/>
+                <w:sz w:val="20"/>
+                <w:rtl w:val="1"/>
+                <w:rFonts w:cs="Consolas"/>
+              </w:rPr>
+              <w:t>access_token</w:t>
+            </w:r>
+            <w:r>
+              <w:rPr>
+                <w:rFonts w:ascii="Arial" w:hAnsi="Arial"/>
+                <w:b w:val="0"/>
+                <w:sz w:val="20"/>
+                <w:rtl w:val="1"/>
+                <w:rFonts w:cs="Arial"/>
+              </w:rPr>
+              <w:t xml:space="preserve"> per-ערוץ ב-config</w:t>
+            </w:r>
+          </w:p>
+        </w:tc>
+      </w:tr>
+      <w:tr>
+        <w:tc>
+          <w:tcPr>
+            <w:tcW w:type="dxa" w:w="2160"/>
+          </w:tcPr>
+          <w:p>
+            <w:pPr>
+              <w:bidi w:val="1"/>
+              <w:jc w:val="right"/>
+            </w:pPr>
+            <w:r>
+              <w:rPr>
+                <w:rFonts w:ascii="Arial" w:hAnsi="Arial"/>
+                <w:b w:val="0"/>
+                <w:sz w:val="20"/>
+                <w:rtl w:val="1"/>
+                <w:rFonts w:cs="Arial"/>
+              </w:rPr>
+              <w:t>5</w:t>
+            </w:r>
+          </w:p>
+        </w:tc>
+        <w:tc>
+          <w:tcPr>
+            <w:tcW w:type="dxa" w:w="2160"/>
+          </w:tcPr>
+          <w:p>
+            <w:pPr>
+              <w:bidi w:val="1"/>
+              <w:jc w:val="right"/>
+            </w:pPr>
+            <w:r>
+              <w:rPr>
+                <w:rFonts w:ascii="Arial" w:hAnsi="Arial"/>
+                <w:b/>
+                <w:sz w:val="20"/>
+                <w:rtl w:val="1"/>
+                <w:rFonts w:cs="Arial"/>
+              </w:rPr>
+              <w:t>חיבור-דשבורדים</w:t>
+            </w:r>
+          </w:p>
+        </w:tc>
+        <w:tc>
+          <w:tcPr>
+            <w:tcW w:type="dxa" w:w="2160"/>
+          </w:tcPr>
+          <w:p>
+            <w:pPr>
+              <w:bidi w:val="1"/>
+              <w:jc w:val="right"/>
+            </w:pPr>
+            <w:r>
+              <w:rPr>
+                <w:rFonts w:ascii="Arial" w:hAnsi="Arial"/>
+                <w:b w:val="0"/>
+                <w:sz w:val="20"/>
+                <w:rtl w:val="1"/>
+                <w:rFonts w:cs="Arial"/>
+              </w:rPr>
+              <w:t>קוד מוכן</w:t>
+            </w:r>
+          </w:p>
+        </w:tc>
+        <w:tc>
+          <w:tcPr>
+            <w:tcW w:type="dxa" w:w="2160"/>
+          </w:tcPr>
+          <w:p>
+            <w:pPr>
+              <w:bidi w:val="1"/>
+              <w:jc w:val="right"/>
+            </w:pPr>
+            <w:r>
+              <w:rPr>
+                <w:rFonts w:ascii="Consolas" w:hAnsi="Consolas"/>
+                <w:b w:val="0"/>
+                <w:color w:val="B02A37"/>
+                <w:sz w:val="20"/>
+                <w:rtl w:val="1"/>
+                <w:rFonts w:cs="Consolas"/>
+              </w:rPr>
+              <w:t>EXPORT_SECRET</w:t>
+            </w:r>
+            <w:r>
+              <w:rPr>
+                <w:rFonts w:ascii="Arial" w:hAnsi="Arial"/>
+                <w:b w:val="0"/>
+                <w:sz w:val="20"/>
+                <w:rtl w:val="1"/>
+                <w:rFonts w:cs="Arial"/>
+              </w:rPr>
+              <w:t xml:space="preserve"> (helix-ops) + הזנת URL/secret/workspace ב-connector של הדשבורדים</w:t>
+            </w:r>
+          </w:p>
+        </w:tc>
+      </w:tr>
+      <w:tr>
+        <w:tc>
+          <w:tcPr>
+            <w:tcW w:type="dxa" w:w="2160"/>
+          </w:tcPr>
+          <w:p>
+            <w:pPr>
+              <w:bidi w:val="1"/>
+              <w:jc w:val="right"/>
+            </w:pPr>
+            <w:r>
+              <w:rPr>
+                <w:rFonts w:ascii="Arial" w:hAnsi="Arial"/>
+                <w:b w:val="0"/>
+                <w:sz w:val="20"/>
+                <w:rtl w:val="1"/>
+                <w:rFonts w:cs="Arial"/>
+              </w:rPr>
+              <w:t>6</w:t>
+            </w:r>
+          </w:p>
+        </w:tc>
+        <w:tc>
+          <w:tcPr>
+            <w:tcW w:type="dxa" w:w="2160"/>
+          </w:tcPr>
+          <w:p>
+            <w:pPr>
+              <w:bidi w:val="1"/>
+              <w:jc w:val="right"/>
+            </w:pPr>
+            <w:r>
+              <w:rPr>
+                <w:rFonts w:ascii="Arial" w:hAnsi="Arial"/>
+                <w:b/>
+                <w:sz w:val="20"/>
+                <w:rtl w:val="1"/>
+                <w:rFonts w:cs="Arial"/>
+              </w:rPr>
+              <w:t>cron תדיר</w:t>
+            </w:r>
+          </w:p>
+        </w:tc>
+        <w:tc>
+          <w:tcPr>
+            <w:tcW w:type="dxa" w:w="2160"/>
+          </w:tcPr>
+          <w:p>
+            <w:pPr>
+              <w:bidi w:val="1"/>
+              <w:jc w:val="right"/>
+            </w:pPr>
+            <w:r>
+              <w:rPr>
+                <w:rFonts w:ascii="Arial" w:hAnsi="Arial"/>
+                <w:b w:val="0"/>
+                <w:sz w:val="20"/>
+                <w:rtl w:val="1"/>
+                <w:rFonts w:cs="Arial"/>
+              </w:rPr>
+              <w:t>vercel.json מוכן</w:t>
+            </w:r>
+          </w:p>
+        </w:tc>
+        <w:tc>
+          <w:tcPr>
+            <w:tcW w:type="dxa" w:w="2160"/>
+          </w:tcPr>
+          <w:p>
+            <w:pPr>
+              <w:bidi w:val="1"/>
+              <w:jc w:val="right"/>
+            </w:pPr>
+            <w:r>
+              <w:rPr>
+                <w:rFonts w:ascii="Arial" w:hAnsi="Arial"/>
+                <w:b w:val="0"/>
+                <w:sz w:val="20"/>
+                <w:rtl w:val="1"/>
+                <w:rFonts w:cs="Arial"/>
+              </w:rPr>
+              <w:t>Vercel Pro (avatar-poll כל 2 דק')</w:t>
+            </w:r>
+          </w:p>
+        </w:tc>
+      </w:tr>
+      <w:tr>
+        <w:tc>
+          <w:tcPr>
+            <w:tcW w:type="dxa" w:w="2160"/>
+          </w:tcPr>
+          <w:p>
+            <w:pPr>
+              <w:bidi w:val="1"/>
+              <w:jc w:val="right"/>
+            </w:pPr>
+            <w:r>
+              <w:rPr>
+                <w:rFonts w:ascii="Arial" w:hAnsi="Arial"/>
+                <w:b w:val="0"/>
+                <w:sz w:val="20"/>
+                <w:rtl w:val="1"/>
+                <w:rFonts w:cs="Arial"/>
+              </w:rPr>
+              <w:t>7</w:t>
+            </w:r>
+          </w:p>
+        </w:tc>
+        <w:tc>
+          <w:tcPr>
+            <w:tcW w:type="dxa" w:w="2160"/>
+          </w:tcPr>
+          <w:p>
+            <w:pPr>
+              <w:bidi w:val="1"/>
+              <w:jc w:val="right"/>
+            </w:pPr>
+            <w:r>
+              <w:rPr>
+                <w:rFonts w:ascii="Arial" w:hAnsi="Arial"/>
+                <w:b/>
+                <w:sz w:val="20"/>
+                <w:rtl w:val="1"/>
+                <w:rFonts w:cs="Arial"/>
+              </w:rPr>
+              <w:t>UX ממותג לקמפיינים/Landing</w:t>
+            </w:r>
+          </w:p>
+        </w:tc>
+        <w:tc>
+          <w:tcPr>
+            <w:tcW w:type="dxa" w:w="2160"/>
+          </w:tcPr>
+          <w:p>
+            <w:pPr>
+              <w:bidi w:val="1"/>
+              <w:jc w:val="right"/>
+            </w:pPr>
+            <w:r>
+              <w:rPr>
+                <w:rFonts w:ascii="Arial" w:hAnsi="Arial"/>
+                <w:b w:val="0"/>
+                <w:sz w:val="20"/>
+                <w:rtl w:val="1"/>
+                <w:rFonts w:cs="Arial"/>
+              </w:rPr>
+              <w:t>פונקציונלי</w:t>
+            </w:r>
+          </w:p>
+        </w:tc>
+        <w:tc>
+          <w:tcPr>
+            <w:tcW w:type="dxa" w:w="2160"/>
+          </w:tcPr>
+          <w:p>
+            <w:pPr>
+              <w:bidi w:val="1"/>
+              <w:jc w:val="right"/>
+            </w:pPr>
+            <w:r>
+              <w:rPr>
+                <w:rFonts w:ascii="Arial" w:hAnsi="Arial"/>
+                <w:b w:val="0"/>
+                <w:sz w:val="20"/>
+                <w:rtl w:val="1"/>
+                <w:rFonts w:cs="Arial"/>
+              </w:rPr>
+              <w:t xml:space="preserve">toasts/קונפטי/ConfirmDialog + aria-labels + מובייל (ראה </w:t>
+            </w:r>
+            <w:r>
+              <w:rPr>
+                <w:rFonts w:ascii="Consolas" w:hAnsi="Consolas"/>
+                <w:b w:val="0"/>
+                <w:color w:val="B02A37"/>
+                <w:sz w:val="20"/>
+                <w:rtl w:val="1"/>
+                <w:rFonts w:cs="Consolas"/>
+              </w:rPr>
+              <w:t>HELIX-OPS-UX</w:t>
+            </w:r>
+            <w:r>
+              <w:rPr>
+                <w:rFonts w:ascii="Arial" w:hAnsi="Arial"/>
+                <w:b w:val="0"/>
+                <w:sz w:val="20"/>
+                <w:rtl w:val="1"/>
+                <w:rFonts w:cs="Arial"/>
+              </w:rPr>
+              <w:t>)</w:t>
+            </w:r>
+          </w:p>
+        </w:tc>
+      </w:tr>
+      <w:tr>
+        <w:tc>
+          <w:tcPr>
+            <w:tcW w:type="dxa" w:w="2160"/>
+          </w:tcPr>
+          <w:p>
+            <w:pPr>
+              <w:bidi w:val="1"/>
+              <w:jc w:val="right"/>
+            </w:pPr>
+            <w:r>
+              <w:rPr>
+                <w:rFonts w:ascii="Arial" w:hAnsi="Arial"/>
+                <w:b w:val="0"/>
+                <w:sz w:val="20"/>
+                <w:rtl w:val="1"/>
+                <w:rFonts w:cs="Arial"/>
+              </w:rPr>
+              <w:t>8</w:t>
+            </w:r>
+          </w:p>
+        </w:tc>
+        <w:tc>
+          <w:tcPr>
+            <w:tcW w:type="dxa" w:w="2160"/>
+          </w:tcPr>
+          <w:p>
+            <w:pPr>
+              <w:bidi w:val="1"/>
+              <w:jc w:val="right"/>
+            </w:pPr>
+            <w:r>
+              <w:rPr>
+                <w:rFonts w:ascii="Arial" w:hAnsi="Arial"/>
+                <w:b/>
+                <w:sz w:val="20"/>
+                <w:rtl w:val="1"/>
+                <w:rFonts w:cs="Arial"/>
+              </w:rPr>
+              <w:t>auto-activate ממומן (#1)</w:t>
+            </w:r>
+          </w:p>
+        </w:tc>
+        <w:tc>
+          <w:tcPr>
+            <w:tcW w:type="dxa" w:w="2160"/>
+          </w:tcPr>
+          <w:p>
+            <w:pPr>
+              <w:bidi w:val="1"/>
+              <w:jc w:val="right"/>
+            </w:pPr>
+            <w:r>
+              <w:rPr>
+                <w:rFonts w:ascii="Arial" w:hAnsi="Arial"/>
+                <w:b w:val="0"/>
+                <w:sz w:val="20"/>
+                <w:rtl w:val="1"/>
+                <w:rFonts w:cs="Arial"/>
+              </w:rPr>
+              <w:t>PAUSED-only</w:t>
+            </w:r>
+          </w:p>
+        </w:tc>
+        <w:tc>
+          <w:tcPr>
+            <w:tcW w:type="dxa" w:w="2160"/>
+          </w:tcPr>
+          <w:p>
+            <w:pPr>
+              <w:bidi w:val="1"/>
+              <w:jc w:val="right"/>
+            </w:pPr>
+            <w:r>
+              <w:rPr>
+                <w:rFonts w:ascii="Arial" w:hAnsi="Arial"/>
+                <w:b w:val="0"/>
+                <w:sz w:val="20"/>
+                <w:rtl w:val="1"/>
+                <w:rFonts w:cs="Arial"/>
+              </w:rPr>
+              <w:t>אופציה "הפעל אוטומטית" למי שרוצה (כרגע ידני ב-Ads Manager)</w:t>
+            </w:r>
+          </w:p>
+        </w:tc>
+      </w:tr>
+      <w:tr>
+        <w:tc>
+          <w:tcPr>
+            <w:tcW w:type="dxa" w:w="2160"/>
+          </w:tcPr>
+          <w:p>
+            <w:pPr>
+              <w:bidi w:val="1"/>
+              <w:jc w:val="right"/>
+            </w:pPr>
+            <w:r>
+              <w:rPr>
+                <w:rFonts w:ascii="Arial" w:hAnsi="Arial"/>
+                <w:b w:val="0"/>
+                <w:sz w:val="20"/>
+                <w:rtl w:val="1"/>
+                <w:rFonts w:cs="Arial"/>
+              </w:rPr>
+              <w:t>9</w:t>
+            </w:r>
+          </w:p>
+        </w:tc>
+        <w:tc>
+          <w:tcPr>
+            <w:tcW w:type="dxa" w:w="2160"/>
+          </w:tcPr>
+          <w:p>
+            <w:pPr>
+              <w:bidi w:val="1"/>
+              <w:jc w:val="right"/>
+            </w:pPr>
+            <w:r>
+              <w:rPr>
+                <w:rFonts w:ascii="Arial" w:hAnsi="Arial"/>
+                <w:b/>
+                <w:sz w:val="20"/>
+                <w:rtl w:val="1"/>
+                <w:rFonts w:cs="Arial"/>
+              </w:rPr>
+              <w:t>b-roll וידאו</w:t>
+            </w:r>
+          </w:p>
+        </w:tc>
+        <w:tc>
+          <w:tcPr>
+            <w:tcW w:type="dxa" w:w="2160"/>
+          </w:tcPr>
+          <w:p>
+            <w:pPr>
+              <w:bidi w:val="1"/>
+              <w:jc w:val="right"/>
+            </w:pPr>
+            <w:r>
+              <w:rPr>
+                <w:rFonts w:ascii="Arial" w:hAnsi="Arial"/>
+                <w:b w:val="0"/>
+                <w:sz w:val="20"/>
+                <w:rtl w:val="1"/>
+                <w:rFonts w:cs="Arial"/>
+              </w:rPr>
+              <w:t>לא נבנה</w:t>
+            </w:r>
+          </w:p>
+        </w:tc>
+        <w:tc>
+          <w:tcPr>
+            <w:tcW w:type="dxa" w:w="2160"/>
+          </w:tcPr>
+          <w:p>
+            <w:pPr>
+              <w:bidi w:val="1"/>
+              <w:jc w:val="right"/>
+            </w:pPr>
+            <w:r>
+              <w:rPr>
+                <w:rFonts w:ascii="Arial" w:hAnsi="Arial"/>
+                <w:b w:val="0"/>
+                <w:sz w:val="20"/>
+                <w:rtl w:val="1"/>
+                <w:rFonts w:cs="Arial"/>
+              </w:rPr>
+              <w:t>connector Runway/Kling ל-Video Studio (משלים אווטאר)</w:t>
+            </w:r>
+          </w:p>
+        </w:tc>
+      </w:tr>
+      <w:tr>
+        <w:tc>
+          <w:tcPr>
+            <w:tcW w:type="dxa" w:w="2160"/>
+          </w:tcPr>
+          <w:p>
+            <w:pPr>
+              <w:bidi w:val="1"/>
+              <w:jc w:val="right"/>
+            </w:pPr>
+            <w:r>
+              <w:rPr>
+                <w:rFonts w:ascii="Arial" w:hAnsi="Arial"/>
+                <w:b w:val="0"/>
+                <w:sz w:val="20"/>
+                <w:rtl w:val="1"/>
+                <w:rFonts w:cs="Arial"/>
+              </w:rPr>
+              <w:t>10</w:t>
+            </w:r>
+          </w:p>
+        </w:tc>
+        <w:tc>
+          <w:tcPr>
+            <w:tcW w:type="dxa" w:w="2160"/>
+          </w:tcPr>
+          <w:p>
+            <w:pPr>
+              <w:bidi w:val="1"/>
+              <w:jc w:val="right"/>
+            </w:pPr>
+            <w:r>
+              <w:rPr>
+                <w:rFonts w:ascii="Arial" w:hAnsi="Arial"/>
+                <w:b/>
+                <w:sz w:val="20"/>
+                <w:rtl w:val="1"/>
+                <w:rFonts w:cs="Arial"/>
+              </w:rPr>
+              <w:t>חיבורי-אקסל</w:t>
+            </w:r>
+          </w:p>
+        </w:tc>
+        <w:tc>
+          <w:tcPr>
+            <w:tcW w:type="dxa" w:w="2160"/>
+          </w:tcPr>
+          <w:p>
+            <w:pPr>
+              <w:bidi w:val="1"/>
+              <w:jc w:val="right"/>
+            </w:pPr>
+            <w:r>
+              <w:rPr>
+                <w:rFonts w:ascii="Arial" w:hAnsi="Arial"/>
+                <w:b w:val="0"/>
+                <w:sz w:val="20"/>
+                <w:rtl w:val="1"/>
+                <w:rFonts w:cs="Arial"/>
+              </w:rPr>
+              <w:t>✅ עודכן</w:t>
+            </w:r>
+          </w:p>
+        </w:tc>
+        <w:tc>
+          <w:tcPr>
+            <w:tcW w:type="dxa" w:w="2160"/>
+          </w:tcPr>
+          <w:p>
+            <w:pPr>
+              <w:bidi w:val="1"/>
+              <w:jc w:val="right"/>
+            </w:pPr>
+            <w:r>
+              <w:rPr>
+                <w:rFonts w:ascii="Arial" w:hAnsi="Arial"/>
+                <w:b w:val="0"/>
+                <w:sz w:val="20"/>
+                <w:rtl w:val="1"/>
+                <w:rFonts w:cs="Arial"/>
+              </w:rPr>
+              <w:t xml:space="preserve">ראה </w:t>
+            </w:r>
+            <w:r>
+              <w:rPr>
+                <w:rFonts w:ascii="Consolas" w:hAnsi="Consolas"/>
+                <w:b w:val="0"/>
+                <w:color w:val="B02A37"/>
+                <w:sz w:val="20"/>
+                <w:rtl w:val="1"/>
+                <w:rFonts w:cs="Consolas"/>
+              </w:rPr>
+              <w:t>HELIX-external-connections.xlsx</w:t>
+            </w:r>
+            <w:r>
+              <w:rPr>
+                <w:rFonts w:ascii="Arial" w:hAnsi="Arial"/>
+                <w:b w:val="0"/>
+                <w:sz w:val="20"/>
+                <w:rtl w:val="1"/>
+                <w:rFonts w:cs="Arial"/>
+              </w:rPr>
+              <w:t xml:space="preserve"> → גיליון HELIX OPS (8 שורות חדשות: Meta Ads · HeyGen · D-ID · ElevenLabs · insights · export · Landing · crons)</w:t>
+            </w:r>
+          </w:p>
+        </w:tc>
+      </w:tr>
+    </w:tbl>
     <w:p>
       <w:pPr>
         <w:bidi w:val="1"/>

</xml_diff>

<commit_message>
docs(products): document WhatsApp bot linking across the 5 bot products
Add a "חיבור בוט וואטסאפ" section to each product spec (dashboards, sdr, seo/
rank, growth-doctor, marketing-ops) describing the inbound webhook + number→
account linking, the per-repo link table, files, and env/Meta setup.

Co-Authored-By: Claude Opus 4.8 (1M context) <noreply@anthropic.com>
</commit_message>
<xml_diff>
--- a/PRODUCTS/01-marketing-ops-hub.docx
+++ b/PRODUCTS/01-marketing-ops-hub.docx
@@ -16007,6 +16007,69 @@
       </w:r>
       <w:r>
         <w:t xml:space="preserve"> מהדייג'סט אפשר לאשר פעולה/לתשאל דרך מנוע השיח הקיים.</w:t>
+      </w:r>
+    </w:p>
+    <w:p>
+      <w:pPr>
+        <w:pStyle w:val="Heading2"/>
+        <w:jc w:val="right"/>
+        <w:bidi/>
+      </w:pPr>
+      <w:r>
+        <w:rPr>
+          <w:rtl w:val="1"/>
+        </w:rPr>
+        <w:t>🔗 חיבור בוט וואטסאפ — עדכון 04.08.2026</w:t>
+      </w:r>
+    </w:p>
+    <w:p>
+      <w:pPr>
+        <w:jc w:val="right"/>
+        <w:bidi/>
+      </w:pPr>
+      <w:r>
+        <w:rPr>
+          <w:rtl w:val="1"/>
+        </w:rPr>
+        <w:t>נוסף חיבור בוט וואטסאפ נכנס + קישור מספר-לחשבון (04.08.2026). המשתמש שולח הודעה לבוט הוואטסאפ, מדביק את מספרו במסך ההגדרות, והבוט מזהה אותו ומחזיר נתונים אמיתיים — בדיוק כמו טלגרם. מזהה השולח (from) מגיע כספרות בינלאומיות (למשל 972501234567); ה-action מנרמל את המספר לספרות בלבד.</w:t>
+      </w:r>
+    </w:p>
+    <w:p>
+      <w:pPr>
+        <w:pStyle w:val="ListBullet"/>
+        <w:jc w:val="right"/>
+        <w:bidi/>
+      </w:pPr>
+      <w:r>
+        <w:rPr>
+          <w:rtl w:val="1"/>
+        </w:rPr>
+        <w:t>הורחב ה-webhook הקיים app/api/webhooks/meta בענף שמור (field='messages' + messaging_product='whatsapp') שמנתב הודעות משתמש לבוט האופרטור — לוגיקת ה-FB/IG engagement לא נגעה. Action: linkWhatsApp ב-app/actions-ops.ts. UI: כרטיס בדף הערוצים.</w:t>
+      </w:r>
+    </w:p>
+    <w:p>
+      <w:pPr>
+        <w:pStyle w:val="ListBullet"/>
+        <w:jc w:val="right"/>
+        <w:bidi/>
+      </w:pPr>
+      <w:r>
+        <w:rPr>
+          <w:rtl w:val="1"/>
+        </w:rPr>
+        <w:t>טבלת קישור: bot_links(channel='whatsapp', identifier, workspace_id). משתמש ב-META_VERIFY_TOKEN הקיים (לא env חדש). נבנה בענף feat/performance-module.</w:t>
+      </w:r>
+    </w:p>
+    <w:p>
+      <w:pPr>
+        <w:jc w:val="right"/>
+        <w:bidi/>
+      </w:pPr>
+      <w:r>
+        <w:rPr>
+          <w:rtl w:val="1"/>
+        </w:rPr>
+        <w:t>להגדרה (env/Meta, לא קוד): להגדיר את ה-verify-token, לרשום את ה-webhook ב-Meta עם subscription ל-messages, ולוודא credentials של וואטסאפ. חובה מספר בפורמט בינלאומי מלא — 050… לא יתאים ל-wa_id.</w:t>
       </w:r>
     </w:p>
     <w:sectPr>

</xml_diff>

<commit_message>
docs(autonomy): Phase 4 triggers for OPS/SDR/Rank — specs + xlsx env rows
Co-Authored-By: Claude Opus 4.8 (1M context) <noreply@anthropic.com>
</commit_message>
<xml_diff>
--- a/PRODUCTS/01-marketing-ops-hub.docx
+++ b/PRODUCTS/01-marketing-ops-hub.docx
@@ -16088,6 +16088,24 @@
     <w:p>
       <w:r>
         <w:t>מתג אחיד ב-3 מצבים חוצה-מודולים (performance / engagement / lead-radar). רדאר לידים: המרה ל-engagement action עברה למתג — בסיס 'suggested' (HITL, ללא רגרסיה), ו'autopilot' מכניס 'approved' כך שה-cron מפרסם לבד — רק עם ops.radar_outreach risk_ack=true (ToS-sensitive, אחרת המערכת מורידה ל'מאשר'). מודול הפרפורמנס הקיים (execution_mode brain/connector × autonomy approve/autopilot) ממופה למצב הקנוני דרך fromOpsPerformance. תשתית: autonomy_settings (supabase/autonomy.sql), lib/autonomy/*.</w:t>
+      </w:r>
+    </w:p>
+    <w:p>
+      <w:r>
+        <w:t>---</w:t>
+      </w:r>
+    </w:p>
+    <w:p>
+      <w:pPr>
+        <w:pStyle w:val="Heading2"/>
+      </w:pPr>
+      <w:r>
+        <w:t>Phase 4 — טריגר חוצה-מוצר (2026-08-10)</w:t>
+      </w:r>
+    </w:p>
+    <w:p>
+      <w:r>
+        <w:t>נוסף POST /api/act/trigger (x-cross-act-secret) שמריץ את ה-performance tick (runWorkspace) — מאפשר ל-hub (Dashboards) להפעיל את OPS כשמדדי שיווק/מודעות מידרדרים. runWorkspace מפעיל את המתג של OPS (execution_mode/autonomy), כך שרק מתעד החלטות אלא אם ה-workspace ב-connector+autopilot.</w:t>
       </w:r>
     </w:p>
     <w:sectPr>

</xml_diff>

<commit_message>
docs(autonomy): sync switch UI across product pages + specs + xlsx
Adds the settings-screen mention to 5 product pages, a UI section to each product
docx, and a settings-page-route row to each xlsx product sheet — closing the doc
gap for the switch UI work.

Co-Authored-By: Claude Opus 4.8 (1M context) <noreply@anthropic.com>
</commit_message>
<xml_diff>
--- a/PRODUCTS/01-marketing-ops-hub.docx
+++ b/PRODUCTS/01-marketing-ops-hub.docx
@@ -16106,6 +16106,24 @@
     <w:p>
       <w:r>
         <w:t>נוסף POST /api/act/trigger (x-cross-act-secret) שמריץ את ה-performance tick (runWorkspace) — מאפשר ל-hub (Dashboards) להפעיל את OPS כשמדדי שיווק/מודעות מידרדרים. runWorkspace מפעיל את המתג של OPS (execution_mode/autonomy), כך שרק מתעד החלטות אלא אם ה-workspace ב-connector+autopilot.</w:t>
+      </w:r>
+    </w:p>
+    <w:p>
+      <w:r>
+        <w:t>---</w:t>
+      </w:r>
+    </w:p>
+    <w:p>
+      <w:pPr>
+        <w:pStyle w:val="Heading2"/>
+      </w:pPr>
+      <w:r>
+        <w:t>מסך מתג האוטונומיה — UI (2026-08-10)</w:t>
+      </w:r>
+    </w:p>
+    <w:p>
+      <w:r>
+        <w:t>route /[locale]/autonomy (5 פיצ'רים). פקד 3-מצבי (המלצה/אישור/אוטופיילוט) עם אפקט גלולה-מחליקה + פופ + זוהר באוטופיילוט; פעולות רגישות מציגות checkbox risk_ack שחובה לאוטופיילוט. רכיב נייד עם fallback לצבעים. מחובר ל-setAutonomy → autonomy_settings.</w:t>
       </w:r>
     </w:p>
     <w:sectPr>

</xml_diff>

<commit_message>
docs(cast): rename cast (עמנואל/דן/אלון/מאיה/ליה/נעמי) + append team section to 9 product .docx
- HELIX-AGENT-CAST.md: renamed per user (איתי→דן, דנה→ליה, נעם→עמנואל, טל→נעמי, רון→אלון);
  roster tables + framing updated; rollout TODO marked done.
- scripts/update-docx.py: non-destructive, idempotent python-docx updater that appends
  a "הצוות (Agent Cast)" section to each product's existing .docx.
- Ran it: 9 product specs (.docx) now carry the team roster.

Co-Authored-By: Claude Opus 4.8 (1M context) <noreply@anthropic.com>
</commit_message>
<xml_diff>
--- a/PRODUCTS/01-marketing-ops-hub.docx
+++ b/PRODUCTS/01-marketing-ops-hub.docx
@@ -16124,6 +16124,89 @@
     <w:p>
       <w:r>
         <w:t>route /[locale]/autonomy (5 פיצ'רים). פקד 3-מצבי (המלצה/אישור/אוטופיילוט) עם אפקט גלולה-מחליקה + פופ + זוהר באוטופיילוט; פעולות רגישות מציגות checkbox risk_ack שחובה לאוטופיילוט. רכיב נייד עם fallback לצבעים. מחובר ל-setAutonomy → autonomy_settings.</w:t>
+      </w:r>
+    </w:p>
+    <w:p>
+      <w:pPr>
+        <w:pStyle w:val="Heading1"/>
+      </w:pPr>
+      <w:r>
+        <w:t>הצוות (Agent Cast)</w:t>
+      </w:r>
+    </w:p>
+    <w:p>
+      <w:r>
+        <w:t>הצוות שעובד בשבילך — מחלקה של סוכנים, כל אחד עם תפקיד, עם מבקר שבודק את העבודה לפני שהיא יוצאת:</w:t>
+      </w:r>
+    </w:p>
+    <w:p>
+      <w:pPr>
+        <w:pStyle w:val="ListBullet"/>
+      </w:pPr>
+      <w:r>
+        <w:rPr>
+          <w:b/>
+        </w:rPr>
+        <w:t xml:space="preserve">עמנואל — חוקר ההקשר: </w:t>
+      </w:r>
+      <w:r>
+        <w:t>קורא את הפוסט ומסמן אם הוא רגיש.</w:t>
+      </w:r>
+    </w:p>
+    <w:p>
+      <w:pPr>
+        <w:pStyle w:val="ListBullet"/>
+      </w:pPr>
+      <w:r>
+        <w:rPr>
+          <w:b/>
+        </w:rPr>
+        <w:t xml:space="preserve">דן — כותב התגובה: </w:t>
+      </w:r>
+      <w:r>
+        <w:t>מנסח בקול המותג.</w:t>
+      </w:r>
+    </w:p>
+    <w:p>
+      <w:pPr>
+        <w:pStyle w:val="ListBullet"/>
+      </w:pPr>
+      <w:r>
+        <w:rPr>
+          <w:b/>
+        </w:rPr>
+        <w:t xml:space="preserve">אלון — מבקר brand-safety: </w:t>
+      </w:r>
+      <w:r>
+        <w:t>פוסל תגובה ספאמית, DM לא-הולם והזזת-תקציב מסוכנת.</w:t>
+      </w:r>
+    </w:p>
+    <w:p>
+      <w:pPr>
+        <w:pStyle w:val="ListBullet"/>
+      </w:pPr>
+      <w:r>
+        <w:rPr>
+          <w:b/>
+        </w:rPr>
+        <w:t xml:space="preserve">מאיה — העורכת: </w:t>
+      </w:r>
+      <w:r>
+        <w:t>משכתבת לפי אלון.</w:t>
+      </w:r>
+    </w:p>
+    <w:p>
+      <w:pPr>
+        <w:pStyle w:val="ListBullet"/>
+      </w:pPr>
+      <w:r>
+        <w:rPr>
+          <w:b/>
+        </w:rPr>
+        <w:t xml:space="preserve">CHIEF — המנהל: </w:t>
+      </w:r>
+      <w:r>
+        <w:t>מתאם בין הצוות.</w:t>
       </w:r>
     </w:p>
     <w:sectPr>

</xml_diff>